<commit_message>
added new code for filtering data set before regressions
</commit_message>
<xml_diff>
--- a/Final Paper.docx
+++ b/Final Paper.docx
@@ -1260,7 +1260,148 @@
       </w:r>
     </w:p>
     <w:p/>
-    <w:p/>
+    <w:p>
+      <w:pPr>
+        <w:pStyle w:val="Heading2"/>
+      </w:pPr>
+      <w:r>
+        <w:t>Removing Outliers</w:t>
+      </w:r>
+    </w:p>
+    <w:p>
+      <w:pPr>
+        <w:ind w:firstLine="720"/>
+      </w:pPr>
+      <w:r>
+        <w:t>I want to remove organizations that have multiple years of zero program expenses</w:t>
+      </w:r>
+      <w:r>
+        <w:t>.</w:t>
+      </w:r>
+      <w:r>
+        <w:t xml:space="preserve"> </w:t>
+      </w:r>
+      <w:r>
+        <w:t xml:space="preserve">As a prerequisite, I want to check the distribution of organizations without program expenses. </w:t>
+      </w:r>
+    </w:p>
+    <w:p>
+      <w:pPr>
+        <w:ind w:firstLine="720"/>
+      </w:pPr>
+      <w:r>
+        <w:t>According to 501(c)(3) status regulations, an organization that does not follow filing procedures for three consecutive years loses its tax-exempt status.</w:t>
+      </w:r>
+      <w:r>
+        <w:rPr>
+          <w:rStyle w:val="FootnoteReference"/>
+        </w:rPr>
+        <w:footnoteReference w:id="9"/>
+      </w:r>
+      <w:r>
+        <w:t xml:space="preserve"> Additionally, an organization that is not contributing a public benefit is at risk of losings its special status. So, three consecutive years of zero program expenses, assuming this shows zero public benefit, is a reasonable restriction to make. </w:t>
+      </w:r>
+    </w:p>
+    <w:p>
+      <w:pPr>
+        <w:ind w:firstLine="720"/>
+      </w:pPr>
+      <w:r>
+        <w:t xml:space="preserve">For succinctness, I </w:t>
+      </w:r>
+      <w:r>
+        <w:t>should</w:t>
+      </w:r>
+      <w:r>
+        <w:t xml:space="preserve"> also drop organizations with </w:t>
+      </w:r>
+      <w:r>
+        <w:t xml:space="preserve">three </w:t>
+      </w:r>
+      <w:r>
+        <w:t>or more years of zero revenues.</w:t>
+      </w:r>
+      <w:r>
+        <w:t xml:space="preserve"> So, I will drop from the data organizations that satisfy both conditions, because this </w:t>
+      </w:r>
+      <w:proofErr w:type="gramStart"/>
+      <w:r>
+        <w:t>indicates</w:t>
+      </w:r>
+      <w:proofErr w:type="gramEnd"/>
+      <w:r>
+        <w:t xml:space="preserve"> an inactive organization.</w:t>
+      </w:r>
+    </w:p>
+    <w:p>
+      <w:pPr>
+        <w:ind w:firstLine="720"/>
+      </w:pPr>
+      <w:r>
+        <w:t>Also, dropping hospitals and schools from the data set. Their demand is inelastic.</w:t>
+      </w:r>
+    </w:p>
+    <w:p>
+      <w:pPr>
+        <w:ind w:firstLine="720"/>
+      </w:pPr>
+      <w:r>
+        <w:t xml:space="preserve">This limits the data set to </w:t>
+      </w:r>
+      <w:r>
+        <w:t>3</w:t>
+      </w:r>
+      <w:r>
+        <w:t>,</w:t>
+      </w:r>
+      <w:r>
+        <w:t>014</w:t>
+      </w:r>
+      <w:r>
+        <w:t>,</w:t>
+      </w:r>
+      <w:r>
+        <w:t>314</w:t>
+      </w:r>
+      <w:r>
+        <w:t xml:space="preserve"> </w:t>
+      </w:r>
+      <w:r>
+        <w:t>observations (from 5,002,756</w:t>
+      </w:r>
+      <w:r>
+        <w:t xml:space="preserve">) </w:t>
+      </w:r>
+      <w:r>
+        <w:t xml:space="preserve">across </w:t>
+      </w:r>
+      <w:r>
+        <w:t>457</w:t>
+      </w:r>
+      <w:r>
+        <w:t>,</w:t>
+      </w:r>
+      <w:r>
+        <w:t>042</w:t>
+      </w:r>
+      <w:r>
+        <w:t xml:space="preserve"> </w:t>
+      </w:r>
+      <w:r>
+        <w:t xml:space="preserve">unique organizations (from </w:t>
+      </w:r>
+      <w:r>
+        <w:t>738,790).</w:t>
+      </w:r>
+      <w:r>
+        <w:t xml:space="preserve"> According to the log distribution, the data is now much more balanced.</w:t>
+      </w:r>
+    </w:p>
+    <w:p>
+      <w:pPr>
+        <w:ind w:firstLine="720"/>
+      </w:pPr>
+    </w:p>
     <w:sectPr>
       <w:pgSz w:w="12240" w:h="15840"/>
       <w:pgMar w:top="1440" w:right="1440" w:bottom="1440" w:left="1440" w:header="720" w:footer="720" w:gutter="0"/>
@@ -1498,6 +1639,52 @@
       <w:r>
         <w:t>. "The relationship between nonprofits’ revenue composition and their economic-financial efficiency." Nonprofit and Voluntary Sector Quarterly 46, no. 1 (2017): 141-155.</w:t>
       </w:r>
+    </w:p>
+  </w:footnote>
+  <w:footnote w:id="9">
+    <w:p>
+      <w:pPr>
+        <w:pStyle w:val="FootnoteText"/>
+      </w:pPr>
+      <w:r>
+        <w:rPr>
+          <w:rStyle w:val="FootnoteReference"/>
+        </w:rPr>
+        <w:footnoteRef/>
+      </w:r>
+      <w:r>
+        <w:t xml:space="preserve"> </w:t>
+      </w:r>
+      <w:r>
+        <w:t xml:space="preserve">Irs.gov. “Automatic Revocation of Exemption | Internal Revenue Service,” 2017. </w:t>
+      </w:r>
+      <w:hyperlink r:id="rId1" w:history="1">
+        <w:r>
+          <w:rPr>
+            <w:rStyle w:val="Hyperlink"/>
+          </w:rPr>
+          <w:t>https://www.irs.gov/charities-non-profits/automatic-revocation-of-exemption</w:t>
+        </w:r>
+      </w:hyperlink>
+      <w:r>
+        <w:t>.</w:t>
+      </w:r>
+      <w:r>
+        <w:t xml:space="preserve"> </w:t>
+      </w:r>
+    </w:p>
+    <w:p>
+      <w:pPr>
+        <w:pStyle w:val="FootnoteText"/>
+      </w:pPr>
+      <w:r>
+        <w:t>‌</w:t>
+      </w:r>
+    </w:p>
+    <w:p>
+      <w:pPr>
+        <w:pStyle w:val="FootnoteText"/>
+      </w:pPr>
     </w:p>
   </w:footnote>
 </w:footnotes>
@@ -1939,7 +2126,6 @@
     <w:next w:val="Normal"/>
     <w:link w:val="Heading2Char"/>
     <w:uiPriority w:val="9"/>
-    <w:semiHidden/>
     <w:unhideWhenUsed/>
     <w:qFormat/>
     <w:rsid w:val="00840E88"/>
@@ -2112,7 +2298,6 @@
   <w:style w:type="character" w:default="1" w:styleId="DefaultParagraphFont">
     <w:name w:val="Default Paragraph Font"/>
     <w:uiPriority w:val="1"/>
-    <w:semiHidden/>
     <w:unhideWhenUsed/>
   </w:style>
   <w:style w:type="table" w:default="1" w:styleId="TableNormal">
@@ -2154,7 +2339,6 @@
     <w:basedOn w:val="DefaultParagraphFont"/>
     <w:link w:val="Heading2"/>
     <w:uiPriority w:val="9"/>
-    <w:semiHidden/>
     <w:rsid w:val="00840E88"/>
     <w:rPr>
       <w:rFonts w:asciiTheme="majorHAnsi" w:eastAsiaTheme="majorEastAsia" w:hAnsiTheme="majorHAnsi" w:cstheme="majorBidi"/>
@@ -2514,6 +2698,95 @@
     <w:rPr>
       <w:vertAlign w:val="superscript"/>
     </w:rPr>
+  </w:style>
+  <w:style w:type="paragraph" w:styleId="NormalWeb">
+    <w:name w:val="Normal (Web)"/>
+    <w:basedOn w:val="Normal"/>
+    <w:uiPriority w:val="99"/>
+    <w:semiHidden/>
+    <w:unhideWhenUsed/>
+    <w:rsid w:val="00F27514"/>
+  </w:style>
+  <w:style w:type="character" w:styleId="Hyperlink">
+    <w:name w:val="Hyperlink"/>
+    <w:basedOn w:val="DefaultParagraphFont"/>
+    <w:uiPriority w:val="99"/>
+    <w:unhideWhenUsed/>
+    <w:rsid w:val="007D1F67"/>
+    <w:rPr>
+      <w:color w:val="467886" w:themeColor="hyperlink"/>
+      <w:u w:val="single"/>
+    </w:rPr>
+  </w:style>
+  <w:style w:type="character" w:styleId="UnresolvedMention">
+    <w:name w:val="Unresolved Mention"/>
+    <w:basedOn w:val="DefaultParagraphFont"/>
+    <w:uiPriority w:val="99"/>
+    <w:semiHidden/>
+    <w:unhideWhenUsed/>
+    <w:rsid w:val="007D1F67"/>
+    <w:rPr>
+      <w:color w:val="605E5C"/>
+      <w:shd w:val="clear" w:color="auto" w:fill="E1DFDD"/>
+    </w:rPr>
+  </w:style>
+  <w:style w:type="paragraph" w:styleId="HTMLPreformatted">
+    <w:name w:val="HTML Preformatted"/>
+    <w:basedOn w:val="Normal"/>
+    <w:link w:val="HTMLPreformattedChar"/>
+    <w:uiPriority w:val="99"/>
+    <w:semiHidden/>
+    <w:unhideWhenUsed/>
+    <w:rsid w:val="00B64FF4"/>
+    <w:pPr>
+      <w:tabs>
+        <w:tab w:val="left" w:pos="916"/>
+        <w:tab w:val="left" w:pos="1832"/>
+        <w:tab w:val="left" w:pos="2748"/>
+        <w:tab w:val="left" w:pos="3664"/>
+        <w:tab w:val="left" w:pos="4580"/>
+        <w:tab w:val="left" w:pos="5496"/>
+        <w:tab w:val="left" w:pos="6412"/>
+        <w:tab w:val="left" w:pos="7328"/>
+        <w:tab w:val="left" w:pos="8244"/>
+        <w:tab w:val="left" w:pos="9160"/>
+        <w:tab w:val="left" w:pos="10076"/>
+        <w:tab w:val="left" w:pos="10992"/>
+        <w:tab w:val="left" w:pos="11908"/>
+        <w:tab w:val="left" w:pos="12824"/>
+        <w:tab w:val="left" w:pos="13740"/>
+        <w:tab w:val="left" w:pos="14656"/>
+      </w:tabs>
+      <w:spacing w:line="240" w:lineRule="auto"/>
+    </w:pPr>
+    <w:rPr>
+      <w:rFonts w:ascii="Courier New" w:hAnsi="Courier New" w:cs="Courier New"/>
+      <w:color w:val="auto"/>
+      <w:kern w:val="0"/>
+      <w:sz w:val="20"/>
+      <w:szCs w:val="20"/>
+      <w14:ligatures w14:val="none"/>
+    </w:rPr>
+  </w:style>
+  <w:style w:type="character" w:customStyle="1" w:styleId="HTMLPreformattedChar">
+    <w:name w:val="HTML Preformatted Char"/>
+    <w:basedOn w:val="DefaultParagraphFont"/>
+    <w:link w:val="HTMLPreformatted"/>
+    <w:uiPriority w:val="99"/>
+    <w:semiHidden/>
+    <w:rsid w:val="00B64FF4"/>
+    <w:rPr>
+      <w:rFonts w:ascii="Courier New" w:eastAsia="Times New Roman" w:hAnsi="Courier New" w:cs="Courier New"/>
+      <w:kern w:val="0"/>
+      <w:sz w:val="20"/>
+      <w:szCs w:val="20"/>
+      <w14:ligatures w14:val="none"/>
+    </w:rPr>
+  </w:style>
+  <w:style w:type="character" w:customStyle="1" w:styleId="gnj4oy0cpi">
+    <w:name w:val="gnj4oy0cpi"/>
+    <w:basedOn w:val="DefaultParagraphFont"/>
+    <w:rsid w:val="00B64FF4"/>
   </w:style>
 </w:styles>
 </file>
@@ -2834,11 +3107,27 @@
 </file>
 
 <file path=customXml/item1.xml><?xml version="1.0" encoding="utf-8"?>
-<b:Sources xmlns:b="http://schemas.openxmlformats.org/officeDocument/2006/bibliography" xmlns="http://schemas.openxmlformats.org/officeDocument/2006/bibliography" SelectedStyle="/APASixthEditionOfficeOnline.xsl" StyleName="APA" Version="6"/>
+<b:Sources xmlns:b="http://schemas.openxmlformats.org/officeDocument/2006/bibliography" xmlns="http://schemas.openxmlformats.org/officeDocument/2006/bibliography" SelectedStyle="/CHICAGO.XSL" StyleName="Chicago" Version="16">
+  <b:Source>
+    <b:Tag>Int26</b:Tag>
+    <b:SourceType>InternetSite</b:SourceType>
+    <b:Guid>{F74348D9-E897-0B4E-85F1-DE25CBCF56AF}</b:Guid>
+    <b:Title>IRS</b:Title>
+    <b:InternetSiteTitle>IRS.gov</b:InternetSiteTitle>
+    <b:URL>https://www.irs.gov/charities-non-profits/automatic-revocation-of-exemption</b:URL>
+    <b:Year>2026</b:Year>
+    <b:Author>
+      <b:Author>
+        <b:Corporate>Internal Revenue Service</b:Corporate>
+      </b:Author>
+    </b:Author>
+    <b:RefOrder>1</b:RefOrder>
+  </b:Source>
+</b:Sources>
 </file>
 
 <file path=customXml/itemProps1.xml><?xml version="1.0" encoding="utf-8"?>
-<ds:datastoreItem xmlns:ds="http://schemas.openxmlformats.org/officeDocument/2006/customXml" ds:itemID="{92B53441-5E28-7F4C-B1FF-3522E154C466}">
+<ds:datastoreItem xmlns:ds="http://schemas.openxmlformats.org/officeDocument/2006/customXml" ds:itemID="{5DE27BF8-82AB-A943-905C-69B5AB86EA1D}">
   <ds:schemaRefs>
     <ds:schemaRef ds:uri="http://schemas.openxmlformats.org/officeDocument/2006/bibliography"/>
   </ds:schemaRefs>

</xml_diff>

<commit_message>
Refining regression model codes with standard data set
</commit_message>
<xml_diff>
--- a/Final Paper.docx
+++ b/Final Paper.docx
@@ -17,14 +17,631 @@
         <w:br w:type="page"/>
       </w:r>
     </w:p>
+    <w:sdt>
+      <w:sdtPr>
+        <w:id w:val="121733276"/>
+        <w:docPartObj>
+          <w:docPartGallery w:val="Table of Contents"/>
+          <w:docPartUnique/>
+        </w:docPartObj>
+      </w:sdtPr>
+      <w:sdtEndPr>
+        <w:rPr>
+          <w:rFonts w:ascii="Times New Roman" w:eastAsia="Times New Roman" w:hAnsi="Times New Roman" w:cs="Times New Roman"/>
+          <w:noProof/>
+          <w:color w:val="000000"/>
+          <w:kern w:val="2"/>
+          <w:sz w:val="24"/>
+          <w:szCs w:val="24"/>
+          <w14:ligatures w14:val="standardContextual"/>
+        </w:rPr>
+      </w:sdtEndPr>
+      <w:sdtContent>
+        <w:p>
+          <w:pPr>
+            <w:pStyle w:val="TOCHeading"/>
+          </w:pPr>
+          <w:r>
+            <w:t>Table of Contents</w:t>
+          </w:r>
+        </w:p>
+        <w:p>
+          <w:pPr>
+            <w:pStyle w:val="TOC1"/>
+            <w:tabs>
+              <w:tab w:val="right" w:leader="dot" w:pos="9350"/>
+            </w:tabs>
+            <w:rPr>
+              <w:noProof/>
+            </w:rPr>
+          </w:pPr>
+          <w:r>
+            <w:rPr>
+              <w:b w:val="0"/>
+              <w:bCs w:val="0"/>
+            </w:rPr>
+            <w:fldChar w:fldCharType="begin"/>
+          </w:r>
+          <w:r>
+            <w:instrText xml:space="preserve"> TOC \o "1-3" \h \z \u </w:instrText>
+          </w:r>
+          <w:r>
+            <w:rPr>
+              <w:b w:val="0"/>
+              <w:bCs w:val="0"/>
+            </w:rPr>
+            <w:fldChar w:fldCharType="separate"/>
+          </w:r>
+          <w:hyperlink w:anchor="_Toc221632639" w:history="1">
+            <w:r>
+              <w:rPr>
+                <w:rStyle w:val="Hyperlink"/>
+                <w:noProof/>
+              </w:rPr>
+              <w:t>Introduction</w:t>
+            </w:r>
+            <w:r>
+              <w:rPr>
+                <w:noProof/>
+                <w:webHidden/>
+              </w:rPr>
+              <w:tab/>
+            </w:r>
+            <w:r>
+              <w:rPr>
+                <w:noProof/>
+                <w:webHidden/>
+              </w:rPr>
+              <w:fldChar w:fldCharType="begin"/>
+            </w:r>
+            <w:r>
+              <w:rPr>
+                <w:noProof/>
+                <w:webHidden/>
+              </w:rPr>
+              <w:instrText xml:space="preserve"> PAGEREF _Toc221632639 \h </w:instrText>
+            </w:r>
+            <w:r>
+              <w:rPr>
+                <w:noProof/>
+                <w:webHidden/>
+              </w:rPr>
+            </w:r>
+            <w:r>
+              <w:rPr>
+                <w:noProof/>
+                <w:webHidden/>
+              </w:rPr>
+              <w:fldChar w:fldCharType="separate"/>
+            </w:r>
+            <w:r>
+              <w:rPr>
+                <w:noProof/>
+                <w:webHidden/>
+              </w:rPr>
+              <w:t>3</w:t>
+            </w:r>
+            <w:r>
+              <w:rPr>
+                <w:noProof/>
+                <w:webHidden/>
+              </w:rPr>
+              <w:fldChar w:fldCharType="end"/>
+            </w:r>
+          </w:hyperlink>
+        </w:p>
+        <w:p>
+          <w:pPr>
+            <w:pStyle w:val="TOC1"/>
+            <w:tabs>
+              <w:tab w:val="right" w:leader="dot" w:pos="9350"/>
+            </w:tabs>
+            <w:rPr>
+              <w:noProof/>
+            </w:rPr>
+          </w:pPr>
+          <w:hyperlink w:anchor="_Toc221632640" w:history="1">
+            <w:r>
+              <w:rPr>
+                <w:rStyle w:val="Hyperlink"/>
+                <w:noProof/>
+              </w:rPr>
+              <w:t>Literature Review</w:t>
+            </w:r>
+            <w:r>
+              <w:rPr>
+                <w:noProof/>
+                <w:webHidden/>
+              </w:rPr>
+              <w:tab/>
+            </w:r>
+            <w:r>
+              <w:rPr>
+                <w:noProof/>
+                <w:webHidden/>
+              </w:rPr>
+              <w:fldChar w:fldCharType="begin"/>
+            </w:r>
+            <w:r>
+              <w:rPr>
+                <w:noProof/>
+                <w:webHidden/>
+              </w:rPr>
+              <w:instrText xml:space="preserve"> PAGEREF _Toc221632640 \h </w:instrText>
+            </w:r>
+            <w:r>
+              <w:rPr>
+                <w:noProof/>
+                <w:webHidden/>
+              </w:rPr>
+            </w:r>
+            <w:r>
+              <w:rPr>
+                <w:noProof/>
+                <w:webHidden/>
+              </w:rPr>
+              <w:fldChar w:fldCharType="separate"/>
+            </w:r>
+            <w:r>
+              <w:rPr>
+                <w:noProof/>
+                <w:webHidden/>
+              </w:rPr>
+              <w:t>4</w:t>
+            </w:r>
+            <w:r>
+              <w:rPr>
+                <w:noProof/>
+                <w:webHidden/>
+              </w:rPr>
+              <w:fldChar w:fldCharType="end"/>
+            </w:r>
+          </w:hyperlink>
+        </w:p>
+        <w:p>
+          <w:pPr>
+            <w:pStyle w:val="TOC1"/>
+            <w:tabs>
+              <w:tab w:val="right" w:leader="dot" w:pos="9350"/>
+            </w:tabs>
+            <w:rPr>
+              <w:noProof/>
+            </w:rPr>
+          </w:pPr>
+          <w:hyperlink w:anchor="_Toc221632641" w:history="1">
+            <w:r>
+              <w:rPr>
+                <w:rStyle w:val="Hyperlink"/>
+                <w:noProof/>
+              </w:rPr>
+              <w:t>Data / Methodology</w:t>
+            </w:r>
+            <w:r>
+              <w:rPr>
+                <w:noProof/>
+                <w:webHidden/>
+              </w:rPr>
+              <w:tab/>
+            </w:r>
+            <w:r>
+              <w:rPr>
+                <w:noProof/>
+                <w:webHidden/>
+              </w:rPr>
+              <w:fldChar w:fldCharType="begin"/>
+            </w:r>
+            <w:r>
+              <w:rPr>
+                <w:noProof/>
+                <w:webHidden/>
+              </w:rPr>
+              <w:instrText xml:space="preserve"> PAGEREF _Toc221632641 \h </w:instrText>
+            </w:r>
+            <w:r>
+              <w:rPr>
+                <w:noProof/>
+                <w:webHidden/>
+              </w:rPr>
+            </w:r>
+            <w:r>
+              <w:rPr>
+                <w:noProof/>
+                <w:webHidden/>
+              </w:rPr>
+              <w:fldChar w:fldCharType="separate"/>
+            </w:r>
+            <w:r>
+              <w:rPr>
+                <w:noProof/>
+                <w:webHidden/>
+              </w:rPr>
+              <w:t>5</w:t>
+            </w:r>
+            <w:r>
+              <w:rPr>
+                <w:noProof/>
+                <w:webHidden/>
+              </w:rPr>
+              <w:fldChar w:fldCharType="end"/>
+            </w:r>
+          </w:hyperlink>
+        </w:p>
+        <w:p>
+          <w:pPr>
+            <w:pStyle w:val="TOC2"/>
+            <w:tabs>
+              <w:tab w:val="right" w:leader="dot" w:pos="9350"/>
+            </w:tabs>
+            <w:rPr>
+              <w:noProof/>
+            </w:rPr>
+          </w:pPr>
+          <w:hyperlink w:anchor="_Toc221632642" w:history="1">
+            <w:r>
+              <w:rPr>
+                <w:rStyle w:val="Hyperlink"/>
+                <w:noProof/>
+              </w:rPr>
+              <w:t>Removing Outliers</w:t>
+            </w:r>
+            <w:r>
+              <w:rPr>
+                <w:noProof/>
+                <w:webHidden/>
+              </w:rPr>
+              <w:tab/>
+            </w:r>
+            <w:r>
+              <w:rPr>
+                <w:noProof/>
+                <w:webHidden/>
+              </w:rPr>
+              <w:fldChar w:fldCharType="begin"/>
+            </w:r>
+            <w:r>
+              <w:rPr>
+                <w:noProof/>
+                <w:webHidden/>
+              </w:rPr>
+              <w:instrText xml:space="preserve"> PAGEREF _Toc221632642 \h </w:instrText>
+            </w:r>
+            <w:r>
+              <w:rPr>
+                <w:noProof/>
+                <w:webHidden/>
+              </w:rPr>
+            </w:r>
+            <w:r>
+              <w:rPr>
+                <w:noProof/>
+                <w:webHidden/>
+              </w:rPr>
+              <w:fldChar w:fldCharType="separate"/>
+            </w:r>
+            <w:r>
+              <w:rPr>
+                <w:noProof/>
+                <w:webHidden/>
+              </w:rPr>
+              <w:t>7</w:t>
+            </w:r>
+            <w:r>
+              <w:rPr>
+                <w:noProof/>
+                <w:webHidden/>
+              </w:rPr>
+              <w:fldChar w:fldCharType="end"/>
+            </w:r>
+          </w:hyperlink>
+        </w:p>
+        <w:p>
+          <w:pPr>
+            <w:pStyle w:val="TOC1"/>
+            <w:tabs>
+              <w:tab w:val="right" w:leader="dot" w:pos="9350"/>
+            </w:tabs>
+            <w:rPr>
+              <w:noProof/>
+            </w:rPr>
+          </w:pPr>
+          <w:hyperlink w:anchor="_Toc221632643" w:history="1">
+            <w:r>
+              <w:rPr>
+                <w:rStyle w:val="Hyperlink"/>
+                <w:noProof/>
+              </w:rPr>
+              <w:t>Results</w:t>
+            </w:r>
+            <w:r>
+              <w:rPr>
+                <w:noProof/>
+                <w:webHidden/>
+              </w:rPr>
+              <w:tab/>
+            </w:r>
+            <w:r>
+              <w:rPr>
+                <w:noProof/>
+                <w:webHidden/>
+              </w:rPr>
+              <w:fldChar w:fldCharType="begin"/>
+            </w:r>
+            <w:r>
+              <w:rPr>
+                <w:noProof/>
+                <w:webHidden/>
+              </w:rPr>
+              <w:instrText xml:space="preserve"> PAGEREF _Toc221632643 \h </w:instrText>
+            </w:r>
+            <w:r>
+              <w:rPr>
+                <w:noProof/>
+                <w:webHidden/>
+              </w:rPr>
+            </w:r>
+            <w:r>
+              <w:rPr>
+                <w:noProof/>
+                <w:webHidden/>
+              </w:rPr>
+              <w:fldChar w:fldCharType="separate"/>
+            </w:r>
+            <w:r>
+              <w:rPr>
+                <w:noProof/>
+                <w:webHidden/>
+              </w:rPr>
+              <w:t>8</w:t>
+            </w:r>
+            <w:r>
+              <w:rPr>
+                <w:noProof/>
+                <w:webHidden/>
+              </w:rPr>
+              <w:fldChar w:fldCharType="end"/>
+            </w:r>
+          </w:hyperlink>
+        </w:p>
+        <w:p>
+          <w:pPr>
+            <w:pStyle w:val="TOC1"/>
+            <w:tabs>
+              <w:tab w:val="right" w:leader="dot" w:pos="9350"/>
+            </w:tabs>
+            <w:rPr>
+              <w:noProof/>
+            </w:rPr>
+          </w:pPr>
+          <w:hyperlink w:anchor="_Toc221632644" w:history="1">
+            <w:r>
+              <w:rPr>
+                <w:rStyle w:val="Hyperlink"/>
+                <w:noProof/>
+              </w:rPr>
+              <w:t>Analysis</w:t>
+            </w:r>
+            <w:r>
+              <w:rPr>
+                <w:noProof/>
+                <w:webHidden/>
+              </w:rPr>
+              <w:tab/>
+            </w:r>
+            <w:r>
+              <w:rPr>
+                <w:noProof/>
+                <w:webHidden/>
+              </w:rPr>
+              <w:fldChar w:fldCharType="begin"/>
+            </w:r>
+            <w:r>
+              <w:rPr>
+                <w:noProof/>
+                <w:webHidden/>
+              </w:rPr>
+              <w:instrText xml:space="preserve"> PAGEREF _Toc221632644 \h </w:instrText>
+            </w:r>
+            <w:r>
+              <w:rPr>
+                <w:noProof/>
+                <w:webHidden/>
+              </w:rPr>
+            </w:r>
+            <w:r>
+              <w:rPr>
+                <w:noProof/>
+                <w:webHidden/>
+              </w:rPr>
+              <w:fldChar w:fldCharType="separate"/>
+            </w:r>
+            <w:r>
+              <w:rPr>
+                <w:noProof/>
+                <w:webHidden/>
+              </w:rPr>
+              <w:t>9</w:t>
+            </w:r>
+            <w:r>
+              <w:rPr>
+                <w:noProof/>
+                <w:webHidden/>
+              </w:rPr>
+              <w:fldChar w:fldCharType="end"/>
+            </w:r>
+          </w:hyperlink>
+        </w:p>
+        <w:p>
+          <w:pPr>
+            <w:pStyle w:val="TOC1"/>
+            <w:tabs>
+              <w:tab w:val="right" w:leader="dot" w:pos="9350"/>
+            </w:tabs>
+            <w:rPr>
+              <w:noProof/>
+            </w:rPr>
+          </w:pPr>
+          <w:hyperlink w:anchor="_Toc221632645" w:history="1">
+            <w:r>
+              <w:rPr>
+                <w:rStyle w:val="Hyperlink"/>
+                <w:noProof/>
+              </w:rPr>
+              <w:t>Conclusion</w:t>
+            </w:r>
+            <w:r>
+              <w:rPr>
+                <w:noProof/>
+                <w:webHidden/>
+              </w:rPr>
+              <w:tab/>
+            </w:r>
+            <w:r>
+              <w:rPr>
+                <w:noProof/>
+                <w:webHidden/>
+              </w:rPr>
+              <w:fldChar w:fldCharType="begin"/>
+            </w:r>
+            <w:r>
+              <w:rPr>
+                <w:noProof/>
+                <w:webHidden/>
+              </w:rPr>
+              <w:instrText xml:space="preserve"> PAGEREF _Toc221632645 \h </w:instrText>
+            </w:r>
+            <w:r>
+              <w:rPr>
+                <w:noProof/>
+                <w:webHidden/>
+              </w:rPr>
+            </w:r>
+            <w:r>
+              <w:rPr>
+                <w:noProof/>
+                <w:webHidden/>
+              </w:rPr>
+              <w:fldChar w:fldCharType="separate"/>
+            </w:r>
+            <w:r>
+              <w:rPr>
+                <w:noProof/>
+                <w:webHidden/>
+              </w:rPr>
+              <w:t>10</w:t>
+            </w:r>
+            <w:r>
+              <w:rPr>
+                <w:noProof/>
+                <w:webHidden/>
+              </w:rPr>
+              <w:fldChar w:fldCharType="end"/>
+            </w:r>
+          </w:hyperlink>
+        </w:p>
+        <w:p>
+          <w:pPr>
+            <w:pStyle w:val="TOC1"/>
+            <w:tabs>
+              <w:tab w:val="right" w:leader="dot" w:pos="9350"/>
+            </w:tabs>
+            <w:rPr>
+              <w:noProof/>
+            </w:rPr>
+          </w:pPr>
+          <w:hyperlink w:anchor="_Toc221632646" w:history="1">
+            <w:r>
+              <w:rPr>
+                <w:rStyle w:val="Hyperlink"/>
+                <w:noProof/>
+              </w:rPr>
+              <w:t>Bibliography</w:t>
+            </w:r>
+            <w:r>
+              <w:rPr>
+                <w:noProof/>
+                <w:webHidden/>
+              </w:rPr>
+              <w:tab/>
+            </w:r>
+            <w:r>
+              <w:rPr>
+                <w:noProof/>
+                <w:webHidden/>
+              </w:rPr>
+              <w:fldChar w:fldCharType="begin"/>
+            </w:r>
+            <w:r>
+              <w:rPr>
+                <w:noProof/>
+                <w:webHidden/>
+              </w:rPr>
+              <w:instrText xml:space="preserve"> PAGEREF _Toc221632646 \h </w:instrText>
+            </w:r>
+            <w:r>
+              <w:rPr>
+                <w:noProof/>
+                <w:webHidden/>
+              </w:rPr>
+            </w:r>
+            <w:r>
+              <w:rPr>
+                <w:noProof/>
+                <w:webHidden/>
+              </w:rPr>
+              <w:fldChar w:fldCharType="separate"/>
+            </w:r>
+            <w:r>
+              <w:rPr>
+                <w:noProof/>
+                <w:webHidden/>
+              </w:rPr>
+              <w:t>11</w:t>
+            </w:r>
+            <w:r>
+              <w:rPr>
+                <w:noProof/>
+                <w:webHidden/>
+              </w:rPr>
+              <w:fldChar w:fldCharType="end"/>
+            </w:r>
+          </w:hyperlink>
+        </w:p>
+        <w:p>
+          <w:r>
+            <w:rPr>
+              <w:b/>
+              <w:bCs/>
+              <w:noProof/>
+            </w:rPr>
+            <w:fldChar w:fldCharType="end"/>
+          </w:r>
+        </w:p>
+      </w:sdtContent>
+    </w:sdt>
+    <w:p>
+      <w:pPr>
+        <w:spacing w:after="160" w:line="278" w:lineRule="auto"/>
+        <w:rPr>
+          <w:rFonts w:asciiTheme="majorHAnsi" w:eastAsiaTheme="majorEastAsia" w:hAnsiTheme="majorHAnsi" w:cstheme="majorBidi"/>
+          <w:color w:val="0F4761" w:themeColor="accent1" w:themeShade="BF"/>
+          <w:sz w:val="40"/>
+          <w:szCs w:val="40"/>
+        </w:rPr>
+      </w:pPr>
+      <w:r>
+        <w:br w:type="page"/>
+      </w:r>
+    </w:p>
     <w:p>
       <w:pPr>
         <w:pStyle w:val="Heading1"/>
       </w:pPr>
+      <w:bookmarkStart w:id="0" w:name="_Toc221632639"/>
       <w:r>
         <w:lastRenderedPageBreak/>
         <w:t>Introduction</w:t>
       </w:r>
+      <w:bookmarkEnd w:id="0"/>
       <w:r>
         <w:br w:type="page"/>
       </w:r>
@@ -33,10 +650,26 @@
       <w:pPr>
         <w:pStyle w:val="Heading1"/>
       </w:pPr>
+      <w:bookmarkStart w:id="1" w:name="_Toc221632640"/>
+      <w:r>
+        <w:lastRenderedPageBreak/>
+        <w:t>Literature Review</w:t>
+      </w:r>
+      <w:bookmarkEnd w:id="1"/>
+      <w:r>
+        <w:br w:type="page"/>
+      </w:r>
+    </w:p>
+    <w:p>
+      <w:pPr>
+        <w:pStyle w:val="Heading1"/>
+      </w:pPr>
+      <w:bookmarkStart w:id="2" w:name="_Toc221632641"/>
       <w:r>
         <w:lastRenderedPageBreak/>
         <w:t>Data / Methodology</w:t>
       </w:r>
+      <w:bookmarkEnd w:id="2"/>
     </w:p>
     <w:p>
       <w:pPr>
@@ -1264,9 +1897,11 @@
       <w:pPr>
         <w:pStyle w:val="Heading2"/>
       </w:pPr>
+      <w:bookmarkStart w:id="3" w:name="_Toc221632642"/>
       <w:r>
         <w:t>Removing Outliers</w:t>
       </w:r>
+      <w:bookmarkEnd w:id="3"/>
     </w:p>
     <w:p>
       <w:pPr>
@@ -1399,10 +2034,93 @@
     </w:p>
     <w:p>
       <w:pPr>
+        <w:spacing w:after="160" w:line="278" w:lineRule="auto"/>
+      </w:pPr>
+      <w:r>
+        <w:br w:type="page"/>
+      </w:r>
+    </w:p>
+    <w:p>
+      <w:pPr>
+        <w:pStyle w:val="Heading1"/>
+      </w:pPr>
+      <w:bookmarkStart w:id="4" w:name="_Toc221632643"/>
+      <w:r>
+        <w:lastRenderedPageBreak/>
+        <w:t>Results</w:t>
+      </w:r>
+      <w:bookmarkEnd w:id="4"/>
+    </w:p>
+    <w:p>
+      <w:pPr>
+        <w:spacing w:after="160" w:line="278" w:lineRule="auto"/>
+      </w:pPr>
+      <w:r>
+        <w:br w:type="page"/>
+      </w:r>
+    </w:p>
+    <w:p>
+      <w:pPr>
+        <w:pStyle w:val="Heading1"/>
+      </w:pPr>
+      <w:bookmarkStart w:id="5" w:name="_Toc221632644"/>
+      <w:r>
+        <w:lastRenderedPageBreak/>
+        <w:t>Analysis</w:t>
+      </w:r>
+      <w:bookmarkEnd w:id="5"/>
+    </w:p>
+    <w:p>
+      <w:pPr>
+        <w:spacing w:after="160" w:line="278" w:lineRule="auto"/>
+      </w:pPr>
+      <w:r>
+        <w:br w:type="page"/>
+      </w:r>
+    </w:p>
+    <w:p>
+      <w:pPr>
+        <w:pStyle w:val="Heading1"/>
+      </w:pPr>
+      <w:bookmarkStart w:id="6" w:name="_Toc221632645"/>
+      <w:r>
+        <w:lastRenderedPageBreak/>
+        <w:t>Conclusion</w:t>
+      </w:r>
+      <w:bookmarkEnd w:id="6"/>
+    </w:p>
+    <w:p>
+      <w:pPr>
+        <w:spacing w:after="160" w:line="278" w:lineRule="auto"/>
+      </w:pPr>
+      <w:r>
+        <w:br w:type="page"/>
+      </w:r>
+    </w:p>
+    <w:p>
+      <w:pPr>
+        <w:pStyle w:val="Heading1"/>
+      </w:pPr>
+      <w:bookmarkStart w:id="7" w:name="_Toc221632646"/>
+      <w:r>
+        <w:lastRenderedPageBreak/>
+        <w:t>Bibliography</w:t>
+      </w:r>
+      <w:bookmarkEnd w:id="7"/>
+    </w:p>
+    <w:p/>
+    <w:p>
+      <w:pPr>
         <w:ind w:firstLine="720"/>
       </w:pPr>
     </w:p>
     <w:sectPr>
+      <w:headerReference w:type="even" r:id="rId7"/>
+      <w:headerReference w:type="default" r:id="rId8"/>
+      <w:footerReference w:type="even" r:id="rId9"/>
+      <w:footerReference w:type="default" r:id="rId10"/>
+      <w:headerReference w:type="first" r:id="rId11"/>
+      <w:footerReference w:type="first" r:id="rId12"/>
       <w:pgSz w:w="12240" w:h="15840"/>
       <w:pgMar w:top="1440" w:right="1440" w:bottom="1440" w:left="1440" w:header="720" w:footer="720" w:gutter="0"/>
       <w:cols w:space="720"/>
@@ -1431,6 +2149,36 @@
 </w:endnotes>
 </file>
 
+<file path=word/footer1.xml><?xml version="1.0" encoding="utf-8"?>
+<w:ftr xmlns:wpc="http://schemas.microsoft.com/office/word/2010/wordprocessingCanvas" xmlns:cx="http://schemas.microsoft.com/office/drawing/2014/chartex" xmlns:cx1="http://schemas.microsoft.com/office/drawing/2015/9/8/chartex" xmlns:cx2="http://schemas.microsoft.com/office/drawing/2015/10/21/chartex" xmlns:cx3="http://schemas.microsoft.com/office/drawing/2016/5/9/chartex" xmlns:cx4="http://schemas.microsoft.com/office/drawing/2016/5/10/chartex" xmlns:cx5="http://schemas.microsoft.com/office/drawing/2016/5/11/chartex" xmlns:cx6="http://schemas.microsoft.com/office/drawing/2016/5/12/chartex" xmlns:cx7="http://schemas.microsoft.com/office/drawing/2016/5/13/chartex" xmlns:cx8="http://schemas.microsoft.com/office/drawing/2016/5/14/chartex" xmlns:mc="http://schemas.openxmlformats.org/markup-compatibility/2006" xmlns:aink="http://schemas.microsoft.com/office/drawing/2016/ink" xmlns:am3d="http://schemas.microsoft.com/office/drawing/2017/model3d" xmlns:o="urn:schemas-microsoft-com:office:office" xmlns:oel="http://schemas.microsoft.com/office/2019/extlst" xmlns:r="http://schemas.openxmlformats.org/officeDocument/2006/relationships" xmlns:m="http://schemas.openxmlformats.org/officeDocument/2006/math" xmlns:v="urn:schemas-microsoft-com:vml" xmlns:wp14="http://schemas.microsoft.com/office/word/2010/wordprocessingDrawing" xmlns:wp="http://schemas.openxmlformats.org/drawingml/2006/wordprocessingDrawing" xmlns:w10="urn:schemas-microsoft-com:office:word" xmlns:w="http://schemas.openxmlformats.org/wordprocessingml/2006/main" xmlns:w14="http://schemas.microsoft.com/office/word/2010/wordml" xmlns:w15="http://schemas.microsoft.com/office/word/2012/wordml" xmlns:w16cex="http://schemas.microsoft.com/office/word/2018/wordml/cex" xmlns:w16cid="http://schemas.microsoft.com/office/word/2016/wordml/cid" xmlns:w16="http://schemas.microsoft.com/office/word/2018/wordml" xmlns:w16du="http://schemas.microsoft.com/office/word/2023/wordml/word16du" xmlns:w16sdtdh="http://schemas.microsoft.com/office/word/2020/wordml/sdtdatahash" xmlns:w16sdtfl="http://schemas.microsoft.com/office/word/2024/wordml/sdtformatlock" xmlns:w16se="http://schemas.microsoft.com/office/word/2015/wordml/symex" xmlns:wpg="http://schemas.microsoft.com/office/word/2010/wordprocessingGroup" xmlns:wpi="http://schemas.microsoft.com/office/word/2010/wordprocessingInk" xmlns:wne="http://schemas.microsoft.com/office/word/2006/wordml" xmlns:wps="http://schemas.microsoft.com/office/word/2010/wordprocessingShape" mc:Ignorable="w14 w15 w16se w16cid w16 w16cex w16sdtdh w16sdtfl w16du wp14">
+  <w:p>
+    <w:pPr>
+      <w:pStyle w:val="Footer"/>
+    </w:pPr>
+  </w:p>
+</w:ftr>
+</file>
+
+<file path=word/footer2.xml><?xml version="1.0" encoding="utf-8"?>
+<w:ftr xmlns:wpc="http://schemas.microsoft.com/office/word/2010/wordprocessingCanvas" xmlns:cx="http://schemas.microsoft.com/office/drawing/2014/chartex" xmlns:cx1="http://schemas.microsoft.com/office/drawing/2015/9/8/chartex" xmlns:cx2="http://schemas.microsoft.com/office/drawing/2015/10/21/chartex" xmlns:cx3="http://schemas.microsoft.com/office/drawing/2016/5/9/chartex" xmlns:cx4="http://schemas.microsoft.com/office/drawing/2016/5/10/chartex" xmlns:cx5="http://schemas.microsoft.com/office/drawing/2016/5/11/chartex" xmlns:cx6="http://schemas.microsoft.com/office/drawing/2016/5/12/chartex" xmlns:cx7="http://schemas.microsoft.com/office/drawing/2016/5/13/chartex" xmlns:cx8="http://schemas.microsoft.com/office/drawing/2016/5/14/chartex" xmlns:mc="http://schemas.openxmlformats.org/markup-compatibility/2006" xmlns:aink="http://schemas.microsoft.com/office/drawing/2016/ink" xmlns:am3d="http://schemas.microsoft.com/office/drawing/2017/model3d" xmlns:o="urn:schemas-microsoft-com:office:office" xmlns:oel="http://schemas.microsoft.com/office/2019/extlst" xmlns:r="http://schemas.openxmlformats.org/officeDocument/2006/relationships" xmlns:m="http://schemas.openxmlformats.org/officeDocument/2006/math" xmlns:v="urn:schemas-microsoft-com:vml" xmlns:wp14="http://schemas.microsoft.com/office/word/2010/wordprocessingDrawing" xmlns:wp="http://schemas.openxmlformats.org/drawingml/2006/wordprocessingDrawing" xmlns:w10="urn:schemas-microsoft-com:office:word" xmlns:w="http://schemas.openxmlformats.org/wordprocessingml/2006/main" xmlns:w14="http://schemas.microsoft.com/office/word/2010/wordml" xmlns:w15="http://schemas.microsoft.com/office/word/2012/wordml" xmlns:w16cex="http://schemas.microsoft.com/office/word/2018/wordml/cex" xmlns:w16cid="http://schemas.microsoft.com/office/word/2016/wordml/cid" xmlns:w16="http://schemas.microsoft.com/office/word/2018/wordml" xmlns:w16du="http://schemas.microsoft.com/office/word/2023/wordml/word16du" xmlns:w16sdtdh="http://schemas.microsoft.com/office/word/2020/wordml/sdtdatahash" xmlns:w16sdtfl="http://schemas.microsoft.com/office/word/2024/wordml/sdtformatlock" xmlns:w16se="http://schemas.microsoft.com/office/word/2015/wordml/symex" xmlns:wpg="http://schemas.microsoft.com/office/word/2010/wordprocessingGroup" xmlns:wpi="http://schemas.microsoft.com/office/word/2010/wordprocessingInk" xmlns:wne="http://schemas.microsoft.com/office/word/2006/wordml" xmlns:wps="http://schemas.microsoft.com/office/word/2010/wordprocessingShape" mc:Ignorable="w14 w15 w16se w16cid w16 w16cex w16sdtdh w16sdtfl w16du wp14">
+  <w:p>
+    <w:pPr>
+      <w:pStyle w:val="Footer"/>
+    </w:pPr>
+  </w:p>
+</w:ftr>
+</file>
+
+<file path=word/footer3.xml><?xml version="1.0" encoding="utf-8"?>
+<w:ftr xmlns:wpc="http://schemas.microsoft.com/office/word/2010/wordprocessingCanvas" xmlns:cx="http://schemas.microsoft.com/office/drawing/2014/chartex" xmlns:cx1="http://schemas.microsoft.com/office/drawing/2015/9/8/chartex" xmlns:cx2="http://schemas.microsoft.com/office/drawing/2015/10/21/chartex" xmlns:cx3="http://schemas.microsoft.com/office/drawing/2016/5/9/chartex" xmlns:cx4="http://schemas.microsoft.com/office/drawing/2016/5/10/chartex" xmlns:cx5="http://schemas.microsoft.com/office/drawing/2016/5/11/chartex" xmlns:cx6="http://schemas.microsoft.com/office/drawing/2016/5/12/chartex" xmlns:cx7="http://schemas.microsoft.com/office/drawing/2016/5/13/chartex" xmlns:cx8="http://schemas.microsoft.com/office/drawing/2016/5/14/chartex" xmlns:mc="http://schemas.openxmlformats.org/markup-compatibility/2006" xmlns:aink="http://schemas.microsoft.com/office/drawing/2016/ink" xmlns:am3d="http://schemas.microsoft.com/office/drawing/2017/model3d" xmlns:o="urn:schemas-microsoft-com:office:office" xmlns:oel="http://schemas.microsoft.com/office/2019/extlst" xmlns:r="http://schemas.openxmlformats.org/officeDocument/2006/relationships" xmlns:m="http://schemas.openxmlformats.org/officeDocument/2006/math" xmlns:v="urn:schemas-microsoft-com:vml" xmlns:wp14="http://schemas.microsoft.com/office/word/2010/wordprocessingDrawing" xmlns:wp="http://schemas.openxmlformats.org/drawingml/2006/wordprocessingDrawing" xmlns:w10="urn:schemas-microsoft-com:office:word" xmlns:w="http://schemas.openxmlformats.org/wordprocessingml/2006/main" xmlns:w14="http://schemas.microsoft.com/office/word/2010/wordml" xmlns:w15="http://schemas.microsoft.com/office/word/2012/wordml" xmlns:w16cex="http://schemas.microsoft.com/office/word/2018/wordml/cex" xmlns:w16cid="http://schemas.microsoft.com/office/word/2016/wordml/cid" xmlns:w16="http://schemas.microsoft.com/office/word/2018/wordml" xmlns:w16du="http://schemas.microsoft.com/office/word/2023/wordml/word16du" xmlns:w16sdtdh="http://schemas.microsoft.com/office/word/2020/wordml/sdtdatahash" xmlns:w16sdtfl="http://schemas.microsoft.com/office/word/2024/wordml/sdtformatlock" xmlns:w16se="http://schemas.microsoft.com/office/word/2015/wordml/symex" xmlns:wpg="http://schemas.microsoft.com/office/word/2010/wordprocessingGroup" xmlns:wpi="http://schemas.microsoft.com/office/word/2010/wordprocessingInk" xmlns:wne="http://schemas.microsoft.com/office/word/2006/wordml" xmlns:wps="http://schemas.microsoft.com/office/word/2010/wordprocessingShape" mc:Ignorable="w14 w15 w16se w16cid w16 w16cex w16sdtdh w16sdtfl w16du wp14">
+  <w:p>
+    <w:pPr>
+      <w:pStyle w:val="Footer"/>
+    </w:pPr>
+  </w:p>
+</w:ftr>
+</file>
+
 <file path=word/footnotes.xml><?xml version="1.0" encoding="utf-8"?>
 <w:footnotes xmlns:wpc="http://schemas.microsoft.com/office/word/2010/wordprocessingCanvas" xmlns:cx="http://schemas.microsoft.com/office/drawing/2014/chartex" xmlns:cx1="http://schemas.microsoft.com/office/drawing/2015/9/8/chartex" xmlns:cx2="http://schemas.microsoft.com/office/drawing/2015/10/21/chartex" xmlns:cx3="http://schemas.microsoft.com/office/drawing/2016/5/9/chartex" xmlns:cx4="http://schemas.microsoft.com/office/drawing/2016/5/10/chartex" xmlns:cx5="http://schemas.microsoft.com/office/drawing/2016/5/11/chartex" xmlns:cx6="http://schemas.microsoft.com/office/drawing/2016/5/12/chartex" xmlns:cx7="http://schemas.microsoft.com/office/drawing/2016/5/13/chartex" xmlns:cx8="http://schemas.microsoft.com/office/drawing/2016/5/14/chartex" xmlns:mc="http://schemas.openxmlformats.org/markup-compatibility/2006" xmlns:aink="http://schemas.microsoft.com/office/drawing/2016/ink" xmlns:am3d="http://schemas.microsoft.com/office/drawing/2017/model3d" xmlns:o="urn:schemas-microsoft-com:office:office" xmlns:oel="http://schemas.microsoft.com/office/2019/extlst" xmlns:r="http://schemas.openxmlformats.org/officeDocument/2006/relationships" xmlns:m="http://schemas.openxmlformats.org/officeDocument/2006/math" xmlns:v="urn:schemas-microsoft-com:vml" xmlns:wp14="http://schemas.microsoft.com/office/word/2010/wordprocessingDrawing" xmlns:wp="http://schemas.openxmlformats.org/drawingml/2006/wordprocessingDrawing" xmlns:w10="urn:schemas-microsoft-com:office:word" xmlns:w="http://schemas.openxmlformats.org/wordprocessingml/2006/main" xmlns:w14="http://schemas.microsoft.com/office/word/2010/wordml" xmlns:w15="http://schemas.microsoft.com/office/word/2012/wordml" xmlns:w16cex="http://schemas.microsoft.com/office/word/2018/wordml/cex" xmlns:w16cid="http://schemas.microsoft.com/office/word/2016/wordml/cid" xmlns:w16="http://schemas.microsoft.com/office/word/2018/wordml" xmlns:w16du="http://schemas.microsoft.com/office/word/2023/wordml/word16du" xmlns:w16sdtdh="http://schemas.microsoft.com/office/word/2020/wordml/sdtdatahash" xmlns:w16sdtfl="http://schemas.microsoft.com/office/word/2024/wordml/sdtformatlock" xmlns:w16se="http://schemas.microsoft.com/office/word/2015/wordml/symex" xmlns:wpg="http://schemas.microsoft.com/office/word/2010/wordprocessingGroup" xmlns:wpi="http://schemas.microsoft.com/office/word/2010/wordprocessingInk" xmlns:wne="http://schemas.microsoft.com/office/word/2006/wordml" xmlns:wps="http://schemas.microsoft.com/office/word/2010/wordprocessingShape" mc:Ignorable="w14 w15 w16se w16cid w16 w16cex w16sdtdh w16sdtfl w16du wp14">
   <w:footnote w:type="separator" w:id="-1">
@@ -1688,6 +2436,36 @@
     </w:p>
   </w:footnote>
 </w:footnotes>
+</file>
+
+<file path=word/header1.xml><?xml version="1.0" encoding="utf-8"?>
+<w:hdr xmlns:wpc="http://schemas.microsoft.com/office/word/2010/wordprocessingCanvas" xmlns:cx="http://schemas.microsoft.com/office/drawing/2014/chartex" xmlns:cx1="http://schemas.microsoft.com/office/drawing/2015/9/8/chartex" xmlns:cx2="http://schemas.microsoft.com/office/drawing/2015/10/21/chartex" xmlns:cx3="http://schemas.microsoft.com/office/drawing/2016/5/9/chartex" xmlns:cx4="http://schemas.microsoft.com/office/drawing/2016/5/10/chartex" xmlns:cx5="http://schemas.microsoft.com/office/drawing/2016/5/11/chartex" xmlns:cx6="http://schemas.microsoft.com/office/drawing/2016/5/12/chartex" xmlns:cx7="http://schemas.microsoft.com/office/drawing/2016/5/13/chartex" xmlns:cx8="http://schemas.microsoft.com/office/drawing/2016/5/14/chartex" xmlns:mc="http://schemas.openxmlformats.org/markup-compatibility/2006" xmlns:aink="http://schemas.microsoft.com/office/drawing/2016/ink" xmlns:am3d="http://schemas.microsoft.com/office/drawing/2017/model3d" xmlns:o="urn:schemas-microsoft-com:office:office" xmlns:oel="http://schemas.microsoft.com/office/2019/extlst" xmlns:r="http://schemas.openxmlformats.org/officeDocument/2006/relationships" xmlns:m="http://schemas.openxmlformats.org/officeDocument/2006/math" xmlns:v="urn:schemas-microsoft-com:vml" xmlns:wp14="http://schemas.microsoft.com/office/word/2010/wordprocessingDrawing" xmlns:wp="http://schemas.openxmlformats.org/drawingml/2006/wordprocessingDrawing" xmlns:w10="urn:schemas-microsoft-com:office:word" xmlns:w="http://schemas.openxmlformats.org/wordprocessingml/2006/main" xmlns:w14="http://schemas.microsoft.com/office/word/2010/wordml" xmlns:w15="http://schemas.microsoft.com/office/word/2012/wordml" xmlns:w16cex="http://schemas.microsoft.com/office/word/2018/wordml/cex" xmlns:w16cid="http://schemas.microsoft.com/office/word/2016/wordml/cid" xmlns:w16="http://schemas.microsoft.com/office/word/2018/wordml" xmlns:w16du="http://schemas.microsoft.com/office/word/2023/wordml/word16du" xmlns:w16sdtdh="http://schemas.microsoft.com/office/word/2020/wordml/sdtdatahash" xmlns:w16sdtfl="http://schemas.microsoft.com/office/word/2024/wordml/sdtformatlock" xmlns:w16se="http://schemas.microsoft.com/office/word/2015/wordml/symex" xmlns:wpg="http://schemas.microsoft.com/office/word/2010/wordprocessingGroup" xmlns:wpi="http://schemas.microsoft.com/office/word/2010/wordprocessingInk" xmlns:wne="http://schemas.microsoft.com/office/word/2006/wordml" xmlns:wps="http://schemas.microsoft.com/office/word/2010/wordprocessingShape" mc:Ignorable="w14 w15 w16se w16cid w16 w16cex w16sdtdh w16sdtfl w16du wp14">
+  <w:p>
+    <w:pPr>
+      <w:pStyle w:val="Header"/>
+    </w:pPr>
+  </w:p>
+</w:hdr>
+</file>
+
+<file path=word/header2.xml><?xml version="1.0" encoding="utf-8"?>
+<w:hdr xmlns:wpc="http://schemas.microsoft.com/office/word/2010/wordprocessingCanvas" xmlns:cx="http://schemas.microsoft.com/office/drawing/2014/chartex" xmlns:cx1="http://schemas.microsoft.com/office/drawing/2015/9/8/chartex" xmlns:cx2="http://schemas.microsoft.com/office/drawing/2015/10/21/chartex" xmlns:cx3="http://schemas.microsoft.com/office/drawing/2016/5/9/chartex" xmlns:cx4="http://schemas.microsoft.com/office/drawing/2016/5/10/chartex" xmlns:cx5="http://schemas.microsoft.com/office/drawing/2016/5/11/chartex" xmlns:cx6="http://schemas.microsoft.com/office/drawing/2016/5/12/chartex" xmlns:cx7="http://schemas.microsoft.com/office/drawing/2016/5/13/chartex" xmlns:cx8="http://schemas.microsoft.com/office/drawing/2016/5/14/chartex" xmlns:mc="http://schemas.openxmlformats.org/markup-compatibility/2006" xmlns:aink="http://schemas.microsoft.com/office/drawing/2016/ink" xmlns:am3d="http://schemas.microsoft.com/office/drawing/2017/model3d" xmlns:o="urn:schemas-microsoft-com:office:office" xmlns:oel="http://schemas.microsoft.com/office/2019/extlst" xmlns:r="http://schemas.openxmlformats.org/officeDocument/2006/relationships" xmlns:m="http://schemas.openxmlformats.org/officeDocument/2006/math" xmlns:v="urn:schemas-microsoft-com:vml" xmlns:wp14="http://schemas.microsoft.com/office/word/2010/wordprocessingDrawing" xmlns:wp="http://schemas.openxmlformats.org/drawingml/2006/wordprocessingDrawing" xmlns:w10="urn:schemas-microsoft-com:office:word" xmlns:w="http://schemas.openxmlformats.org/wordprocessingml/2006/main" xmlns:w14="http://schemas.microsoft.com/office/word/2010/wordml" xmlns:w15="http://schemas.microsoft.com/office/word/2012/wordml" xmlns:w16cex="http://schemas.microsoft.com/office/word/2018/wordml/cex" xmlns:w16cid="http://schemas.microsoft.com/office/word/2016/wordml/cid" xmlns:w16="http://schemas.microsoft.com/office/word/2018/wordml" xmlns:w16du="http://schemas.microsoft.com/office/word/2023/wordml/word16du" xmlns:w16sdtdh="http://schemas.microsoft.com/office/word/2020/wordml/sdtdatahash" xmlns:w16sdtfl="http://schemas.microsoft.com/office/word/2024/wordml/sdtformatlock" xmlns:w16se="http://schemas.microsoft.com/office/word/2015/wordml/symex" xmlns:wpg="http://schemas.microsoft.com/office/word/2010/wordprocessingGroup" xmlns:wpi="http://schemas.microsoft.com/office/word/2010/wordprocessingInk" xmlns:wne="http://schemas.microsoft.com/office/word/2006/wordml" xmlns:wps="http://schemas.microsoft.com/office/word/2010/wordprocessingShape" mc:Ignorable="w14 w15 w16se w16cid w16 w16cex w16sdtdh w16sdtfl w16du wp14">
+  <w:p>
+    <w:pPr>
+      <w:pStyle w:val="Header"/>
+    </w:pPr>
+  </w:p>
+</w:hdr>
+</file>
+
+<file path=word/header3.xml><?xml version="1.0" encoding="utf-8"?>
+<w:hdr xmlns:wpc="http://schemas.microsoft.com/office/word/2010/wordprocessingCanvas" xmlns:cx="http://schemas.microsoft.com/office/drawing/2014/chartex" xmlns:cx1="http://schemas.microsoft.com/office/drawing/2015/9/8/chartex" xmlns:cx2="http://schemas.microsoft.com/office/drawing/2015/10/21/chartex" xmlns:cx3="http://schemas.microsoft.com/office/drawing/2016/5/9/chartex" xmlns:cx4="http://schemas.microsoft.com/office/drawing/2016/5/10/chartex" xmlns:cx5="http://schemas.microsoft.com/office/drawing/2016/5/11/chartex" xmlns:cx6="http://schemas.microsoft.com/office/drawing/2016/5/12/chartex" xmlns:cx7="http://schemas.microsoft.com/office/drawing/2016/5/13/chartex" xmlns:cx8="http://schemas.microsoft.com/office/drawing/2016/5/14/chartex" xmlns:mc="http://schemas.openxmlformats.org/markup-compatibility/2006" xmlns:aink="http://schemas.microsoft.com/office/drawing/2016/ink" xmlns:am3d="http://schemas.microsoft.com/office/drawing/2017/model3d" xmlns:o="urn:schemas-microsoft-com:office:office" xmlns:oel="http://schemas.microsoft.com/office/2019/extlst" xmlns:r="http://schemas.openxmlformats.org/officeDocument/2006/relationships" xmlns:m="http://schemas.openxmlformats.org/officeDocument/2006/math" xmlns:v="urn:schemas-microsoft-com:vml" xmlns:wp14="http://schemas.microsoft.com/office/word/2010/wordprocessingDrawing" xmlns:wp="http://schemas.openxmlformats.org/drawingml/2006/wordprocessingDrawing" xmlns:w10="urn:schemas-microsoft-com:office:word" xmlns:w="http://schemas.openxmlformats.org/wordprocessingml/2006/main" xmlns:w14="http://schemas.microsoft.com/office/word/2010/wordml" xmlns:w15="http://schemas.microsoft.com/office/word/2012/wordml" xmlns:w16cex="http://schemas.microsoft.com/office/word/2018/wordml/cex" xmlns:w16cid="http://schemas.microsoft.com/office/word/2016/wordml/cid" xmlns:w16="http://schemas.microsoft.com/office/word/2018/wordml" xmlns:w16du="http://schemas.microsoft.com/office/word/2023/wordml/word16du" xmlns:w16sdtdh="http://schemas.microsoft.com/office/word/2020/wordml/sdtdatahash" xmlns:w16sdtfl="http://schemas.microsoft.com/office/word/2024/wordml/sdtformatlock" xmlns:w16se="http://schemas.microsoft.com/office/word/2015/wordml/symex" xmlns:wpg="http://schemas.microsoft.com/office/word/2010/wordprocessingGroup" xmlns:wpi="http://schemas.microsoft.com/office/word/2010/wordprocessingInk" xmlns:wne="http://schemas.microsoft.com/office/word/2006/wordml" xmlns:wps="http://schemas.microsoft.com/office/word/2010/wordprocessingShape" mc:Ignorable="w14 w15 w16se w16cid w16 w16cex w16sdtdh w16sdtfl w16du wp14">
+  <w:p>
+    <w:pPr>
+      <w:pStyle w:val="Header"/>
+    </w:pPr>
+  </w:p>
+</w:hdr>
 </file>
 
 <file path=word/styles.xml><?xml version="1.0" encoding="utf-8"?>
@@ -2788,6 +3566,244 @@
     <w:basedOn w:val="DefaultParagraphFont"/>
     <w:rsid w:val="00B64FF4"/>
   </w:style>
+  <w:style w:type="paragraph" w:styleId="TOCHeading">
+    <w:name w:val="TOC Heading"/>
+    <w:basedOn w:val="Heading1"/>
+    <w:next w:val="Normal"/>
+    <w:uiPriority w:val="39"/>
+    <w:unhideWhenUsed/>
+    <w:qFormat/>
+    <w:rsid w:val="004D12F7"/>
+    <w:pPr>
+      <w:spacing w:before="480" w:after="0" w:line="276" w:lineRule="auto"/>
+      <w:outlineLvl w:val="9"/>
+    </w:pPr>
+    <w:rPr>
+      <w:b/>
+      <w:bCs/>
+      <w:kern w:val="0"/>
+      <w:sz w:val="28"/>
+      <w:szCs w:val="28"/>
+      <w14:ligatures w14:val="none"/>
+    </w:rPr>
+  </w:style>
+  <w:style w:type="paragraph" w:styleId="TOC1">
+    <w:name w:val="toc 1"/>
+    <w:basedOn w:val="Normal"/>
+    <w:next w:val="Normal"/>
+    <w:autoRedefine/>
+    <w:uiPriority w:val="39"/>
+    <w:unhideWhenUsed/>
+    <w:rsid w:val="004D12F7"/>
+    <w:pPr>
+      <w:spacing w:before="120"/>
+    </w:pPr>
+    <w:rPr>
+      <w:rFonts w:asciiTheme="minorHAnsi" w:hAnsiTheme="minorHAnsi"/>
+      <w:b/>
+      <w:bCs/>
+      <w:i/>
+      <w:iCs/>
+    </w:rPr>
+  </w:style>
+  <w:style w:type="paragraph" w:styleId="TOC2">
+    <w:name w:val="toc 2"/>
+    <w:basedOn w:val="Normal"/>
+    <w:next w:val="Normal"/>
+    <w:autoRedefine/>
+    <w:uiPriority w:val="39"/>
+    <w:unhideWhenUsed/>
+    <w:rsid w:val="004D12F7"/>
+    <w:pPr>
+      <w:spacing w:before="120"/>
+      <w:ind w:left="240"/>
+    </w:pPr>
+    <w:rPr>
+      <w:rFonts w:asciiTheme="minorHAnsi" w:hAnsiTheme="minorHAnsi"/>
+      <w:b/>
+      <w:bCs/>
+      <w:sz w:val="22"/>
+      <w:szCs w:val="22"/>
+    </w:rPr>
+  </w:style>
+  <w:style w:type="paragraph" w:styleId="TOC3">
+    <w:name w:val="toc 3"/>
+    <w:basedOn w:val="Normal"/>
+    <w:next w:val="Normal"/>
+    <w:autoRedefine/>
+    <w:uiPriority w:val="39"/>
+    <w:semiHidden/>
+    <w:unhideWhenUsed/>
+    <w:rsid w:val="004D12F7"/>
+    <w:pPr>
+      <w:ind w:left="480"/>
+    </w:pPr>
+    <w:rPr>
+      <w:rFonts w:asciiTheme="minorHAnsi" w:hAnsiTheme="minorHAnsi"/>
+      <w:sz w:val="20"/>
+      <w:szCs w:val="20"/>
+    </w:rPr>
+  </w:style>
+  <w:style w:type="paragraph" w:styleId="TOC4">
+    <w:name w:val="toc 4"/>
+    <w:basedOn w:val="Normal"/>
+    <w:next w:val="Normal"/>
+    <w:autoRedefine/>
+    <w:uiPriority w:val="39"/>
+    <w:semiHidden/>
+    <w:unhideWhenUsed/>
+    <w:rsid w:val="004D12F7"/>
+    <w:pPr>
+      <w:ind w:left="720"/>
+    </w:pPr>
+    <w:rPr>
+      <w:rFonts w:asciiTheme="minorHAnsi" w:hAnsiTheme="minorHAnsi"/>
+      <w:sz w:val="20"/>
+      <w:szCs w:val="20"/>
+    </w:rPr>
+  </w:style>
+  <w:style w:type="paragraph" w:styleId="TOC5">
+    <w:name w:val="toc 5"/>
+    <w:basedOn w:val="Normal"/>
+    <w:next w:val="Normal"/>
+    <w:autoRedefine/>
+    <w:uiPriority w:val="39"/>
+    <w:semiHidden/>
+    <w:unhideWhenUsed/>
+    <w:rsid w:val="004D12F7"/>
+    <w:pPr>
+      <w:ind w:left="960"/>
+    </w:pPr>
+    <w:rPr>
+      <w:rFonts w:asciiTheme="minorHAnsi" w:hAnsiTheme="minorHAnsi"/>
+      <w:sz w:val="20"/>
+      <w:szCs w:val="20"/>
+    </w:rPr>
+  </w:style>
+  <w:style w:type="paragraph" w:styleId="TOC6">
+    <w:name w:val="toc 6"/>
+    <w:basedOn w:val="Normal"/>
+    <w:next w:val="Normal"/>
+    <w:autoRedefine/>
+    <w:uiPriority w:val="39"/>
+    <w:semiHidden/>
+    <w:unhideWhenUsed/>
+    <w:rsid w:val="004D12F7"/>
+    <w:pPr>
+      <w:ind w:left="1200"/>
+    </w:pPr>
+    <w:rPr>
+      <w:rFonts w:asciiTheme="minorHAnsi" w:hAnsiTheme="minorHAnsi"/>
+      <w:sz w:val="20"/>
+      <w:szCs w:val="20"/>
+    </w:rPr>
+  </w:style>
+  <w:style w:type="paragraph" w:styleId="TOC7">
+    <w:name w:val="toc 7"/>
+    <w:basedOn w:val="Normal"/>
+    <w:next w:val="Normal"/>
+    <w:autoRedefine/>
+    <w:uiPriority w:val="39"/>
+    <w:semiHidden/>
+    <w:unhideWhenUsed/>
+    <w:rsid w:val="004D12F7"/>
+    <w:pPr>
+      <w:ind w:left="1440"/>
+    </w:pPr>
+    <w:rPr>
+      <w:rFonts w:asciiTheme="minorHAnsi" w:hAnsiTheme="minorHAnsi"/>
+      <w:sz w:val="20"/>
+      <w:szCs w:val="20"/>
+    </w:rPr>
+  </w:style>
+  <w:style w:type="paragraph" w:styleId="TOC8">
+    <w:name w:val="toc 8"/>
+    <w:basedOn w:val="Normal"/>
+    <w:next w:val="Normal"/>
+    <w:autoRedefine/>
+    <w:uiPriority w:val="39"/>
+    <w:semiHidden/>
+    <w:unhideWhenUsed/>
+    <w:rsid w:val="004D12F7"/>
+    <w:pPr>
+      <w:ind w:left="1680"/>
+    </w:pPr>
+    <w:rPr>
+      <w:rFonts w:asciiTheme="minorHAnsi" w:hAnsiTheme="minorHAnsi"/>
+      <w:sz w:val="20"/>
+      <w:szCs w:val="20"/>
+    </w:rPr>
+  </w:style>
+  <w:style w:type="paragraph" w:styleId="TOC9">
+    <w:name w:val="toc 9"/>
+    <w:basedOn w:val="Normal"/>
+    <w:next w:val="Normal"/>
+    <w:autoRedefine/>
+    <w:uiPriority w:val="39"/>
+    <w:semiHidden/>
+    <w:unhideWhenUsed/>
+    <w:rsid w:val="004D12F7"/>
+    <w:pPr>
+      <w:ind w:left="1920"/>
+    </w:pPr>
+    <w:rPr>
+      <w:rFonts w:asciiTheme="minorHAnsi" w:hAnsiTheme="minorHAnsi"/>
+      <w:sz w:val="20"/>
+      <w:szCs w:val="20"/>
+    </w:rPr>
+  </w:style>
+  <w:style w:type="paragraph" w:styleId="Header">
+    <w:name w:val="header"/>
+    <w:basedOn w:val="Normal"/>
+    <w:link w:val="HeaderChar"/>
+    <w:uiPriority w:val="99"/>
+    <w:unhideWhenUsed/>
+    <w:rsid w:val="004D12F7"/>
+    <w:pPr>
+      <w:tabs>
+        <w:tab w:val="center" w:pos="4680"/>
+        <w:tab w:val="right" w:pos="9360"/>
+      </w:tabs>
+      <w:spacing w:line="240" w:lineRule="auto"/>
+    </w:pPr>
+  </w:style>
+  <w:style w:type="character" w:customStyle="1" w:styleId="HeaderChar">
+    <w:name w:val="Header Char"/>
+    <w:basedOn w:val="DefaultParagraphFont"/>
+    <w:link w:val="Header"/>
+    <w:uiPriority w:val="99"/>
+    <w:rsid w:val="004D12F7"/>
+    <w:rPr>
+      <w:rFonts w:ascii="Times New Roman" w:eastAsia="Times New Roman" w:hAnsi="Times New Roman" w:cs="Times New Roman"/>
+      <w:color w:val="000000"/>
+    </w:rPr>
+  </w:style>
+  <w:style w:type="paragraph" w:styleId="Footer">
+    <w:name w:val="footer"/>
+    <w:basedOn w:val="Normal"/>
+    <w:link w:val="FooterChar"/>
+    <w:uiPriority w:val="99"/>
+    <w:unhideWhenUsed/>
+    <w:rsid w:val="004D12F7"/>
+    <w:pPr>
+      <w:tabs>
+        <w:tab w:val="center" w:pos="4680"/>
+        <w:tab w:val="right" w:pos="9360"/>
+      </w:tabs>
+      <w:spacing w:line="240" w:lineRule="auto"/>
+    </w:pPr>
+  </w:style>
+  <w:style w:type="character" w:customStyle="1" w:styleId="FooterChar">
+    <w:name w:val="Footer Char"/>
+    <w:basedOn w:val="DefaultParagraphFont"/>
+    <w:link w:val="Footer"/>
+    <w:uiPriority w:val="99"/>
+    <w:rsid w:val="004D12F7"/>
+    <w:rPr>
+      <w:rFonts w:ascii="Times New Roman" w:eastAsia="Times New Roman" w:hAnsi="Times New Roman" w:cs="Times New Roman"/>
+      <w:color w:val="000000"/>
+    </w:rPr>
+  </w:style>
 </w:styles>
 </file>
 

</xml_diff>

<commit_message>
redoing data cleanup code for readibility
</commit_message>
<xml_diff>
--- a/Final Paper.docx
+++ b/Final Paper.docx
@@ -56,7 +56,13 @@
               <w:tab w:val="right" w:leader="dot" w:pos="9350"/>
             </w:tabs>
             <w:rPr>
+              <w:rFonts w:eastAsiaTheme="minorEastAsia" w:cstheme="minorBidi"/>
+              <w:b w:val="0"/>
+              <w:bCs w:val="0"/>
+              <w:i w:val="0"/>
+              <w:iCs w:val="0"/>
               <w:noProof/>
+              <w:color w:val="auto"/>
             </w:rPr>
           </w:pPr>
           <w:r>
@@ -76,7 +82,7 @@
             </w:rPr>
             <w:fldChar w:fldCharType="separate"/>
           </w:r>
-          <w:hyperlink w:anchor="_Toc221632639" w:history="1">
+          <w:hyperlink w:anchor="_Toc222747361" w:history="1">
             <w:r>
               <w:rPr>
                 <w:rStyle w:val="Hyperlink"/>
@@ -103,7 +109,7 @@
                 <w:noProof/>
                 <w:webHidden/>
               </w:rPr>
-              <w:instrText xml:space="preserve"> PAGEREF _Toc221632639 \h </w:instrText>
+              <w:instrText xml:space="preserve"> PAGEREF _Toc222747361 \h </w:instrText>
             </w:r>
             <w:r>
               <w:rPr>
@@ -141,10 +147,16 @@
               <w:tab w:val="right" w:leader="dot" w:pos="9350"/>
             </w:tabs>
             <w:rPr>
+              <w:rFonts w:eastAsiaTheme="minorEastAsia" w:cstheme="minorBidi"/>
+              <w:b w:val="0"/>
+              <w:bCs w:val="0"/>
+              <w:i w:val="0"/>
+              <w:iCs w:val="0"/>
               <w:noProof/>
+              <w:color w:val="auto"/>
             </w:rPr>
           </w:pPr>
-          <w:hyperlink w:anchor="_Toc221632640" w:history="1">
+          <w:hyperlink w:anchor="_Toc222747362" w:history="1">
             <w:r>
               <w:rPr>
                 <w:rStyle w:val="Hyperlink"/>
@@ -171,7 +183,7 @@
                 <w:noProof/>
                 <w:webHidden/>
               </w:rPr>
-              <w:instrText xml:space="preserve"> PAGEREF _Toc221632640 \h </w:instrText>
+              <w:instrText xml:space="preserve"> PAGEREF _Toc222747362 \h </w:instrText>
             </w:r>
             <w:r>
               <w:rPr>
@@ -209,16 +221,36 @@
               <w:tab w:val="right" w:leader="dot" w:pos="9350"/>
             </w:tabs>
             <w:rPr>
+              <w:rFonts w:eastAsiaTheme="minorEastAsia" w:cstheme="minorBidi"/>
+              <w:b w:val="0"/>
+              <w:bCs w:val="0"/>
+              <w:i w:val="0"/>
+              <w:iCs w:val="0"/>
               <w:noProof/>
+              <w:color w:val="auto"/>
             </w:rPr>
           </w:pPr>
-          <w:hyperlink w:anchor="_Toc221632641" w:history="1">
+          <w:hyperlink w:anchor="_Toc222747363" w:history="1">
             <w:r>
               <w:rPr>
                 <w:rStyle w:val="Hyperlink"/>
                 <w:noProof/>
               </w:rPr>
-              <w:t>Data / Methodology</w:t>
+              <w:t>Data Anal</w:t>
+            </w:r>
+            <w:r>
+              <w:rPr>
+                <w:rStyle w:val="Hyperlink"/>
+                <w:noProof/>
+              </w:rPr>
+              <w:t>y</w:t>
+            </w:r>
+            <w:r>
+              <w:rPr>
+                <w:rStyle w:val="Hyperlink"/>
+                <w:noProof/>
+              </w:rPr>
+              <w:t>sis</w:t>
             </w:r>
             <w:r>
               <w:rPr>
@@ -239,7 +271,7 @@
                 <w:noProof/>
                 <w:webHidden/>
               </w:rPr>
-              <w:instrText xml:space="preserve"> PAGEREF _Toc221632641 \h </w:instrText>
+              <w:instrText xml:space="preserve"> PAGEREF _Toc222747363 \h </w:instrText>
             </w:r>
             <w:r>
               <w:rPr>
@@ -260,6 +292,80 @@
                 <w:webHidden/>
               </w:rPr>
               <w:t>5</w:t>
+            </w:r>
+            <w:r>
+              <w:rPr>
+                <w:noProof/>
+                <w:webHidden/>
+              </w:rPr>
+              <w:fldChar w:fldCharType="end"/>
+            </w:r>
+          </w:hyperlink>
+        </w:p>
+        <w:p>
+          <w:pPr>
+            <w:pStyle w:val="TOC1"/>
+            <w:tabs>
+              <w:tab w:val="right" w:leader="dot" w:pos="9350"/>
+            </w:tabs>
+            <w:rPr>
+              <w:rFonts w:eastAsiaTheme="minorEastAsia" w:cstheme="minorBidi"/>
+              <w:b w:val="0"/>
+              <w:bCs w:val="0"/>
+              <w:i w:val="0"/>
+              <w:iCs w:val="0"/>
+              <w:noProof/>
+              <w:color w:val="auto"/>
+            </w:rPr>
+          </w:pPr>
+          <w:hyperlink w:anchor="_Toc222747364" w:history="1">
+            <w:r>
+              <w:rPr>
+                <w:rStyle w:val="Hyperlink"/>
+                <w:noProof/>
+              </w:rPr>
+              <w:t>Methodology</w:t>
+            </w:r>
+            <w:r>
+              <w:rPr>
+                <w:noProof/>
+                <w:webHidden/>
+              </w:rPr>
+              <w:tab/>
+            </w:r>
+            <w:r>
+              <w:rPr>
+                <w:noProof/>
+                <w:webHidden/>
+              </w:rPr>
+              <w:fldChar w:fldCharType="begin"/>
+            </w:r>
+            <w:r>
+              <w:rPr>
+                <w:noProof/>
+                <w:webHidden/>
+              </w:rPr>
+              <w:instrText xml:space="preserve"> PAGEREF _Toc222747364 \h </w:instrText>
+            </w:r>
+            <w:r>
+              <w:rPr>
+                <w:noProof/>
+                <w:webHidden/>
+              </w:rPr>
+            </w:r>
+            <w:r>
+              <w:rPr>
+                <w:noProof/>
+                <w:webHidden/>
+              </w:rPr>
+              <w:fldChar w:fldCharType="separate"/>
+            </w:r>
+            <w:r>
+              <w:rPr>
+                <w:noProof/>
+                <w:webHidden/>
+              </w:rPr>
+              <w:t>6</w:t>
             </w:r>
             <w:r>
               <w:rPr>
@@ -277,10 +383,16 @@
               <w:tab w:val="right" w:leader="dot" w:pos="9350"/>
             </w:tabs>
             <w:rPr>
+              <w:rFonts w:eastAsiaTheme="minorEastAsia" w:cstheme="minorBidi"/>
+              <w:b w:val="0"/>
+              <w:bCs w:val="0"/>
               <w:noProof/>
+              <w:color w:val="auto"/>
+              <w:sz w:val="24"/>
+              <w:szCs w:val="24"/>
             </w:rPr>
           </w:pPr>
-          <w:hyperlink w:anchor="_Toc221632642" w:history="1">
+          <w:hyperlink w:anchor="_Toc222747365" w:history="1">
             <w:r>
               <w:rPr>
                 <w:rStyle w:val="Hyperlink"/>
@@ -307,7 +419,7 @@
                 <w:noProof/>
                 <w:webHidden/>
               </w:rPr>
-              <w:instrText xml:space="preserve"> PAGEREF _Toc221632642 \h </w:instrText>
+              <w:instrText xml:space="preserve"> PAGEREF _Toc222747365 \h </w:instrText>
             </w:r>
             <w:r>
               <w:rPr>
@@ -327,7 +439,7 @@
                 <w:noProof/>
                 <w:webHidden/>
               </w:rPr>
-              <w:t>7</w:t>
+              <w:t>8</w:t>
             </w:r>
             <w:r>
               <w:rPr>
@@ -345,10 +457,16 @@
               <w:tab w:val="right" w:leader="dot" w:pos="9350"/>
             </w:tabs>
             <w:rPr>
+              <w:rFonts w:eastAsiaTheme="minorEastAsia" w:cstheme="minorBidi"/>
+              <w:b w:val="0"/>
+              <w:bCs w:val="0"/>
+              <w:i w:val="0"/>
+              <w:iCs w:val="0"/>
               <w:noProof/>
+              <w:color w:val="auto"/>
             </w:rPr>
           </w:pPr>
-          <w:hyperlink w:anchor="_Toc221632643" w:history="1">
+          <w:hyperlink w:anchor="_Toc222747366" w:history="1">
             <w:r>
               <w:rPr>
                 <w:rStyle w:val="Hyperlink"/>
@@ -375,7 +493,7 @@
                 <w:noProof/>
                 <w:webHidden/>
               </w:rPr>
-              <w:instrText xml:space="preserve"> PAGEREF _Toc221632643 \h </w:instrText>
+              <w:instrText xml:space="preserve"> PAGEREF _Toc222747366 \h </w:instrText>
             </w:r>
             <w:r>
               <w:rPr>
@@ -395,7 +513,7 @@
                 <w:noProof/>
                 <w:webHidden/>
               </w:rPr>
-              <w:t>8</w:t>
+              <w:t>9</w:t>
             </w:r>
             <w:r>
               <w:rPr>
@@ -413,10 +531,16 @@
               <w:tab w:val="right" w:leader="dot" w:pos="9350"/>
             </w:tabs>
             <w:rPr>
+              <w:rFonts w:eastAsiaTheme="minorEastAsia" w:cstheme="minorBidi"/>
+              <w:b w:val="0"/>
+              <w:bCs w:val="0"/>
+              <w:i w:val="0"/>
+              <w:iCs w:val="0"/>
               <w:noProof/>
+              <w:color w:val="auto"/>
             </w:rPr>
           </w:pPr>
-          <w:hyperlink w:anchor="_Toc221632644" w:history="1">
+          <w:hyperlink w:anchor="_Toc222747367" w:history="1">
             <w:r>
               <w:rPr>
                 <w:rStyle w:val="Hyperlink"/>
@@ -443,7 +567,7 @@
                 <w:noProof/>
                 <w:webHidden/>
               </w:rPr>
-              <w:instrText xml:space="preserve"> PAGEREF _Toc221632644 \h </w:instrText>
+              <w:instrText xml:space="preserve"> PAGEREF _Toc222747367 \h </w:instrText>
             </w:r>
             <w:r>
               <w:rPr>
@@ -463,7 +587,7 @@
                 <w:noProof/>
                 <w:webHidden/>
               </w:rPr>
-              <w:t>9</w:t>
+              <w:t>10</w:t>
             </w:r>
             <w:r>
               <w:rPr>
@@ -481,10 +605,16 @@
               <w:tab w:val="right" w:leader="dot" w:pos="9350"/>
             </w:tabs>
             <w:rPr>
+              <w:rFonts w:eastAsiaTheme="minorEastAsia" w:cstheme="minorBidi"/>
+              <w:b w:val="0"/>
+              <w:bCs w:val="0"/>
+              <w:i w:val="0"/>
+              <w:iCs w:val="0"/>
               <w:noProof/>
+              <w:color w:val="auto"/>
             </w:rPr>
           </w:pPr>
-          <w:hyperlink w:anchor="_Toc221632645" w:history="1">
+          <w:hyperlink w:anchor="_Toc222747368" w:history="1">
             <w:r>
               <w:rPr>
                 <w:rStyle w:val="Hyperlink"/>
@@ -511,7 +641,7 @@
                 <w:noProof/>
                 <w:webHidden/>
               </w:rPr>
-              <w:instrText xml:space="preserve"> PAGEREF _Toc221632645 \h </w:instrText>
+              <w:instrText xml:space="preserve"> PAGEREF _Toc222747368 \h </w:instrText>
             </w:r>
             <w:r>
               <w:rPr>
@@ -531,7 +661,7 @@
                 <w:noProof/>
                 <w:webHidden/>
               </w:rPr>
-              <w:t>10</w:t>
+              <w:t>11</w:t>
             </w:r>
             <w:r>
               <w:rPr>
@@ -549,10 +679,16 @@
               <w:tab w:val="right" w:leader="dot" w:pos="9350"/>
             </w:tabs>
             <w:rPr>
+              <w:rFonts w:eastAsiaTheme="minorEastAsia" w:cstheme="minorBidi"/>
+              <w:b w:val="0"/>
+              <w:bCs w:val="0"/>
+              <w:i w:val="0"/>
+              <w:iCs w:val="0"/>
               <w:noProof/>
+              <w:color w:val="auto"/>
             </w:rPr>
           </w:pPr>
-          <w:hyperlink w:anchor="_Toc221632646" w:history="1">
+          <w:hyperlink w:anchor="_Toc222747369" w:history="1">
             <w:r>
               <w:rPr>
                 <w:rStyle w:val="Hyperlink"/>
@@ -579,7 +715,7 @@
                 <w:noProof/>
                 <w:webHidden/>
               </w:rPr>
-              <w:instrText xml:space="preserve"> PAGEREF _Toc221632646 \h </w:instrText>
+              <w:instrText xml:space="preserve"> PAGEREF _Toc222747369 \h </w:instrText>
             </w:r>
             <w:r>
               <w:rPr>
@@ -599,7 +735,7 @@
                 <w:noProof/>
                 <w:webHidden/>
               </w:rPr>
-              <w:t>11</w:t>
+              <w:t>12</w:t>
             </w:r>
             <w:r>
               <w:rPr>
@@ -640,7 +776,7 @@
       <w:pPr>
         <w:pStyle w:val="Heading1"/>
       </w:pPr>
-      <w:bookmarkStart w:id="0" w:name="_Toc221632639"/>
+      <w:bookmarkStart w:id="0" w:name="_Toc222747361"/>
       <w:r>
         <w:lastRenderedPageBreak/>
         <w:t>Introduction</w:t>
@@ -654,7 +790,7 @@
       <w:pPr>
         <w:pStyle w:val="Heading1"/>
       </w:pPr>
-      <w:bookmarkStart w:id="1" w:name="_Toc221632640"/>
+      <w:bookmarkStart w:id="1" w:name="_Toc222747362"/>
       <w:r>
         <w:lastRenderedPageBreak/>
         <w:t>Literature Review</w:t>
@@ -668,7 +804,7 @@
       <w:pPr>
         <w:pStyle w:val="Heading1"/>
       </w:pPr>
-      <w:bookmarkStart w:id="2" w:name="_Toc221632641"/>
+      <w:bookmarkStart w:id="2" w:name="_Toc222747363"/>
       <w:r>
         <w:lastRenderedPageBreak/>
         <w:t xml:space="preserve">Data </w:t>
@@ -676,6 +812,7 @@
       <w:r>
         <w:t>Analysis</w:t>
       </w:r>
+      <w:bookmarkEnd w:id="2"/>
     </w:p>
     <w:p>
       <w:pPr>
@@ -697,10 +834,18 @@
         <w:t xml:space="preserve"> trends of</w:t>
       </w:r>
       <w:r>
-        <w:t xml:space="preserve"> financial practices for non-profit organizations in the United States. For this, the dataset is </w:t>
-      </w:r>
-      <w:r>
-        <w:t>made up</w:t>
+        <w:t xml:space="preserve"> financial practices for non-profit organizations in the United States. For this, the dataset </w:t>
+      </w:r>
+      <w:proofErr w:type="gramStart"/>
+      <w:r>
+        <w:t xml:space="preserve">is </w:t>
+      </w:r>
+      <w:r>
+        <w:t>made</w:t>
+      </w:r>
+      <w:proofErr w:type="gramEnd"/>
+      <w:r>
+        <w:t xml:space="preserve"> up</w:t>
       </w:r>
       <w:r>
         <w:t xml:space="preserve"> of </w:t>
@@ -757,13 +902,7 @@
         <w:t xml:space="preserve">US states, </w:t>
       </w:r>
       <w:r>
-        <w:t xml:space="preserve">with </w:t>
-      </w:r>
-      <w:r>
-        <w:t>gross receipts of greater than $200,000 in one year or net assets of greater than $500,000</w:t>
-      </w:r>
-      <w:r>
-        <w:t xml:space="preserve"> are included in th</w:t>
+        <w:t>with gross receipts of greater than $200,000 in one year or net assets of greater than $500,000 are included in th</w:t>
       </w:r>
       <w:r>
         <w:t>is</w:t>
@@ -785,8 +924,13 @@
       <w:r>
         <w:t xml:space="preserve">Internal Revenue Service </w:t>
       </w:r>
-      <w:r>
-        <w:t xml:space="preserve">collections </w:t>
+      <w:proofErr w:type="gramStart"/>
+      <w:r>
+        <w:t>collections</w:t>
+      </w:r>
+      <w:proofErr w:type="gramEnd"/>
+      <w:r>
+        <w:t xml:space="preserve"> </w:t>
       </w:r>
       <w:r>
         <w:t xml:space="preserve">Primary </w:t>
@@ -804,15 +948,7 @@
         <w:t xml:space="preserve"> </w:t>
       </w:r>
       <w:r>
-        <w:t>National Taxonomy of Exempt Entities (</w:t>
-      </w:r>
-      <w:proofErr w:type="spellStart"/>
-      <w:r>
-        <w:t>NTEE</w:t>
-      </w:r>
-      <w:proofErr w:type="spellEnd"/>
-      <w:r>
-        <w:t xml:space="preserve">) </w:t>
+        <w:t xml:space="preserve">National Taxonomy of Exempt Entities (NTEE) </w:t>
       </w:r>
       <w:r>
         <w:t xml:space="preserve">classification </w:t>
@@ -836,75 +972,182 @@
         <w:t>.</w:t>
       </w:r>
       <w:r>
+        <w:t xml:space="preserve"> NTEE codes are the newest format of non-profit</w:t>
+      </w:r>
+      <w:r>
         <w:t xml:space="preserve"> </w:t>
       </w:r>
-      <w:proofErr w:type="spellStart"/>
-      <w:r>
-        <w:t>NTEE</w:t>
-      </w:r>
-      <w:proofErr w:type="spellEnd"/>
-      <w:r>
-        <w:t xml:space="preserve"> codes are the newest format of non-profit</w:t>
+      <w:r>
+        <w:t>business</w:t>
+      </w:r>
+      <w:r>
+        <w:t xml:space="preserve"> classification</w:t>
+      </w:r>
+      <w:r>
+        <w:t xml:space="preserve"> adopted by the IRS</w:t>
+      </w:r>
+      <w:r>
+        <w:t xml:space="preserve">. So, </w:t>
+      </w:r>
+      <w:r>
+        <w:t>older</w:t>
+      </w:r>
+      <w:r>
+        <w:t xml:space="preserve"> organization</w:t>
+      </w:r>
+      <w:r>
+        <w:t>s</w:t>
+      </w:r>
+      <w:r>
+        <w:t xml:space="preserve"> filing an</w:t>
       </w:r>
       <w:r>
         <w:t xml:space="preserve"> </w:t>
       </w:r>
       <w:r>
-        <w:t>business</w:t>
-      </w:r>
-      <w:r>
-        <w:t xml:space="preserve"> classification</w:t>
-      </w:r>
-      <w:r>
-        <w:t xml:space="preserve"> adopted by the IRS</w:t>
-      </w:r>
-      <w:r>
-        <w:t xml:space="preserve">. So, </w:t>
-      </w:r>
-      <w:r>
-        <w:t>older</w:t>
-      </w:r>
-      <w:r>
-        <w:t xml:space="preserve"> organization</w:t>
-      </w:r>
-      <w:r>
-        <w:t>s</w:t>
-      </w:r>
-      <w:r>
-        <w:t xml:space="preserve"> filing an</w:t>
-      </w:r>
-      <w:r>
-        <w:t xml:space="preserve"> </w:t>
-      </w:r>
-      <w:r>
         <w:t xml:space="preserve">activity code </w:t>
       </w:r>
-      <w:r>
-        <w:t xml:space="preserve">are replaced to the nearest </w:t>
-      </w:r>
-      <w:proofErr w:type="spellStart"/>
-      <w:r>
-        <w:t>NTEE</w:t>
-      </w:r>
-      <w:proofErr w:type="spellEnd"/>
-      <w:r>
-        <w:t xml:space="preserve"> code for this thesis. Below is a table of all </w:t>
-      </w:r>
-      <w:proofErr w:type="spellStart"/>
-      <w:r>
-        <w:t>NTEE</w:t>
-      </w:r>
-      <w:proofErr w:type="spellEnd"/>
-      <w:r>
-        <w:t xml:space="preserve"> codes, which are all representative in this thesis’s final dataset:</w:t>
-      </w:r>
+      <w:proofErr w:type="gramStart"/>
+      <w:r>
+        <w:t>are replaced</w:t>
+      </w:r>
+      <w:proofErr w:type="gramEnd"/>
+      <w:r>
+        <w:t xml:space="preserve"> to the nearest NTEE code for this thesis. Below is a table of all NTEE codes, which are all representative in this thesis’s final dataset:</w:t>
+      </w:r>
+    </w:p>
+    <w:p>
+      <w:r>
+        <w:t xml:space="preserve">Table I. List of Industries </w:t>
+      </w:r>
+    </w:p>
+    <w:p>
+      <w:pPr>
+        <w:ind w:firstLine="720"/>
+      </w:pPr>
+    </w:p>
+    <w:p>
+      <w:pPr>
+        <w:ind w:firstLine="720"/>
+      </w:pPr>
+      <w:r>
+        <w:t>According to 501(c)(3) status regulations, an organization that does not follow filing procedures for three consecutive years loses its tax-exempt status.</w:t>
+      </w:r>
+      <w:r>
+        <w:rPr>
+          <w:rStyle w:val="FootnoteReference"/>
+        </w:rPr>
+        <w:footnoteReference w:id="1"/>
+      </w:r>
+      <w:r>
+        <w:t xml:space="preserve"> Additionally, an organization that is not contributing a public benefit is at risk of losings its special status. So, three </w:t>
+      </w:r>
+      <w:r>
+        <w:lastRenderedPageBreak/>
+        <w:t xml:space="preserve">consecutive years of zero program expenses, assuming this shows zero public benefit, is a reasonable restriction to make. </w:t>
+      </w:r>
+    </w:p>
+    <w:p>
+      <w:pPr>
+        <w:ind w:firstLine="720"/>
+      </w:pPr>
+      <w:r>
+        <w:t xml:space="preserve">For succinctness, I also drop organizations with three or more years of zero revenues. So, I will drop from the data organizations that satisfy both conditions, because this </w:t>
+      </w:r>
+      <w:proofErr w:type="gramStart"/>
+      <w:r>
+        <w:t>indicates</w:t>
+      </w:r>
+      <w:proofErr w:type="gramEnd"/>
+      <w:r>
+        <w:t xml:space="preserve"> an inactive organization.</w:t>
+      </w:r>
+    </w:p>
+    <w:p>
+      <w:pPr>
+        <w:ind w:firstLine="720"/>
+      </w:pPr>
+      <w:r>
+        <w:t>Also, dropping hospitals and schools from the data set. Their demand is inelastic.</w:t>
+      </w:r>
+    </w:p>
+    <w:p>
+      <w:pPr>
+        <w:ind w:firstLine="720"/>
+      </w:pPr>
+      <w:r>
+        <w:t xml:space="preserve">This limits the data set to </w:t>
+      </w:r>
+      <w:r>
+        <w:t>3</w:t>
+      </w:r>
+      <w:r>
+        <w:t>,</w:t>
+      </w:r>
+      <w:r>
+        <w:t>014</w:t>
+      </w:r>
+      <w:r>
+        <w:t>,</w:t>
+      </w:r>
+      <w:r>
+        <w:t>314</w:t>
+      </w:r>
+      <w:r>
+        <w:t xml:space="preserve"> observations (from 5,002,756) across </w:t>
+      </w:r>
+      <w:r>
+        <w:t>457</w:t>
+      </w:r>
+      <w:r>
+        <w:t>,</w:t>
+      </w:r>
+      <w:r>
+        <w:t>042</w:t>
+      </w:r>
+      <w:r>
+        <w:t xml:space="preserve"> unique organizations (from 738,790). According to the log distribution, the data is now much more balanced.</w:t>
+      </w:r>
+    </w:p>
+    <w:p>
+      <w:pPr>
+        <w:ind w:firstLine="720"/>
+      </w:pPr>
     </w:p>
     <w:p/>
     <w:p>
       <w:r>
-        <w:t>Table I.</w:t>
-      </w:r>
-    </w:p>
+        <w:t xml:space="preserve">Table II. Distribution </w:t>
+      </w:r>
+      <w:r>
+        <w:t>by</w:t>
+      </w:r>
+      <w:r>
+        <w:t xml:space="preserve"> Revenue size</w:t>
+      </w:r>
+    </w:p>
+    <w:p>
+      <w:r>
+        <w:t xml:space="preserve">Table III. Distribution </w:t>
+      </w:r>
+      <w:r>
+        <w:t>by</w:t>
+      </w:r>
+      <w:r>
+        <w:t xml:space="preserve"> Program Expense size</w:t>
+      </w:r>
+    </w:p>
+    <w:p>
+      <w:r>
+        <w:t>Table IV. Distribution of organizations by year</w:t>
+      </w:r>
+    </w:p>
+    <w:p>
+      <w:r>
+        <w:t>Table V. Summary Statistics of Key Variables</w:t>
+      </w:r>
+    </w:p>
+    <w:p/>
     <w:p/>
     <w:p/>
     <w:p>
@@ -935,11 +1178,12 @@
       <w:pPr>
         <w:pStyle w:val="Heading1"/>
       </w:pPr>
+      <w:bookmarkStart w:id="3" w:name="_Toc222747364"/>
       <w:r>
         <w:lastRenderedPageBreak/>
         <w:t>Methodology</w:t>
       </w:r>
-      <w:bookmarkEnd w:id="2"/>
+      <w:bookmarkEnd w:id="3"/>
     </w:p>
     <w:p>
       <w:pPr>
@@ -1245,48 +1489,25 @@
         </w:rPr>
         <w:t xml:space="preserve">My key dependent variable is “Total program Expenses” because </w:t>
       </w:r>
+      <w:proofErr w:type="gramStart"/>
       <w:r>
         <w:rPr>
           <w:rFonts w:eastAsiaTheme="minorEastAsia"/>
         </w:rPr>
-        <w:t>I believe it is the best</w:t>
+        <w:t>I believe it</w:t>
+      </w:r>
+      <w:proofErr w:type="gramEnd"/>
+      <w:r>
+        <w:rPr>
+          <w:rFonts w:eastAsiaTheme="minorEastAsia"/>
+        </w:rPr>
+        <w:t xml:space="preserve"> is the best</w:t>
       </w:r>
       <w:r>
         <w:rPr>
           <w:rFonts w:eastAsiaTheme="minorEastAsia"/>
         </w:rPr>
         <w:t xml:space="preserve"> measure of the total money spent on activities advancing each non-profits mission statement. Other research may use more direct survey data to measure ‘direct impact’ towards the mission.</w:t>
-      </w:r>
-      <w:r>
-        <w:rPr>
-          <w:rStyle w:val="FootnoteReference"/>
-          <w:rFonts w:eastAsiaTheme="minorEastAsia"/>
-        </w:rPr>
-        <w:footnoteReference w:id="1"/>
-      </w:r>
-      <w:r>
-        <w:rPr>
-          <w:rFonts w:eastAsiaTheme="minorEastAsia"/>
-        </w:rPr>
-        <w:t xml:space="preserve"> </w:t>
-      </w:r>
-      <w:r>
-        <w:rPr>
-          <w:rFonts w:eastAsiaTheme="minorEastAsia"/>
-        </w:rPr>
-        <w:t xml:space="preserve">I do not have the opportunity to survey for such data. From the same research, they take the </w:t>
-      </w:r>
-      <w:r>
-        <w:rPr>
-          <w:rFonts w:eastAsiaTheme="minorEastAsia"/>
-        </w:rPr>
-        <w:t>log (</w:t>
-      </w:r>
-      <w:r>
-        <w:rPr>
-          <w:rFonts w:eastAsiaTheme="minorEastAsia"/>
-        </w:rPr>
-        <w:t xml:space="preserve">) value of their dependent variable to make it more comparable across organizations. </w:t>
       </w:r>
       <w:r>
         <w:rPr>
@@ -1299,7 +1520,25 @@
         <w:rPr>
           <w:rFonts w:eastAsiaTheme="minorEastAsia"/>
         </w:rPr>
-        <w:t xml:space="preserve"> On the other hand, some other researchers do not take the log () for their dependent variable.</w:t>
+        <w:t xml:space="preserve"> </w:t>
+      </w:r>
+      <w:r>
+        <w:rPr>
+          <w:rFonts w:eastAsiaTheme="minorEastAsia"/>
+        </w:rPr>
+        <w:t xml:space="preserve">I do not have the opportunity to survey for such data. From the same research, they take the </w:t>
+      </w:r>
+      <w:r>
+        <w:rPr>
+          <w:rFonts w:eastAsiaTheme="minorEastAsia"/>
+        </w:rPr>
+        <w:t>log (</w:t>
+      </w:r>
+      <w:r>
+        <w:rPr>
+          <w:rFonts w:eastAsiaTheme="minorEastAsia"/>
+        </w:rPr>
+        <w:t xml:space="preserve">) value of their dependent variable to make it more comparable across organizations. </w:t>
       </w:r>
       <w:r>
         <w:rPr>
@@ -1307,6 +1546,19 @@
           <w:rFonts w:eastAsiaTheme="minorEastAsia"/>
         </w:rPr>
         <w:footnoteReference w:id="3"/>
+      </w:r>
+      <w:r>
+        <w:rPr>
+          <w:rFonts w:eastAsiaTheme="minorEastAsia"/>
+        </w:rPr>
+        <w:t xml:space="preserve"> On the other hand, some other researchers do not take the log () for their dependent variable.</w:t>
+      </w:r>
+      <w:r>
+        <w:rPr>
+          <w:rStyle w:val="FootnoteReference"/>
+          <w:rFonts w:eastAsiaTheme="minorEastAsia"/>
+        </w:rPr>
+        <w:footnoteReference w:id="4"/>
       </w:r>
     </w:p>
     <w:p>
@@ -1327,7 +1579,7 @@
           <w:rStyle w:val="FootnoteReference"/>
           <w:rFonts w:eastAsiaTheme="minorEastAsia"/>
         </w:rPr>
-        <w:footnoteReference w:id="4"/>
+        <w:footnoteReference w:id="5"/>
       </w:r>
       <w:r>
         <w:rPr>
@@ -1340,7 +1592,7 @@
           <w:rStyle w:val="FootnoteReference"/>
           <w:rFonts w:eastAsiaTheme="minorEastAsia"/>
         </w:rPr>
-        <w:footnoteReference w:id="5"/>
+        <w:footnoteReference w:id="6"/>
       </w:r>
     </w:p>
     <w:p>
@@ -1819,7 +2071,7 @@
         <w:rPr>
           <w:rStyle w:val="FootnoteReference"/>
         </w:rPr>
-        <w:footnoteReference w:id="6"/>
+        <w:footnoteReference w:id="7"/>
       </w:r>
       <w:r>
         <w:t xml:space="preserve"> I choose to modify this variable to be a variable ratio as many nonprofits may operate from a blend of revenue sources, but </w:t>
@@ -2005,7 +2257,7 @@
         <w:rPr>
           <w:rStyle w:val="FootnoteReference"/>
         </w:rPr>
-        <w:footnoteReference w:id="7"/>
+        <w:footnoteReference w:id="8"/>
       </w:r>
       <w:r>
         <w:t xml:space="preserve"> Calculating a similar formula, I choose to look at the intensity a non-profit is more business-like, as in relying on direct products/services sales to maintain activities, because of research finding that </w:t>
@@ -2017,7 +2269,7 @@
         <w:rPr>
           <w:rStyle w:val="FootnoteReference"/>
         </w:rPr>
-        <w:footnoteReference w:id="8"/>
+        <w:footnoteReference w:id="9"/>
       </w:r>
       <w:r>
         <w:t xml:space="preserve"> I use a very similar formula to that research. </w:t>
@@ -2159,7 +2411,15 @@
         </m:sSub>
       </m:oMath>
       <w:r>
-        <w:t>= Non-profit Sector = multiple dummy variables for specific non-profit sectors (i.e. hospital, school, museum, none of the above)</w:t>
+        <w:t>= Non-profit Sector = multiple dummy variables for specific non-profit sectors (</w:t>
+      </w:r>
+      <w:proofErr w:type="gramStart"/>
+      <w:r>
+        <w:t>i.e.</w:t>
+      </w:r>
+      <w:proofErr w:type="gramEnd"/>
+      <w:r>
+        <w:t xml:space="preserve"> hospital, school, museum, none of the above)</w:t>
       </w:r>
     </w:p>
     <w:p/>
@@ -2167,132 +2427,11 @@
       <w:pPr>
         <w:pStyle w:val="Heading2"/>
       </w:pPr>
-      <w:bookmarkStart w:id="3" w:name="_Toc221632642"/>
+      <w:bookmarkStart w:id="4" w:name="_Toc222747365"/>
       <w:r>
         <w:t>Removing Outliers</w:t>
       </w:r>
-      <w:bookmarkEnd w:id="3"/>
-    </w:p>
-    <w:p>
-      <w:pPr>
-        <w:ind w:firstLine="720"/>
-      </w:pPr>
-      <w:r>
-        <w:t>I want to remove organizations that have multiple years of zero program expenses</w:t>
-      </w:r>
-      <w:r>
-        <w:t>.</w:t>
-      </w:r>
-      <w:r>
-        <w:t xml:space="preserve"> </w:t>
-      </w:r>
-      <w:r>
-        <w:t xml:space="preserve">As a prerequisite, I want to check the distribution of organizations without program expenses. </w:t>
-      </w:r>
-    </w:p>
-    <w:p>
-      <w:pPr>
-        <w:ind w:firstLine="720"/>
-      </w:pPr>
-      <w:r>
-        <w:t>According to 501(c)(3) status regulations, an organization that does not follow filing procedures for three consecutive years loses its tax-exempt status.</w:t>
-      </w:r>
-      <w:r>
-        <w:rPr>
-          <w:rStyle w:val="FootnoteReference"/>
-        </w:rPr>
-        <w:footnoteReference w:id="9"/>
-      </w:r>
-      <w:r>
-        <w:t xml:space="preserve"> Additionally, an organization that is not contributing a public benefit is at risk of losings its special status. So, three consecutive years of zero program expenses, assuming this shows zero public benefit, is a reasonable restriction to make. </w:t>
-      </w:r>
-    </w:p>
-    <w:p>
-      <w:pPr>
-        <w:ind w:firstLine="720"/>
-      </w:pPr>
-      <w:r>
-        <w:t xml:space="preserve">For succinctness, I </w:t>
-      </w:r>
-      <w:r>
-        <w:t>should</w:t>
-      </w:r>
-      <w:r>
-        <w:t xml:space="preserve"> also drop organizations with </w:t>
-      </w:r>
-      <w:r>
-        <w:t xml:space="preserve">three </w:t>
-      </w:r>
-      <w:r>
-        <w:t>or more years of zero revenues.</w:t>
-      </w:r>
-      <w:r>
-        <w:t xml:space="preserve"> So, I will drop from the data organizations that satisfy both conditions, because this indicates an inactive organization.</w:t>
-      </w:r>
-    </w:p>
-    <w:p>
-      <w:pPr>
-        <w:ind w:firstLine="720"/>
-      </w:pPr>
-      <w:r>
-        <w:t>Also, dropping hospitals and schools from the data set. Their demand is inelastic.</w:t>
-      </w:r>
-    </w:p>
-    <w:p>
-      <w:pPr>
-        <w:ind w:firstLine="720"/>
-      </w:pPr>
-      <w:r>
-        <w:t xml:space="preserve">This limits the data set to </w:t>
-      </w:r>
-      <w:r>
-        <w:t>3</w:t>
-      </w:r>
-      <w:r>
-        <w:t>,</w:t>
-      </w:r>
-      <w:r>
-        <w:t>014</w:t>
-      </w:r>
-      <w:r>
-        <w:t>,</w:t>
-      </w:r>
-      <w:r>
-        <w:t>314</w:t>
-      </w:r>
-      <w:r>
-        <w:t xml:space="preserve"> </w:t>
-      </w:r>
-      <w:r>
-        <w:t>observations (from 5,002,756</w:t>
-      </w:r>
-      <w:r>
-        <w:t xml:space="preserve">) </w:t>
-      </w:r>
-      <w:r>
-        <w:t xml:space="preserve">across </w:t>
-      </w:r>
-      <w:r>
-        <w:t>457</w:t>
-      </w:r>
-      <w:r>
-        <w:t>,</w:t>
-      </w:r>
-      <w:r>
-        <w:t>042</w:t>
-      </w:r>
-      <w:r>
-        <w:t xml:space="preserve"> </w:t>
-      </w:r>
-      <w:r>
-        <w:t xml:space="preserve">unique organizations (from </w:t>
-      </w:r>
-      <w:r>
-        <w:t>738,790).</w:t>
-      </w:r>
-      <w:r>
-        <w:t xml:space="preserve"> According to the log distribution, the data is now much more balanced.</w:t>
-      </w:r>
+      <w:bookmarkEnd w:id="4"/>
     </w:p>
     <w:p>
       <w:pPr>
@@ -2306,12 +2445,12 @@
       <w:pPr>
         <w:pStyle w:val="Heading1"/>
       </w:pPr>
-      <w:bookmarkStart w:id="4" w:name="_Toc221632643"/>
+      <w:bookmarkStart w:id="5" w:name="_Toc222747366"/>
       <w:r>
         <w:lastRenderedPageBreak/>
         <w:t>Results</w:t>
       </w:r>
-      <w:bookmarkEnd w:id="4"/>
+      <w:bookmarkEnd w:id="5"/>
     </w:p>
     <w:p>
       <w:pPr>
@@ -2325,12 +2464,12 @@
       <w:pPr>
         <w:pStyle w:val="Heading1"/>
       </w:pPr>
-      <w:bookmarkStart w:id="5" w:name="_Toc221632644"/>
+      <w:bookmarkStart w:id="6" w:name="_Toc222747367"/>
       <w:r>
         <w:lastRenderedPageBreak/>
         <w:t>Analysis</w:t>
       </w:r>
-      <w:bookmarkEnd w:id="5"/>
+      <w:bookmarkEnd w:id="6"/>
     </w:p>
     <w:p>
       <w:pPr>
@@ -2344,12 +2483,12 @@
       <w:pPr>
         <w:pStyle w:val="Heading1"/>
       </w:pPr>
-      <w:bookmarkStart w:id="6" w:name="_Toc221632645"/>
+      <w:bookmarkStart w:id="7" w:name="_Toc222747368"/>
       <w:r>
         <w:lastRenderedPageBreak/>
         <w:t>Conclusion</w:t>
       </w:r>
-      <w:bookmarkEnd w:id="6"/>
+      <w:bookmarkEnd w:id="7"/>
     </w:p>
     <w:p>
       <w:pPr>
@@ -2363,12 +2502,12 @@
       <w:pPr>
         <w:pStyle w:val="Heading1"/>
       </w:pPr>
-      <w:bookmarkStart w:id="7" w:name="_Toc221632646"/>
+      <w:bookmarkStart w:id="8" w:name="_Toc222747369"/>
       <w:r>
         <w:lastRenderedPageBreak/>
         <w:t>Bibliography</w:t>
       </w:r>
-      <w:bookmarkEnd w:id="7"/>
+      <w:bookmarkEnd w:id="8"/>
     </w:p>
     <w:p/>
     <w:p>
@@ -2472,166 +2611,6 @@
         <w:t xml:space="preserve"> </w:t>
       </w:r>
       <w:r>
-        <w:t>Altamimi, Hala, and Qiaozhen Liu. "The nonprofit starvation cycle: Does overhead spending really impact program outcomes?." Nonprofit and Voluntary Sector Quarterly 51, no. 6 (2022): 1324-1348.</w:t>
-      </w:r>
-    </w:p>
-  </w:footnote>
-  <w:footnote w:id="2">
-    <w:p>
-      <w:pPr>
-        <w:pStyle w:val="FootnoteText"/>
-      </w:pPr>
-      <w:r>
-        <w:rPr>
-          <w:rStyle w:val="FootnoteReference"/>
-        </w:rPr>
-        <w:footnoteRef/>
-      </w:r>
-      <w:r>
-        <w:t xml:space="preserve"> Altamimi, Hala and Qiaozhen Liu (2022).</w:t>
-      </w:r>
-    </w:p>
-  </w:footnote>
-  <w:footnote w:id="3">
-    <w:p>
-      <w:pPr>
-        <w:pStyle w:val="FootnoteText"/>
-      </w:pPr>
-      <w:r>
-        <w:rPr>
-          <w:rStyle w:val="FootnoteReference"/>
-        </w:rPr>
-        <w:footnoteRef/>
-      </w:r>
-      <w:r>
-        <w:t xml:space="preserve"> </w:t>
-      </w:r>
-      <w:r>
-        <w:t>Exley, Christine L., Nils H. Lehr, and Stephen J. Terry. "Nonprofits in good times and bad times." Journal of Political Economy Microeconomics 1, no. 1 (2023): 42-79.</w:t>
-      </w:r>
-    </w:p>
-  </w:footnote>
-  <w:footnote w:id="4">
-    <w:p>
-      <w:pPr>
-        <w:pStyle w:val="FootnoteText"/>
-      </w:pPr>
-      <w:r>
-        <w:rPr>
-          <w:rStyle w:val="FootnoteReference"/>
-        </w:rPr>
-        <w:footnoteRef/>
-      </w:r>
-      <w:r>
-        <w:t xml:space="preserve"> </w:t>
-      </w:r>
-      <w:r>
-        <w:t>Exley, Christine L., Nils H. Lehr, and Stephen J. Terry. (2023)</w:t>
-      </w:r>
-      <w:r>
-        <w:t>.</w:t>
-      </w:r>
-    </w:p>
-  </w:footnote>
-  <w:footnote w:id="5">
-    <w:p>
-      <w:pPr>
-        <w:pStyle w:val="FootnoteText"/>
-      </w:pPr>
-      <w:r>
-        <w:rPr>
-          <w:rStyle w:val="FootnoteReference"/>
-        </w:rPr>
-        <w:footnoteRef/>
-      </w:r>
-      <w:r>
-        <w:t xml:space="preserve"> </w:t>
-      </w:r>
-      <w:r>
-        <w:t>Exley, Christine L., Nils H. Lehr, and Stephen J. Terry. (2023)</w:t>
-      </w:r>
-      <w:r>
-        <w:t>.</w:t>
-      </w:r>
-    </w:p>
-    <w:p>
-      <w:pPr>
-        <w:pStyle w:val="FootnoteText"/>
-      </w:pPr>
-    </w:p>
-  </w:footnote>
-  <w:footnote w:id="6">
-    <w:p>
-      <w:pPr>
-        <w:pStyle w:val="FootnoteText"/>
-      </w:pPr>
-      <w:r>
-        <w:rPr>
-          <w:rStyle w:val="FootnoteReference"/>
-        </w:rPr>
-        <w:footnoteRef/>
-      </w:r>
-      <w:r>
-        <w:t xml:space="preserve"> </w:t>
-      </w:r>
-      <w:r>
-        <w:t>Ecer, Sencer, Mark Magro, and Sinan Sarpça. "The relationship between nonprofits’ revenue composition and their economic-financial efficiency." Nonprofit and Voluntary Sector Quarterly 46, no. 1 (2017): 141-155.</w:t>
-      </w:r>
-    </w:p>
-  </w:footnote>
-  <w:footnote w:id="7">
-    <w:p>
-      <w:pPr>
-        <w:pStyle w:val="FootnoteText"/>
-      </w:pPr>
-      <w:r>
-        <w:rPr>
-          <w:rStyle w:val="FootnoteReference"/>
-        </w:rPr>
-        <w:footnoteRef/>
-      </w:r>
-      <w:r>
-        <w:t xml:space="preserve"> </w:t>
-      </w:r>
-      <w:r>
-        <w:t>Exley, Christine L., Nils H. Lehr, and Stephen J. Terry. "Nonprofits in good times and bad times." Journal of Political Economy Microeconomics 1, no. 1 (2023): 42-79.</w:t>
-      </w:r>
-    </w:p>
-  </w:footnote>
-  <w:footnote w:id="8">
-    <w:p>
-      <w:pPr>
-        <w:pStyle w:val="FootnoteText"/>
-      </w:pPr>
-      <w:r>
-        <w:rPr>
-          <w:rStyle w:val="FootnoteReference"/>
-        </w:rPr>
-        <w:footnoteRef/>
-      </w:r>
-      <w:r>
-        <w:t xml:space="preserve"> </w:t>
-      </w:r>
-      <w:r>
-        <w:t>Ecer, Sencer, Mark Magro, and Sinan Sarpça. "The relationship between nonprofits’ revenue composition and their economic-financial efficiency." Nonprofit and Voluntary Sector Quarterly 46, no. 1 (2017): 141-155.</w:t>
-      </w:r>
-    </w:p>
-  </w:footnote>
-  <w:footnote w:id="9">
-    <w:p>
-      <w:pPr>
-        <w:pStyle w:val="FootnoteText"/>
-      </w:pPr>
-      <w:r>
-        <w:rPr>
-          <w:rStyle w:val="FootnoteReference"/>
-        </w:rPr>
-        <w:footnoteRef/>
-      </w:r>
-      <w:r>
-        <w:t xml:space="preserve"> </w:t>
-      </w:r>
-      <w:r>
         <w:t xml:space="preserve">Irs.gov. “Automatic Revocation of Exemption | Internal Revenue Service,” 2017. </w:t>
       </w:r>
       <w:hyperlink r:id="rId1" w:history="1">
@@ -2661,6 +2640,174 @@
       <w:pPr>
         <w:pStyle w:val="FootnoteText"/>
       </w:pPr>
+    </w:p>
+  </w:footnote>
+  <w:footnote w:id="2">
+    <w:p>
+      <w:pPr>
+        <w:pStyle w:val="FootnoteText"/>
+      </w:pPr>
+      <w:r>
+        <w:rPr>
+          <w:rStyle w:val="FootnoteReference"/>
+        </w:rPr>
+        <w:footnoteRef/>
+      </w:r>
+      <w:r>
+        <w:t xml:space="preserve"> </w:t>
+      </w:r>
+      <w:r>
+        <w:t xml:space="preserve">Altamimi, Hala, and Qiaozhen Liu. "The nonprofit starvation cycle: Does overhead spending really impact program </w:t>
+      </w:r>
+      <w:proofErr w:type="gramStart"/>
+      <w:r>
+        <w:t>outcomes?.</w:t>
+      </w:r>
+      <w:proofErr w:type="gramEnd"/>
+      <w:r>
+        <w:t>" Nonprofit and Voluntary Sector Quarterly 51, no. 6 (2022): 1324-1348.</w:t>
+      </w:r>
+    </w:p>
+  </w:footnote>
+  <w:footnote w:id="3">
+    <w:p>
+      <w:pPr>
+        <w:pStyle w:val="FootnoteText"/>
+      </w:pPr>
+      <w:r>
+        <w:rPr>
+          <w:rStyle w:val="FootnoteReference"/>
+        </w:rPr>
+        <w:footnoteRef/>
+      </w:r>
+      <w:r>
+        <w:t xml:space="preserve"> Altamimi, Hala and Qiaozhen Liu (2022).</w:t>
+      </w:r>
+    </w:p>
+  </w:footnote>
+  <w:footnote w:id="4">
+    <w:p>
+      <w:pPr>
+        <w:pStyle w:val="FootnoteText"/>
+      </w:pPr>
+      <w:r>
+        <w:rPr>
+          <w:rStyle w:val="FootnoteReference"/>
+        </w:rPr>
+        <w:footnoteRef/>
+      </w:r>
+      <w:r>
+        <w:t xml:space="preserve"> </w:t>
+      </w:r>
+      <w:r>
+        <w:t>Exley, Christine L., Nils H. Lehr, and Stephen J. Terry. "Nonprofits in good times and bad times." Journal of Political Economy Microeconomics 1, no. 1 (2023): 42-79.</w:t>
+      </w:r>
+    </w:p>
+  </w:footnote>
+  <w:footnote w:id="5">
+    <w:p>
+      <w:pPr>
+        <w:pStyle w:val="FootnoteText"/>
+      </w:pPr>
+      <w:r>
+        <w:rPr>
+          <w:rStyle w:val="FootnoteReference"/>
+        </w:rPr>
+        <w:footnoteRef/>
+      </w:r>
+      <w:r>
+        <w:t xml:space="preserve"> </w:t>
+      </w:r>
+      <w:r>
+        <w:t>Exley, Christine L., Nils H. Lehr, and Stephen J. Terry. (2023)</w:t>
+      </w:r>
+      <w:r>
+        <w:t>.</w:t>
+      </w:r>
+    </w:p>
+  </w:footnote>
+  <w:footnote w:id="6">
+    <w:p>
+      <w:pPr>
+        <w:pStyle w:val="FootnoteText"/>
+      </w:pPr>
+      <w:r>
+        <w:rPr>
+          <w:rStyle w:val="FootnoteReference"/>
+        </w:rPr>
+        <w:footnoteRef/>
+      </w:r>
+      <w:r>
+        <w:t xml:space="preserve"> </w:t>
+      </w:r>
+      <w:r>
+        <w:t>Exley, Christine L., Nils H. Lehr, and Stephen J. Terry. (2023)</w:t>
+      </w:r>
+      <w:r>
+        <w:t>.</w:t>
+      </w:r>
+    </w:p>
+    <w:p>
+      <w:pPr>
+        <w:pStyle w:val="FootnoteText"/>
+      </w:pPr>
+    </w:p>
+  </w:footnote>
+  <w:footnote w:id="7">
+    <w:p>
+      <w:pPr>
+        <w:pStyle w:val="FootnoteText"/>
+      </w:pPr>
+      <w:r>
+        <w:rPr>
+          <w:rStyle w:val="FootnoteReference"/>
+        </w:rPr>
+        <w:footnoteRef/>
+      </w:r>
+      <w:r>
+        <w:t xml:space="preserve"> </w:t>
+      </w:r>
+      <w:r>
+        <w:t>Ecer, Sencer, Mark Magro, and Sinan Sarpça. "The relationship between nonprofits’ revenue composition and their economic-financial efficiency." Nonprofit and Voluntary Sector Quarterly 46, no. 1 (2017): 141-155.</w:t>
+      </w:r>
+    </w:p>
+  </w:footnote>
+  <w:footnote w:id="8">
+    <w:p>
+      <w:pPr>
+        <w:pStyle w:val="FootnoteText"/>
+      </w:pPr>
+      <w:r>
+        <w:rPr>
+          <w:rStyle w:val="FootnoteReference"/>
+        </w:rPr>
+        <w:footnoteRef/>
+      </w:r>
+      <w:r>
+        <w:t xml:space="preserve"> </w:t>
+      </w:r>
+      <w:r>
+        <w:t>Exley, Christine L., Nils H. Lehr, and Stephen J. Terry. "Nonprofits in good times and bad times." Journal of Political Economy Microeconomics 1, no. 1 (2023): 42-79.</w:t>
+      </w:r>
+    </w:p>
+  </w:footnote>
+  <w:footnote w:id="9">
+    <w:p>
+      <w:pPr>
+        <w:pStyle w:val="FootnoteText"/>
+      </w:pPr>
+      <w:r>
+        <w:rPr>
+          <w:rStyle w:val="FootnoteReference"/>
+        </w:rPr>
+        <w:footnoteRef/>
+      </w:r>
+      <w:r>
+        <w:t xml:space="preserve"> </w:t>
+      </w:r>
+      <w:r>
+        <w:t>Ecer, Sencer, Mark Magro, and Sinan Sarpça. "The relationship between nonprofits’ revenue composition and their economic-financial efficiency." Nonprofit and Voluntary Sector Quarterly 46, no. 1 (2017): 141-155.</w:t>
+      </w:r>
     </w:p>
   </w:footnote>
 </w:footnotes>

</xml_diff>

<commit_message>
refined table outputs for preliminary results
</commit_message>
<xml_diff>
--- a/Final Paper.docx
+++ b/Final Paper.docx
@@ -4,39 +4,66 @@
   <w:body>
     <w:p>
       <w:pPr>
+        <w:spacing w:after="160" w:line="278" w:lineRule="auto"/>
         <w:jc w:val="center"/>
+        <w:rPr>
+          <w:b/>
+          <w:bCs/>
+        </w:rPr>
       </w:pPr>
       <w:r>
+        <w:rPr>
+          <w:b/>
+          <w:bCs/>
+        </w:rPr>
         <w:t>Running a Non-Profit in a Recession: Analysis of countercyclical financial practices</w:t>
       </w:r>
     </w:p>
     <w:p>
       <w:pPr>
+        <w:spacing w:after="160" w:line="278" w:lineRule="auto"/>
         <w:jc w:val="center"/>
+        <w:rPr>
+          <w:b/>
+          <w:bCs/>
+        </w:rPr>
       </w:pPr>
       <w:r>
+        <w:rPr>
+          <w:b/>
+          <w:bCs/>
+        </w:rPr>
         <w:t>Jonathan Tamen</w:t>
       </w:r>
     </w:p>
     <w:p>
       <w:pPr>
+        <w:spacing w:after="160" w:line="278" w:lineRule="auto"/>
         <w:jc w:val="center"/>
+        <w:rPr>
+          <w:b/>
+          <w:bCs/>
+        </w:rPr>
       </w:pPr>
       <w:r>
+        <w:rPr>
+          <w:b/>
+          <w:bCs/>
+        </w:rPr>
         <w:t>Clark University Economics Honors Thesis</w:t>
       </w:r>
     </w:p>
     <w:p>
       <w:pPr>
+        <w:spacing w:after="160" w:line="278" w:lineRule="auto"/>
         <w:jc w:val="center"/>
       </w:pPr>
       <w:r>
+        <w:rPr>
+          <w:b/>
+          <w:bCs/>
+        </w:rPr>
         <w:t>2025-2026</w:t>
-      </w:r>
-    </w:p>
-    <w:p>
-      <w:r>
-        <w:br w:type="page"/>
       </w:r>
     </w:p>
     <w:sdt>
@@ -69,6 +96,29 @@
           </w:pPr>
           <w:r>
             <w:t>Table of Contents</w:t>
+          </w:r>
+          <w:r>
+            <w:rPr>
+              <w:rFonts w:asciiTheme="minorHAnsi" w:hAnsiTheme="minorHAnsi"/>
+              <w:b w:val="0"/>
+              <w:bCs w:val="0"/>
+              <w:i/>
+              <w:iCs/>
+            </w:rPr>
+            <w:fldChar w:fldCharType="begin"/>
+          </w:r>
+          <w:r>
+            <w:instrText xml:space="preserve"> TOC \o "1-3" \h \z \u </w:instrText>
+          </w:r>
+          <w:r>
+            <w:rPr>
+              <w:rFonts w:asciiTheme="minorHAnsi" w:hAnsiTheme="minorHAnsi"/>
+              <w:b w:val="0"/>
+              <w:bCs w:val="0"/>
+              <w:i/>
+              <w:iCs/>
+            </w:rPr>
+            <w:fldChar w:fldCharType="separate"/>
           </w:r>
         </w:p>
         <w:p>
@@ -87,24 +137,7 @@
               <w:color w:val="auto"/>
             </w:rPr>
           </w:pPr>
-          <w:r>
-            <w:rPr>
-              <w:b w:val="0"/>
-              <w:bCs w:val="0"/>
-            </w:rPr>
-            <w:fldChar w:fldCharType="begin"/>
-          </w:r>
-          <w:r>
-            <w:instrText xml:space="preserve"> TOC \o "1-3" \h \z \u </w:instrText>
-          </w:r>
-          <w:r>
-            <w:rPr>
-              <w:b w:val="0"/>
-              <w:bCs w:val="0"/>
-            </w:rPr>
-            <w:fldChar w:fldCharType="separate"/>
-          </w:r>
-          <w:hyperlink w:anchor="_Toc223509208" w:history="1">
+          <w:hyperlink w:anchor="_Toc224065631" w:history="1">
             <w:r>
               <w:rPr>
                 <w:rStyle w:val="Hyperlink"/>
@@ -131,7 +164,7 @@
                 <w:noProof/>
                 <w:webHidden/>
               </w:rPr>
-              <w:instrText xml:space="preserve"> PAGEREF _Toc223509208 \h </w:instrText>
+              <w:instrText xml:space="preserve"> PAGEREF _Toc224065631 \h </w:instrText>
             </w:r>
             <w:r>
               <w:rPr>
@@ -178,7 +211,7 @@
               <w:color w:val="auto"/>
             </w:rPr>
           </w:pPr>
-          <w:hyperlink w:anchor="_Toc223509209" w:history="1">
+          <w:hyperlink w:anchor="_Toc224065632" w:history="1">
             <w:r>
               <w:rPr>
                 <w:rStyle w:val="Hyperlink"/>
@@ -205,7 +238,7 @@
                 <w:noProof/>
                 <w:webHidden/>
               </w:rPr>
-              <w:instrText xml:space="preserve"> PAGEREF _Toc223509209 \h </w:instrText>
+              <w:instrText xml:space="preserve"> PAGEREF _Toc224065632 \h </w:instrText>
             </w:r>
             <w:r>
               <w:rPr>
@@ -252,13 +285,13 @@
               <w:color w:val="auto"/>
             </w:rPr>
           </w:pPr>
-          <w:hyperlink w:anchor="_Toc223509210" w:history="1">
+          <w:hyperlink w:anchor="_Toc224065633" w:history="1">
             <w:r>
               <w:rPr>
                 <w:rStyle w:val="Hyperlink"/>
                 <w:noProof/>
               </w:rPr>
-              <w:t>Data Analysis and Measurement</w:t>
+              <w:t>Data Measurement and Analysis</w:t>
             </w:r>
             <w:r>
               <w:rPr>
@@ -279,7 +312,7 @@
                 <w:noProof/>
                 <w:webHidden/>
               </w:rPr>
-              <w:instrText xml:space="preserve"> PAGEREF _Toc223509210 \h </w:instrText>
+              <w:instrText xml:space="preserve"> PAGEREF _Toc224065633 \h </w:instrText>
             </w:r>
             <w:r>
               <w:rPr>
@@ -326,7 +359,7 @@
               <w:szCs w:val="24"/>
             </w:rPr>
           </w:pPr>
-          <w:hyperlink w:anchor="_Toc223509211" w:history="1">
+          <w:hyperlink w:anchor="_Toc224065634" w:history="1">
             <w:r>
               <w:rPr>
                 <w:rStyle w:val="Hyperlink"/>
@@ -353,7 +386,7 @@
                 <w:noProof/>
                 <w:webHidden/>
               </w:rPr>
-              <w:instrText xml:space="preserve"> PAGEREF _Toc223509211 \h </w:instrText>
+              <w:instrText xml:space="preserve"> PAGEREF _Toc224065634 \h </w:instrText>
             </w:r>
             <w:r>
               <w:rPr>
@@ -373,7 +406,7 @@
                 <w:noProof/>
                 <w:webHidden/>
               </w:rPr>
-              <w:t>6</w:t>
+              <w:t>8</w:t>
             </w:r>
             <w:r>
               <w:rPr>
@@ -400,7 +433,7 @@
               <w:szCs w:val="24"/>
             </w:rPr>
           </w:pPr>
-          <w:hyperlink w:anchor="_Toc223509212" w:history="1">
+          <w:hyperlink w:anchor="_Toc224065635" w:history="1">
             <w:r>
               <w:rPr>
                 <w:rStyle w:val="Hyperlink"/>
@@ -427,7 +460,7 @@
                 <w:noProof/>
                 <w:webHidden/>
               </w:rPr>
-              <w:instrText xml:space="preserve"> PAGEREF _Toc223509212 \h </w:instrText>
+              <w:instrText xml:space="preserve"> PAGEREF _Toc224065635 \h </w:instrText>
             </w:r>
             <w:r>
               <w:rPr>
@@ -447,7 +480,7 @@
                 <w:noProof/>
                 <w:webHidden/>
               </w:rPr>
-              <w:t>8</w:t>
+              <w:t>9</w:t>
             </w:r>
             <w:r>
               <w:rPr>
@@ -474,7 +507,7 @@
               <w:color w:val="auto"/>
             </w:rPr>
           </w:pPr>
-          <w:hyperlink w:anchor="_Toc223509213" w:history="1">
+          <w:hyperlink w:anchor="_Toc224065636" w:history="1">
             <w:r>
               <w:rPr>
                 <w:rStyle w:val="Hyperlink"/>
@@ -501,7 +534,7 @@
                 <w:noProof/>
                 <w:webHidden/>
               </w:rPr>
-              <w:instrText xml:space="preserve"> PAGEREF _Toc223509213 \h </w:instrText>
+              <w:instrText xml:space="preserve"> PAGEREF _Toc224065636 \h </w:instrText>
             </w:r>
             <w:r>
               <w:rPr>
@@ -521,7 +554,7 @@
                 <w:noProof/>
                 <w:webHidden/>
               </w:rPr>
-              <w:t>9</w:t>
+              <w:t>15</w:t>
             </w:r>
             <w:r>
               <w:rPr>
@@ -548,7 +581,7 @@
               <w:szCs w:val="24"/>
             </w:rPr>
           </w:pPr>
-          <w:hyperlink w:anchor="_Toc223509214" w:history="1">
+          <w:hyperlink w:anchor="_Toc224065637" w:history="1">
             <w:r>
               <w:rPr>
                 <w:rStyle w:val="Hyperlink"/>
@@ -575,7 +608,7 @@
                 <w:noProof/>
                 <w:webHidden/>
               </w:rPr>
-              <w:instrText xml:space="preserve"> PAGEREF _Toc223509214 \h </w:instrText>
+              <w:instrText xml:space="preserve"> PAGEREF _Toc224065637 \h </w:instrText>
             </w:r>
             <w:r>
               <w:rPr>
@@ -595,7 +628,7 @@
                 <w:noProof/>
                 <w:webHidden/>
               </w:rPr>
-              <w:t>9</w:t>
+              <w:t>15</w:t>
             </w:r>
             <w:r>
               <w:rPr>
@@ -622,7 +655,7 @@
               <w:szCs w:val="24"/>
             </w:rPr>
           </w:pPr>
-          <w:hyperlink w:anchor="_Toc223509215" w:history="1">
+          <w:hyperlink w:anchor="_Toc224065638" w:history="1">
             <w:r>
               <w:rPr>
                 <w:rStyle w:val="Hyperlink"/>
@@ -649,7 +682,7 @@
                 <w:noProof/>
                 <w:webHidden/>
               </w:rPr>
-              <w:instrText xml:space="preserve"> PAGEREF _Toc223509215 \h </w:instrText>
+              <w:instrText xml:space="preserve"> PAGEREF _Toc224065638 \h </w:instrText>
             </w:r>
             <w:r>
               <w:rPr>
@@ -669,7 +702,7 @@
                 <w:noProof/>
                 <w:webHidden/>
               </w:rPr>
-              <w:t>9</w:t>
+              <w:t>15</w:t>
             </w:r>
             <w:r>
               <w:rPr>
@@ -696,7 +729,7 @@
               <w:szCs w:val="24"/>
             </w:rPr>
           </w:pPr>
-          <w:hyperlink w:anchor="_Toc223509216" w:history="1">
+          <w:hyperlink w:anchor="_Toc224065639" w:history="1">
             <w:r>
               <w:rPr>
                 <w:rStyle w:val="Hyperlink"/>
@@ -723,7 +756,7 @@
                 <w:noProof/>
                 <w:webHidden/>
               </w:rPr>
-              <w:instrText xml:space="preserve"> PAGEREF _Toc223509216 \h </w:instrText>
+              <w:instrText xml:space="preserve"> PAGEREF _Toc224065639 \h </w:instrText>
             </w:r>
             <w:r>
               <w:rPr>
@@ -743,7 +776,7 @@
                 <w:noProof/>
                 <w:webHidden/>
               </w:rPr>
-              <w:t>10</w:t>
+              <w:t>16</w:t>
             </w:r>
             <w:r>
               <w:rPr>
@@ -768,14 +801,13 @@
               <w:szCs w:val="24"/>
             </w:rPr>
           </w:pPr>
-          <w:hyperlink w:anchor="_Toc223509217" w:history="1">
+          <w:hyperlink w:anchor="_Toc224065640" w:history="1">
             <w:r>
               <w:rPr>
                 <w:rStyle w:val="Hyperlink"/>
-                <w:rFonts w:eastAsiaTheme="majorEastAsia"/>
                 <w:noProof/>
               </w:rPr>
-              <w:t>Model 2</w:t>
+              <w:t>Model 1</w:t>
             </w:r>
             <w:r>
               <w:rPr>
@@ -796,7 +828,7 @@
                 <w:noProof/>
                 <w:webHidden/>
               </w:rPr>
-              <w:instrText xml:space="preserve"> PAGEREF _Toc223509217 \h </w:instrText>
+              <w:instrText xml:space="preserve"> PAGEREF _Toc224065640 \h </w:instrText>
             </w:r>
             <w:r>
               <w:rPr>
@@ -816,7 +848,7 @@
                 <w:noProof/>
                 <w:webHidden/>
               </w:rPr>
-              <w:t>10</w:t>
+              <w:t>16</w:t>
             </w:r>
             <w:r>
               <w:rPr>
@@ -841,14 +873,13 @@
               <w:szCs w:val="24"/>
             </w:rPr>
           </w:pPr>
-          <w:hyperlink w:anchor="_Toc223509218" w:history="1">
+          <w:hyperlink w:anchor="_Toc224065641" w:history="1">
             <w:r>
               <w:rPr>
                 <w:rStyle w:val="Hyperlink"/>
-                <w:rFonts w:eastAsiaTheme="majorEastAsia" w:cstheme="majorBidi"/>
                 <w:noProof/>
               </w:rPr>
-              <w:t>Model 3</w:t>
+              <w:t>Model 2</w:t>
             </w:r>
             <w:r>
               <w:rPr>
@@ -869,7 +900,7 @@
                 <w:noProof/>
                 <w:webHidden/>
               </w:rPr>
-              <w:instrText xml:space="preserve"> PAGEREF _Toc223509218 \h </w:instrText>
+              <w:instrText xml:space="preserve"> PAGEREF _Toc224065641 \h </w:instrText>
             </w:r>
             <w:r>
               <w:rPr>
@@ -889,7 +920,7 @@
                 <w:noProof/>
                 <w:webHidden/>
               </w:rPr>
-              <w:t>10</w:t>
+              <w:t>16</w:t>
             </w:r>
             <w:r>
               <w:rPr>
@@ -914,14 +945,230 @@
               <w:szCs w:val="24"/>
             </w:rPr>
           </w:pPr>
-          <w:hyperlink w:anchor="_Toc223509219" w:history="1">
+          <w:hyperlink w:anchor="_Toc224065642" w:history="1">
+            <w:r>
+              <w:rPr>
+                <w:rStyle w:val="Hyperlink"/>
+                <w:noProof/>
+              </w:rPr>
+              <w:t>Model 3</w:t>
+            </w:r>
+            <w:r>
+              <w:rPr>
+                <w:noProof/>
+                <w:webHidden/>
+              </w:rPr>
+              <w:tab/>
+            </w:r>
+            <w:r>
+              <w:rPr>
+                <w:noProof/>
+                <w:webHidden/>
+              </w:rPr>
+              <w:fldChar w:fldCharType="begin"/>
+            </w:r>
+            <w:r>
+              <w:rPr>
+                <w:noProof/>
+                <w:webHidden/>
+              </w:rPr>
+              <w:instrText xml:space="preserve"> PAGEREF _Toc224065642 \h </w:instrText>
+            </w:r>
+            <w:r>
+              <w:rPr>
+                <w:noProof/>
+                <w:webHidden/>
+              </w:rPr>
+            </w:r>
+            <w:r>
+              <w:rPr>
+                <w:noProof/>
+                <w:webHidden/>
+              </w:rPr>
+              <w:fldChar w:fldCharType="separate"/>
+            </w:r>
+            <w:r>
+              <w:rPr>
+                <w:noProof/>
+                <w:webHidden/>
+              </w:rPr>
+              <w:t>17</w:t>
+            </w:r>
+            <w:r>
+              <w:rPr>
+                <w:noProof/>
+                <w:webHidden/>
+              </w:rPr>
+              <w:fldChar w:fldCharType="end"/>
+            </w:r>
+          </w:hyperlink>
+        </w:p>
+        <w:p>
+          <w:pPr>
+            <w:pStyle w:val="TOC3"/>
+            <w:tabs>
+              <w:tab w:val="right" w:leader="dot" w:pos="9350"/>
+            </w:tabs>
+            <w:rPr>
+              <w:rFonts w:eastAsiaTheme="minorEastAsia" w:cstheme="minorBidi"/>
+              <w:noProof/>
+              <w:color w:val="auto"/>
+              <w:sz w:val="24"/>
+              <w:szCs w:val="24"/>
+            </w:rPr>
+          </w:pPr>
+          <w:hyperlink w:anchor="_Toc224065643" w:history="1">
+            <w:r>
+              <w:rPr>
+                <w:rStyle w:val="Hyperlink"/>
+                <w:noProof/>
+              </w:rPr>
+              <w:t>Model 4</w:t>
+            </w:r>
+            <w:r>
+              <w:rPr>
+                <w:noProof/>
+                <w:webHidden/>
+              </w:rPr>
+              <w:tab/>
+            </w:r>
+            <w:r>
+              <w:rPr>
+                <w:noProof/>
+                <w:webHidden/>
+              </w:rPr>
+              <w:fldChar w:fldCharType="begin"/>
+            </w:r>
+            <w:r>
+              <w:rPr>
+                <w:noProof/>
+                <w:webHidden/>
+              </w:rPr>
+              <w:instrText xml:space="preserve"> PAGEREF _Toc224065643 \h </w:instrText>
+            </w:r>
+            <w:r>
+              <w:rPr>
+                <w:noProof/>
+                <w:webHidden/>
+              </w:rPr>
+            </w:r>
+            <w:r>
+              <w:rPr>
+                <w:noProof/>
+                <w:webHidden/>
+              </w:rPr>
+              <w:fldChar w:fldCharType="separate"/>
+            </w:r>
+            <w:r>
+              <w:rPr>
+                <w:noProof/>
+                <w:webHidden/>
+              </w:rPr>
+              <w:t>17</w:t>
+            </w:r>
+            <w:r>
+              <w:rPr>
+                <w:noProof/>
+                <w:webHidden/>
+              </w:rPr>
+              <w:fldChar w:fldCharType="end"/>
+            </w:r>
+          </w:hyperlink>
+        </w:p>
+        <w:p>
+          <w:pPr>
+            <w:pStyle w:val="TOC3"/>
+            <w:tabs>
+              <w:tab w:val="right" w:leader="dot" w:pos="9350"/>
+            </w:tabs>
+            <w:rPr>
+              <w:rFonts w:eastAsiaTheme="minorEastAsia" w:cstheme="minorBidi"/>
+              <w:noProof/>
+              <w:color w:val="auto"/>
+              <w:sz w:val="24"/>
+              <w:szCs w:val="24"/>
+            </w:rPr>
+          </w:pPr>
+          <w:hyperlink w:anchor="_Toc224065644" w:history="1">
+            <w:r>
+              <w:rPr>
+                <w:rStyle w:val="Hyperlink"/>
+                <w:noProof/>
+              </w:rPr>
+              <w:t>Model 5</w:t>
+            </w:r>
+            <w:r>
+              <w:rPr>
+                <w:noProof/>
+                <w:webHidden/>
+              </w:rPr>
+              <w:tab/>
+            </w:r>
+            <w:r>
+              <w:rPr>
+                <w:noProof/>
+                <w:webHidden/>
+              </w:rPr>
+              <w:fldChar w:fldCharType="begin"/>
+            </w:r>
+            <w:r>
+              <w:rPr>
+                <w:noProof/>
+                <w:webHidden/>
+              </w:rPr>
+              <w:instrText xml:space="preserve"> PAGEREF _Toc224065644 \h </w:instrText>
+            </w:r>
+            <w:r>
+              <w:rPr>
+                <w:noProof/>
+                <w:webHidden/>
+              </w:rPr>
+            </w:r>
+            <w:r>
+              <w:rPr>
+                <w:noProof/>
+                <w:webHidden/>
+              </w:rPr>
+              <w:fldChar w:fldCharType="separate"/>
+            </w:r>
+            <w:r>
+              <w:rPr>
+                <w:noProof/>
+                <w:webHidden/>
+              </w:rPr>
+              <w:t>17</w:t>
+            </w:r>
+            <w:r>
+              <w:rPr>
+                <w:noProof/>
+                <w:webHidden/>
+              </w:rPr>
+              <w:fldChar w:fldCharType="end"/>
+            </w:r>
+          </w:hyperlink>
+        </w:p>
+        <w:p>
+          <w:pPr>
+            <w:pStyle w:val="TOC3"/>
+            <w:tabs>
+              <w:tab w:val="right" w:leader="dot" w:pos="9350"/>
+            </w:tabs>
+            <w:rPr>
+              <w:rFonts w:eastAsiaTheme="minorEastAsia" w:cstheme="minorBidi"/>
+              <w:noProof/>
+              <w:color w:val="auto"/>
+              <w:sz w:val="24"/>
+              <w:szCs w:val="24"/>
+            </w:rPr>
+          </w:pPr>
+          <w:hyperlink w:anchor="_Toc224065645" w:history="1">
             <w:r>
               <w:rPr>
                 <w:rStyle w:val="Hyperlink"/>
                 <w:rFonts w:eastAsiaTheme="majorEastAsia" w:cstheme="majorBidi"/>
                 <w:noProof/>
               </w:rPr>
-              <w:t>Model 4</w:t>
+              <w:t>Model 6</w:t>
             </w:r>
             <w:r>
               <w:rPr>
@@ -942,7 +1189,7 @@
                 <w:noProof/>
                 <w:webHidden/>
               </w:rPr>
-              <w:instrText xml:space="preserve"> PAGEREF _Toc223509219 \h </w:instrText>
+              <w:instrText xml:space="preserve"> PAGEREF _Toc224065645 \h </w:instrText>
             </w:r>
             <w:r>
               <w:rPr>
@@ -962,7 +1209,7 @@
                 <w:noProof/>
                 <w:webHidden/>
               </w:rPr>
-              <w:t>10</w:t>
+              <w:t>17</w:t>
             </w:r>
             <w:r>
               <w:rPr>
@@ -989,7 +1236,7 @@
               <w:color w:val="auto"/>
             </w:rPr>
           </w:pPr>
-          <w:hyperlink w:anchor="_Toc223509220" w:history="1">
+          <w:hyperlink w:anchor="_Toc224065646" w:history="1">
             <w:r>
               <w:rPr>
                 <w:rStyle w:val="Hyperlink"/>
@@ -1016,7 +1263,7 @@
                 <w:noProof/>
                 <w:webHidden/>
               </w:rPr>
-              <w:instrText xml:space="preserve"> PAGEREF _Toc223509220 \h </w:instrText>
+              <w:instrText xml:space="preserve"> PAGEREF _Toc224065646 \h </w:instrText>
             </w:r>
             <w:r>
               <w:rPr>
@@ -1036,7 +1283,7 @@
                 <w:noProof/>
                 <w:webHidden/>
               </w:rPr>
-              <w:t>11</w:t>
+              <w:t>19</w:t>
             </w:r>
             <w:r>
               <w:rPr>
@@ -1063,7 +1310,7 @@
               <w:color w:val="auto"/>
             </w:rPr>
           </w:pPr>
-          <w:hyperlink w:anchor="_Toc223509221" w:history="1">
+          <w:hyperlink w:anchor="_Toc224065647" w:history="1">
             <w:r>
               <w:rPr>
                 <w:rStyle w:val="Hyperlink"/>
@@ -1090,7 +1337,7 @@
                 <w:noProof/>
                 <w:webHidden/>
               </w:rPr>
-              <w:instrText xml:space="preserve"> PAGEREF _Toc223509221 \h </w:instrText>
+              <w:instrText xml:space="preserve"> PAGEREF _Toc224065647 \h </w:instrText>
             </w:r>
             <w:r>
               <w:rPr>
@@ -1110,7 +1357,7 @@
                 <w:noProof/>
                 <w:webHidden/>
               </w:rPr>
-              <w:t>13</w:t>
+              <w:t>20</w:t>
             </w:r>
             <w:r>
               <w:rPr>
@@ -1137,7 +1384,7 @@
               <w:color w:val="auto"/>
             </w:rPr>
           </w:pPr>
-          <w:hyperlink w:anchor="_Toc223509222" w:history="1">
+          <w:hyperlink w:anchor="_Toc224065648" w:history="1">
             <w:r>
               <w:rPr>
                 <w:rStyle w:val="Hyperlink"/>
@@ -1164,7 +1411,7 @@
                 <w:noProof/>
                 <w:webHidden/>
               </w:rPr>
-              <w:instrText xml:space="preserve"> PAGEREF _Toc223509222 \h </w:instrText>
+              <w:instrText xml:space="preserve"> PAGEREF _Toc224065648 \h </w:instrText>
             </w:r>
             <w:r>
               <w:rPr>
@@ -1184,7 +1431,7 @@
                 <w:noProof/>
                 <w:webHidden/>
               </w:rPr>
-              <w:t>14</w:t>
+              <w:t>21</w:t>
             </w:r>
             <w:r>
               <w:rPr>
@@ -1211,7 +1458,7 @@
               <w:color w:val="auto"/>
             </w:rPr>
           </w:pPr>
-          <w:hyperlink w:anchor="_Toc223509223" w:history="1">
+          <w:hyperlink w:anchor="_Toc224065649" w:history="1">
             <w:r>
               <w:rPr>
                 <w:rStyle w:val="Hyperlink"/>
@@ -1238,7 +1485,7 @@
                 <w:noProof/>
                 <w:webHidden/>
               </w:rPr>
-              <w:instrText xml:space="preserve"> PAGEREF _Toc223509223 \h </w:instrText>
+              <w:instrText xml:space="preserve"> PAGEREF _Toc224065649 \h </w:instrText>
             </w:r>
             <w:r>
               <w:rPr>
@@ -1258,7 +1505,7 @@
                 <w:noProof/>
                 <w:webHidden/>
               </w:rPr>
-              <w:t>15</w:t>
+              <w:t>22</w:t>
             </w:r>
             <w:r>
               <w:rPr>
@@ -1299,21 +1546,20 @@
       <w:pPr>
         <w:pStyle w:val="Heading1"/>
       </w:pPr>
-      <w:bookmarkStart w:id="0" w:name="_Toc223509208"/>
+      <w:bookmarkStart w:id="0" w:name="_Toc224065631"/>
       <w:commentRangeStart w:id="1"/>
       <w:commentRangeStart w:id="2"/>
       <w:r>
         <w:lastRenderedPageBreak/>
         <w:t>Introduction</w:t>
       </w:r>
+      <w:bookmarkEnd w:id="0"/>
       <w:commentRangeEnd w:id="1"/>
       <w:r>
         <w:rPr>
           <w:rStyle w:val="CommentReference"/>
-          <w:rFonts w:ascii="Times New Roman" w:eastAsia="Times New Roman" w:hAnsi="Times New Roman" w:cs="Times New Roman"/>
-          <w:color w:val="000000"/>
-          <w:kern w:val="0"/>
-          <w14:ligatures w14:val="none"/>
+          <w:sz w:val="40"/>
+          <w:szCs w:val="40"/>
         </w:rPr>
         <w:commentReference w:id="1"/>
       </w:r>
@@ -1321,14 +1567,11 @@
       <w:r>
         <w:rPr>
           <w:rStyle w:val="CommentReference"/>
-          <w:rFonts w:ascii="Times New Roman" w:eastAsia="Times New Roman" w:hAnsi="Times New Roman" w:cs="Times New Roman"/>
-          <w:color w:val="000000"/>
-          <w:kern w:val="0"/>
-          <w14:ligatures w14:val="none"/>
+          <w:sz w:val="40"/>
+          <w:szCs w:val="40"/>
         </w:rPr>
         <w:commentReference w:id="2"/>
       </w:r>
-      <w:bookmarkEnd w:id="0"/>
       <w:r>
         <w:br w:type="page"/>
       </w:r>
@@ -1337,7 +1580,7 @@
       <w:pPr>
         <w:pStyle w:val="Heading1"/>
       </w:pPr>
-      <w:bookmarkStart w:id="3" w:name="_Toc223509209"/>
+      <w:bookmarkStart w:id="3" w:name="_Toc224065632"/>
       <w:r>
         <w:lastRenderedPageBreak/>
         <w:t>Literature Review</w:t>
@@ -1613,31 +1856,27 @@
         <w:br w:type="page"/>
       </w:r>
     </w:p>
-    <w:p/>
     <w:p>
       <w:pPr>
         <w:pStyle w:val="Heading1"/>
       </w:pPr>
-      <w:bookmarkStart w:id="4" w:name="_Toc223509210"/>
+      <w:bookmarkStart w:id="4" w:name="_Toc224065633"/>
       <w:commentRangeStart w:id="5"/>
       <w:commentRangeStart w:id="6"/>
       <w:r>
+        <w:lastRenderedPageBreak/>
         <w:t xml:space="preserve">Data </w:t>
       </w:r>
       <w:r>
         <w:t xml:space="preserve">Measurement and </w:t>
       </w:r>
-      <w:r>
-        <w:t>Analysis</w:t>
-      </w:r>
+      <w:bookmarkEnd w:id="4"/>
       <w:commentRangeEnd w:id="5"/>
       <w:r>
         <w:rPr>
           <w:rStyle w:val="CommentReference"/>
-          <w:rFonts w:ascii="Times New Roman" w:eastAsia="Times New Roman" w:hAnsi="Times New Roman" w:cs="Times New Roman"/>
-          <w:color w:val="000000"/>
-          <w:kern w:val="0"/>
-          <w14:ligatures w14:val="none"/>
+          <w:sz w:val="40"/>
+          <w:szCs w:val="40"/>
         </w:rPr>
         <w:commentReference w:id="5"/>
       </w:r>
@@ -1645,14 +1884,14 @@
       <w:r>
         <w:rPr>
           <w:rStyle w:val="CommentReference"/>
-          <w:rFonts w:ascii="Times New Roman" w:eastAsia="Times New Roman" w:hAnsi="Times New Roman" w:cs="Times New Roman"/>
-          <w:color w:val="000000"/>
-          <w:kern w:val="0"/>
-          <w14:ligatures w14:val="none"/>
+          <w:sz w:val="40"/>
+          <w:szCs w:val="40"/>
         </w:rPr>
         <w:commentReference w:id="6"/>
       </w:r>
-      <w:bookmarkEnd w:id="4"/>
+      <w:r>
+        <w:t>Exploration</w:t>
+      </w:r>
     </w:p>
     <w:p>
       <w:pPr>
@@ -1755,7 +1994,13 @@
         <w:t>data</w:t>
       </w:r>
       <w:r>
-        <w:t xml:space="preserve">set below. </w:t>
+        <w:t xml:space="preserve">set </w:t>
+      </w:r>
+      <w:r>
+        <w:t xml:space="preserve">in the subheading </w:t>
+      </w:r>
+      <w:r>
+        <w:t xml:space="preserve">below. </w:t>
       </w:r>
     </w:p>
     <w:p>
@@ -1763,7 +2008,282 @@
         <w:ind w:firstLine="720"/>
       </w:pPr>
       <w:r>
-        <w:t xml:space="preserve">To supplement this dataset, </w:t>
+        <w:t xml:space="preserve">Digitally summarized copies of </w:t>
+      </w:r>
+      <w:r>
+        <w:t xml:space="preserve">yearly </w:t>
+      </w:r>
+      <w:r>
+        <w:t xml:space="preserve">Form-990s are published </w:t>
+      </w:r>
+      <w:r>
+        <w:t xml:space="preserve">online </w:t>
+      </w:r>
+      <w:r>
+        <w:t xml:space="preserve">by the </w:t>
+      </w:r>
+      <w:r>
+        <w:t xml:space="preserve">Internal Revenue Services (IRS) as </w:t>
+      </w:r>
+      <w:r>
+        <w:t>.</w:t>
+      </w:r>
+      <w:r>
+        <w:t>XML file formats.</w:t>
+      </w:r>
+      <w:r>
+        <w:rPr>
+          <w:rStyle w:val="FootnoteReference"/>
+        </w:rPr>
+        <w:footnoteReference w:id="5"/>
+      </w:r>
+      <w:r>
+        <w:t xml:space="preserve"> </w:t>
+      </w:r>
+      <w:r>
+        <w:t xml:space="preserve">The </w:t>
+      </w:r>
+      <w:r>
+        <w:t>National Center for Charitable Statistics</w:t>
+      </w:r>
+      <w:r>
+        <w:t xml:space="preserve"> </w:t>
+      </w:r>
+      <w:r>
+        <w:t>(NCCS)</w:t>
+      </w:r>
+      <w:r>
+        <w:t>,</w:t>
+      </w:r>
+      <w:r>
+        <w:t xml:space="preserve"> a</w:t>
+      </w:r>
+      <w:r>
+        <w:t xml:space="preserve"> </w:t>
+      </w:r>
+      <w:r>
+        <w:t>part of the non-profit and philanthropy research department of the Urban Institute,</w:t>
+      </w:r>
+      <w:r>
+        <w:t xml:space="preserve"> </w:t>
+      </w:r>
+      <w:r>
+        <w:t xml:space="preserve">converts this raw data </w:t>
+      </w:r>
+      <w:r>
+        <w:t>into data tables</w:t>
+      </w:r>
+      <w:r>
+        <w:t xml:space="preserve"> organized by year and </w:t>
+      </w:r>
+      <w:r>
+        <w:t>header sections of the Form 990 document.</w:t>
+      </w:r>
+      <w:r>
+        <w:rPr>
+          <w:rStyle w:val="FootnoteReference"/>
+        </w:rPr>
+        <w:footnoteReference w:id="6"/>
+      </w:r>
+      <w:r>
+        <w:t xml:space="preserve"> </w:t>
+      </w:r>
+      <w:r>
+        <w:t xml:space="preserve">I compiled this collection </w:t>
+      </w:r>
+      <w:r>
+        <w:t xml:space="preserve">from the NCCS </w:t>
+      </w:r>
+      <w:r>
+        <w:t xml:space="preserve">of </w:t>
+      </w:r>
+      <w:r>
+        <w:t>.</w:t>
+      </w:r>
+      <w:r>
+        <w:t xml:space="preserve">CSV files into </w:t>
+      </w:r>
+      <w:r>
+        <w:t>a</w:t>
+      </w:r>
+      <w:r>
+        <w:t xml:space="preserve"> raw dataset</w:t>
+      </w:r>
+      <w:r>
+        <w:t xml:space="preserve">, then added supplemental data, then imposed necessary restrictions. </w:t>
+      </w:r>
+      <w:r>
+        <w:t xml:space="preserve"> </w:t>
+      </w:r>
+    </w:p>
+    <w:p>
+      <w:pPr>
+        <w:ind w:firstLine="720"/>
+      </w:pPr>
+      <w:r>
+        <w:t>Th</w:t>
+      </w:r>
+      <w:r>
+        <w:t xml:space="preserve">is preliminary dataset of Form 990 data </w:t>
+      </w:r>
+      <w:r>
+        <w:t xml:space="preserve">is in Panel form. </w:t>
+      </w:r>
+      <w:r>
+        <w:t xml:space="preserve">Each organization </w:t>
+      </w:r>
+      <w:r>
+        <w:t xml:space="preserve">fulfilling the </w:t>
+      </w:r>
+      <w:r>
+        <w:t xml:space="preserve">IRS’s requirements for filing is </w:t>
+      </w:r>
+      <w:r>
+        <w:t xml:space="preserve">observed in at least multiple years of </w:t>
+      </w:r>
+      <w:r>
+        <w:t>data.</w:t>
+      </w:r>
+      <w:r>
+        <w:t xml:space="preserve"> </w:t>
+      </w:r>
+      <w:r>
+        <w:t xml:space="preserve">Each organization is only observed once per year; however, not all the same </w:t>
+      </w:r>
+      <w:r>
+        <w:t>entities</w:t>
+      </w:r>
+      <w:r>
+        <w:t xml:space="preserve"> are included in each year.</w:t>
+      </w:r>
+      <w:r>
+        <w:t xml:space="preserve"> </w:t>
+      </w:r>
+      <w:r>
+        <w:t xml:space="preserve">This makes the panel data unbalanced. </w:t>
+      </w:r>
+      <w:r>
+        <w:t xml:space="preserve">Specifically, </w:t>
+      </w:r>
+      <w:r>
+        <w:t xml:space="preserve">the data reports raw variables for </w:t>
+      </w:r>
+      <w:r>
+        <w:t xml:space="preserve">revenues, expenses, </w:t>
+      </w:r>
+      <w:r>
+        <w:t xml:space="preserve">activities, and governance of each organization. This includes granular </w:t>
+      </w:r>
+      <w:r>
+        <w:t>financial data</w:t>
+      </w:r>
+      <w:r>
+        <w:t xml:space="preserve"> </w:t>
+      </w:r>
+      <w:r>
+        <w:lastRenderedPageBreak/>
+        <w:t xml:space="preserve">for the entire scope of operations </w:t>
+      </w:r>
+      <w:r>
+        <w:t>(</w:t>
+      </w:r>
+      <w:r>
+        <w:t>i.e.,</w:t>
+      </w:r>
+      <w:r>
+        <w:t xml:space="preserve"> </w:t>
+      </w:r>
+      <w:r>
+        <w:t>“</w:t>
+      </w:r>
+      <w:r>
+        <w:t>Grants and other</w:t>
+      </w:r>
+      <w:r>
+        <w:t xml:space="preserve"> monetary</w:t>
+      </w:r>
+      <w:r>
+        <w:t xml:space="preserve"> assistance to domestic</w:t>
+      </w:r>
+      <w:r>
+        <w:t xml:space="preserve"> </w:t>
+      </w:r>
+      <w:r>
+        <w:t>individuals</w:t>
+      </w:r>
+      <w:r>
+        <w:t xml:space="preserve">,” Part IX: Statement of Functional Expenses), </w:t>
+      </w:r>
+      <w:r>
+        <w:t xml:space="preserve">categorical </w:t>
+      </w:r>
+      <w:r>
+        <w:t>information</w:t>
+      </w:r>
+      <w:r>
+        <w:t xml:space="preserve"> of the entity</w:t>
+      </w:r>
+      <w:r>
+        <w:t xml:space="preserve"> (i.e., </w:t>
+      </w:r>
+      <w:r>
+        <w:t xml:space="preserve">“Form of Organization,” Part 0: </w:t>
+      </w:r>
+      <w:r>
+        <w:t>Header</w:t>
+      </w:r>
+      <w:r>
+        <w:t>),</w:t>
+      </w:r>
+      <w:r>
+        <w:t xml:space="preserve"> and summarized finances</w:t>
+      </w:r>
+      <w:r>
+        <w:t xml:space="preserve"> and balance sheet </w:t>
+      </w:r>
+      <w:r>
+        <w:t xml:space="preserve">(i.e., </w:t>
+      </w:r>
+      <w:r>
+        <w:t>“Total Assets</w:t>
+      </w:r>
+      <w:r>
+        <w:t>,</w:t>
+      </w:r>
+      <w:r>
+        <w:t>”</w:t>
+      </w:r>
+      <w:r>
+        <w:t xml:space="preserve"> Part I: Summary).</w:t>
+      </w:r>
+      <w:r>
+        <w:t xml:space="preserve"> </w:t>
+      </w:r>
+      <w:r>
+        <w:t xml:space="preserve">For this </w:t>
+      </w:r>
+      <w:r>
+        <w:t>thesis</w:t>
+      </w:r>
+      <w:r>
+        <w:t xml:space="preserve">, I rely on </w:t>
+      </w:r>
+      <w:r>
+        <w:t>mostly summarized financial variables from the dataset.</w:t>
+      </w:r>
+    </w:p>
+    <w:p>
+      <w:pPr>
+        <w:ind w:firstLine="720"/>
+      </w:pPr>
+      <w:r>
+        <w:t>To supplement th</w:t>
+      </w:r>
+      <w:r>
+        <w:t xml:space="preserve">e Form 990 </w:t>
+      </w:r>
+      <w:r>
+        <w:t xml:space="preserve">dataset, </w:t>
       </w:r>
       <w:r>
         <w:t xml:space="preserve">the </w:t>
@@ -1832,15 +2352,140 @@
         <w:t xml:space="preserve"> adopted by the IRS</w:t>
       </w:r>
       <w:r>
-        <w:t xml:space="preserve">. So, </w:t>
-      </w:r>
-      <w:r>
-        <w:t>I coded</w:t>
+        <w:t>.</w:t>
+      </w:r>
+    </w:p>
+    <w:p>
+      <w:pPr>
+        <w:ind w:firstLine="720"/>
+      </w:pPr>
+      <w:r>
+        <w:t xml:space="preserve">While filing </w:t>
+      </w:r>
+      <w:r>
+        <w:t xml:space="preserve">a </w:t>
+      </w:r>
+      <w:r>
+        <w:t>Form 990, or tax exemption form, a</w:t>
+      </w:r>
+      <w:r>
+        <w:t xml:space="preserve">n organization </w:t>
+      </w:r>
+      <w:r>
+        <w:t>could list up to three activity codes to describe up to three of their main</w:t>
+      </w:r>
+      <w:r>
+        <w:t xml:space="preserve"> products/services provided. </w:t>
+      </w:r>
+      <w:r>
+        <w:t xml:space="preserve">Exempt organizations founded before </w:t>
+      </w:r>
+      <w:r>
+        <w:t xml:space="preserve">1995 </w:t>
+      </w:r>
+      <w:r>
+        <w:t>must continue using the activity codes. The activity codes for all non-profit organization</w:t>
+      </w:r>
+      <w:r>
+        <w:t xml:space="preserve">, </w:t>
+      </w:r>
+      <w:commentRangeStart w:id="7"/>
+      <w:r>
+        <w:t>past and present</w:t>
+      </w:r>
+      <w:commentRangeEnd w:id="7"/>
+      <w:r>
+        <w:rPr>
+          <w:rStyle w:val="CommentReference"/>
+          <w:sz w:val="24"/>
+          <w:szCs w:val="24"/>
+        </w:rPr>
+        <w:commentReference w:id="7"/>
+      </w:r>
+      <w:r>
+        <w:t>,</w:t>
       </w:r>
       <w:r>
         <w:t xml:space="preserve"> </w:t>
       </w:r>
       <w:r>
+        <w:t>are</w:t>
+      </w:r>
+      <w:r>
+        <w:t xml:space="preserve"> in the </w:t>
+      </w:r>
+      <w:r>
+        <w:t>Internal Revenue Service's Business Master File.</w:t>
+      </w:r>
+      <w:r>
+        <w:rPr>
+          <w:rStyle w:val="FootnoteReference"/>
+          <w:color w:val="EE0000"/>
+        </w:rPr>
+        <w:footnoteReference w:id="7"/>
+      </w:r>
+      <w:r>
+        <w:t xml:space="preserve"> </w:t>
+      </w:r>
+      <w:r>
+        <w:t xml:space="preserve">Organizations founded after 1995 must use the new </w:t>
+      </w:r>
+      <w:r>
+        <w:t>National Taxonomy of Exempt Entity (NTEE) coding system</w:t>
+      </w:r>
+      <w:r>
+        <w:t xml:space="preserve">. </w:t>
+      </w:r>
+      <w:r>
+        <w:t xml:space="preserve">The NTEE code for all non-profit organizations, past and present, </w:t>
+      </w:r>
+      <w:r>
+        <w:t>is</w:t>
+      </w:r>
+      <w:r>
+        <w:t xml:space="preserve"> </w:t>
+      </w:r>
+      <w:r>
+        <w:t xml:space="preserve">also </w:t>
+      </w:r>
+      <w:r>
+        <w:t>in the Business Master File.</w:t>
+      </w:r>
+      <w:r>
+        <w:rPr>
+          <w:rStyle w:val="FootnoteReference"/>
+          <w:color w:val="000000" w:themeColor="text1"/>
+        </w:rPr>
+        <w:footnoteReference w:id="8"/>
+      </w:r>
+      <w:r>
+        <w:t xml:space="preserve"> </w:t>
+      </w:r>
+      <w:r>
+        <w:t>This master file is divided for each US state, based on organization headquarters location. For each state, there is a .CSV file.</w:t>
+      </w:r>
+      <w:r>
+        <w:t xml:space="preserve"> First</w:t>
+      </w:r>
+      <w:r>
+        <w:t xml:space="preserve">, </w:t>
+      </w:r>
+      <w:r>
+        <w:t>I</w:t>
+      </w:r>
+      <w:r>
+        <w:t xml:space="preserve"> combined all 50</w:t>
+      </w:r>
+      <w:r>
+        <w:t xml:space="preserve"> files into a master list then</w:t>
+      </w:r>
+      <w:r>
+        <w:t xml:space="preserve"> coded</w:t>
+      </w:r>
+      <w:r>
+        <w:t xml:space="preserve"> </w:t>
+      </w:r>
+      <w:r>
         <w:t xml:space="preserve">a matching function </w:t>
       </w:r>
       <w:r>
@@ -1871,7 +2516,31 @@
         <w:t xml:space="preserve">by the function </w:t>
       </w:r>
       <w:r>
-        <w:t xml:space="preserve">to the nearest NTEE code for this thesis. Below is a table of all NTEE codes, which are all representative in this </w:t>
+        <w:t xml:space="preserve">to the nearest NTEE code for this thesis. </w:t>
+      </w:r>
+      <w:r>
+        <w:t>I manually matched each activity code category to a related NTEE code category.</w:t>
+      </w:r>
+    </w:p>
+    <w:p>
+      <w:pPr>
+        <w:pStyle w:val="Editing"/>
+      </w:pPr>
+      <w:r>
+        <w:t>Describe how I could do that…</w:t>
+      </w:r>
+    </w:p>
+    <w:p>
+      <w:pPr>
+        <w:ind w:firstLine="720"/>
+        <w:rPr>
+          <w:color w:val="EE0000"/>
+          <w:u w:val="single"/>
+        </w:rPr>
+      </w:pPr>
+      <w:r>
+        <w:lastRenderedPageBreak/>
+        <w:t xml:space="preserve">Below is a table of all NTEE codes, which are all representative in this </w:t>
       </w:r>
       <w:r>
         <w:t>thesis’</w:t>
@@ -2576,7 +3245,6 @@
                 <w:szCs w:val="22"/>
                 <w14:ligatures w14:val="none"/>
               </w:rPr>
-              <w:lastRenderedPageBreak/>
               <w:t>D</w:t>
             </w:r>
           </w:p>
@@ -5313,6 +5981,7 @@
                 <w:szCs w:val="22"/>
                 <w14:ligatures w14:val="none"/>
               </w:rPr>
+              <w:lastRenderedPageBreak/>
               <w:t>W</w:t>
             </w:r>
           </w:p>
@@ -5846,20 +6515,47 @@
     </w:tbl>
     <w:p/>
     <w:p>
-      <w:r>
-        <w:t xml:space="preserve"> </w:t>
+      <w:pPr>
+        <w:pStyle w:val="Editing"/>
+        <w:ind w:firstLine="0"/>
+      </w:pPr>
+      <w:r>
+        <w:tab/>
+        <w:t xml:space="preserve">To further supplement this dataset, I gathered real GDP data for </w:t>
+      </w:r>
+      <w:r>
+        <w:t xml:space="preserve">each state. </w:t>
+      </w:r>
+    </w:p>
+    <w:p>
+      <w:pPr>
+        <w:pStyle w:val="Editing"/>
+      </w:pPr>
+      <w:r>
+        <w:tab/>
+        <w:t>The data is collected by…</w:t>
+      </w:r>
+    </w:p>
+    <w:p>
+      <w:pPr>
+        <w:pStyle w:val="Editing"/>
+      </w:pPr>
+      <w:r>
+        <w:t>Basically what the data looks like and what I did to it… (is in raw number I think</w:t>
+      </w:r>
+      <w:r>
+        <w:t xml:space="preserve"> and I turned it into a growth percent).</w:t>
       </w:r>
     </w:p>
     <w:p>
       <w:pPr>
         <w:pStyle w:val="Heading2"/>
       </w:pPr>
-      <w:bookmarkStart w:id="7" w:name="_Toc223509211"/>
-      <w:r>
-        <w:lastRenderedPageBreak/>
+      <w:bookmarkStart w:id="8" w:name="_Toc224065634"/>
+      <w:r>
         <w:t>Restrictions</w:t>
       </w:r>
-      <w:bookmarkEnd w:id="7"/>
+      <w:bookmarkEnd w:id="8"/>
     </w:p>
     <w:p>
       <w:pPr>
@@ -5872,7 +6568,7 @@
         <w:rPr>
           <w:rStyle w:val="FootnoteReference"/>
         </w:rPr>
-        <w:footnoteReference w:id="5"/>
+        <w:footnoteReference w:id="9"/>
       </w:r>
       <w:r>
         <w:t xml:space="preserve"> Additionally, an organization that is not contributing a public benefit is at risk of losings its special status. So, three consecutive years of zero program expenses, assuming this shows zero public benefit, is a reasonable restriction to make. </w:t>
@@ -5906,35 +6602,30 @@
       <w:r>
         <w:t xml:space="preserve"> </w:t>
       </w:r>
-      <w:proofErr w:type="gramStart"/>
-      <w:r>
-        <w:t>operate</w:t>
-      </w:r>
-      <w:proofErr w:type="gramEnd"/>
-      <w:r>
-        <w:t xml:space="preserve"> differently.</w:t>
+      <w:r>
+        <w:t>operate differently.</w:t>
       </w:r>
       <w:r>
         <w:rPr>
           <w:rStyle w:val="FootnoteReference"/>
         </w:rPr>
-        <w:footnoteReference w:id="6"/>
+        <w:footnoteReference w:id="10"/>
       </w:r>
       <w:r>
         <w:t xml:space="preserve"> </w:t>
       </w:r>
-      <w:commentRangeStart w:id="8"/>
+      <w:commentRangeStart w:id="9"/>
       <w:r>
         <w:t xml:space="preserve">Shon et. al. </w:t>
       </w:r>
-      <w:commentRangeEnd w:id="8"/>
+      <w:commentRangeEnd w:id="9"/>
       <w:r>
         <w:rPr>
           <w:rStyle w:val="CommentReference"/>
-          <w:kern w:val="0"/>
-          <w14:ligatures w14:val="none"/>
-        </w:rPr>
-        <w:commentReference w:id="8"/>
+          <w:sz w:val="24"/>
+          <w:szCs w:val="24"/>
+        </w:rPr>
+        <w:commentReference w:id="9"/>
       </w:r>
       <w:r>
         <w:t xml:space="preserve">find that </w:t>
@@ -5943,42 +6634,30 @@
         <w:t>changing revenue</w:t>
       </w:r>
       <w:r>
-        <w:t xml:space="preserve"> concentrations does not have a significant impact on hospital or school spending patterns. </w:t>
-      </w:r>
-      <w:r>
-        <w:t xml:space="preserve">Further, these institutions </w:t>
-      </w:r>
-      <w:proofErr w:type="gramStart"/>
-      <w:r>
-        <w:t>represent</w:t>
-      </w:r>
-      <w:proofErr w:type="gramEnd"/>
-      <w:r>
-        <w:t xml:space="preserve"> some of the largest outliers in the dataset </w:t>
+        <w:t xml:space="preserve"> concentrations does not have a significant impact on hospital or school </w:t>
+      </w:r>
+      <w:r>
+        <w:lastRenderedPageBreak/>
+        <w:t xml:space="preserve">spending patterns. </w:t>
+      </w:r>
+      <w:r>
+        <w:t xml:space="preserve">Further, these institutions represent some of the largest outliers in the dataset </w:t>
       </w:r>
       <w:r>
         <w:t>and demand</w:t>
       </w:r>
       <w:r>
-        <w:t xml:space="preserve"> for their services is </w:t>
-      </w:r>
-      <w:proofErr w:type="gramStart"/>
-      <w:r>
-        <w:t>likely inelastic</w:t>
-      </w:r>
-      <w:proofErr w:type="gramEnd"/>
-      <w:r>
-        <w:t xml:space="preserve">. </w:t>
-      </w:r>
-      <w:commentRangeStart w:id="9"/>
-      <w:commentRangeEnd w:id="9"/>
+        <w:t xml:space="preserve"> for their services is likely inelastic. </w:t>
+      </w:r>
+      <w:commentRangeStart w:id="10"/>
+      <w:commentRangeEnd w:id="10"/>
       <w:r>
         <w:rPr>
           <w:rStyle w:val="CommentReference"/>
-          <w:kern w:val="0"/>
-          <w14:ligatures w14:val="none"/>
-        </w:rPr>
-        <w:commentReference w:id="9"/>
+          <w:sz w:val="24"/>
+          <w:szCs w:val="24"/>
+        </w:rPr>
+        <w:commentReference w:id="10"/>
       </w:r>
       <w:r>
         <w:t>This drops 558,692 observations.</w:t>
@@ -6004,7 +6683,7 @@
         <w:rPr>
           <w:rStyle w:val="FootnoteReference"/>
         </w:rPr>
-        <w:footnoteReference w:id="7"/>
+        <w:footnoteReference w:id="11"/>
       </w:r>
       <w:r>
         <w:t xml:space="preserve"> </w:t>
@@ -6069,11 +6748,7 @@
         <w:t xml:space="preserve"> My </w:t>
       </w:r>
       <w:r>
-        <w:t xml:space="preserve">economic variables are based in the 50 united states, and I do not have data for countries or states </w:t>
-      </w:r>
-      <w:r>
-        <w:lastRenderedPageBreak/>
-        <w:t xml:space="preserve">outside of this scope. Also, </w:t>
+        <w:t xml:space="preserve">economic variables are based in the 50 united states, and I do not have data for countries or states outside of this scope. Also, </w:t>
       </w:r>
       <w:r>
         <w:t>I hope for potential policy or business recommendations</w:t>
@@ -6139,7 +6814,7 @@
       <w:r>
         <w:t xml:space="preserve">is limits the data set to </w:t>
       </w:r>
-      <w:commentRangeStart w:id="10"/>
+      <w:commentRangeStart w:id="11"/>
       <w:r>
         <w:t>3</w:t>
       </w:r>
@@ -6170,14 +6845,14 @@
       <w:r>
         <w:t xml:space="preserve"> unique organizations (from 738,790).</w:t>
       </w:r>
-      <w:commentRangeEnd w:id="10"/>
+      <w:commentRangeEnd w:id="11"/>
       <w:r>
         <w:rPr>
           <w:rStyle w:val="CommentReference"/>
-          <w:kern w:val="0"/>
-          <w14:ligatures w14:val="none"/>
-        </w:rPr>
-        <w:commentReference w:id="10"/>
+          <w:sz w:val="24"/>
+          <w:szCs w:val="24"/>
+        </w:rPr>
+        <w:commentReference w:id="11"/>
       </w:r>
       <w:r>
         <w:t xml:space="preserve"> </w:t>
@@ -6213,7 +6888,11 @@
         <w:t xml:space="preserve"> balanced</w:t>
       </w:r>
       <w:r>
-        <w:t>, in contrast to before the restrictions or calculating log() values</w:t>
+        <w:t xml:space="preserve">, in contrast to before the </w:t>
+      </w:r>
+      <w:r>
+        <w:lastRenderedPageBreak/>
+        <w:t>restrictions or calculating log() values</w:t>
       </w:r>
       <w:r>
         <w:t>.</w:t>
@@ -6250,11 +6929,11 @@
       <w:pPr>
         <w:pStyle w:val="Heading2"/>
       </w:pPr>
-      <w:bookmarkStart w:id="11" w:name="_Toc223509212"/>
+      <w:bookmarkStart w:id="12" w:name="_Toc224065635"/>
       <w:r>
         <w:t>Description</w:t>
       </w:r>
-      <w:bookmarkEnd w:id="11"/>
+      <w:bookmarkEnd w:id="12"/>
     </w:p>
     <w:p>
       <w:r>
@@ -6289,9 +6968,8 @@
         <w:rPr>
           <w:noProof/>
         </w:rPr>
-        <w:lastRenderedPageBreak/>
         <w:drawing>
-          <wp:inline distT="0" distB="0" distL="0" distR="0" wp14:anchorId="1F487A93" wp14:editId="7B2FDA7A">
+          <wp:inline distT="0" distB="0" distL="0" distR="0" wp14:anchorId="1F487A93" wp14:editId="692B7756">
             <wp:extent cx="5943600" cy="4457700"/>
             <wp:effectExtent l="0" t="0" r="0" b="0"/>
             <wp:docPr id="1905846790" name="Picture 1" descr="A green and black graph&#10;&#10;AI-generated content may be incorrect."/>
@@ -6357,7 +7035,7 @@
         </w:rPr>
         <w:lastRenderedPageBreak/>
         <w:drawing>
-          <wp:inline distT="0" distB="0" distL="0" distR="0" wp14:anchorId="6CC7873B" wp14:editId="45196B22">
+          <wp:inline distT="0" distB="0" distL="0" distR="0" wp14:anchorId="6CC7873B" wp14:editId="0574B409">
             <wp:extent cx="5943600" cy="4457700"/>
             <wp:effectExtent l="0" t="0" r="0" b="0"/>
             <wp:docPr id="1527895574" name="Picture 2" descr="A graph of a number of expenses&#10;&#10;AI-generated content may be incorrect."/>
@@ -6417,7 +7095,7 @@
         </w:rPr>
         <w:lastRenderedPageBreak/>
         <w:drawing>
-          <wp:inline distT="0" distB="0" distL="0" distR="0" wp14:anchorId="65E2E482" wp14:editId="71B695F7">
+          <wp:inline distT="0" distB="0" distL="0" distR="0" wp14:anchorId="65E2E482" wp14:editId="341785CC">
             <wp:extent cx="5943600" cy="4457700"/>
             <wp:effectExtent l="0" t="0" r="0" b="0"/>
             <wp:docPr id="1609654299" name="Picture 3" descr="A graph of growth in years&#10;&#10;AI-generated content may be incorrect."/>
@@ -6953,7 +7631,6 @@
                 <w14:ligatures w14:val="none"/>
               </w:rPr>
             </w:pPr>
-            <w:proofErr w:type="spellStart"/>
             <w:r>
               <w:rPr>
                 <w:kern w:val="0"/>
@@ -6963,7 +7640,6 @@
               </w:rPr>
               <w:t>donation_revenue</w:t>
             </w:r>
-            <w:proofErr w:type="spellEnd"/>
           </w:p>
         </w:tc>
         <w:tc>
@@ -7323,7 +7999,6 @@
                 <w14:ligatures w14:val="none"/>
               </w:rPr>
             </w:pPr>
-            <w:proofErr w:type="spellStart"/>
             <w:r>
               <w:rPr>
                 <w:kern w:val="0"/>
@@ -7333,7 +8008,6 @@
               </w:rPr>
               <w:t>fundraising_revenue</w:t>
             </w:r>
-            <w:proofErr w:type="spellEnd"/>
           </w:p>
         </w:tc>
         <w:tc>
@@ -7702,7 +8376,6 @@
                 <w14:ligatures w14:val="none"/>
               </w:rPr>
             </w:pPr>
-            <w:proofErr w:type="spellStart"/>
             <w:r>
               <w:rPr>
                 <w:kern w:val="0"/>
@@ -7712,7 +8385,6 @@
               </w:rPr>
               <w:t>gdp_change_percent</w:t>
             </w:r>
-            <w:proofErr w:type="spellEnd"/>
           </w:p>
         </w:tc>
         <w:tc>
@@ -8069,7 +8741,6 @@
                 <w14:ligatures w14:val="none"/>
               </w:rPr>
             </w:pPr>
-            <w:proofErr w:type="spellStart"/>
             <w:r>
               <w:rPr>
                 <w:kern w:val="0"/>
@@ -8079,7 +8750,6 @@
               </w:rPr>
               <w:t>government_revenue</w:t>
             </w:r>
-            <w:proofErr w:type="spellEnd"/>
           </w:p>
         </w:tc>
         <w:tc>
@@ -8448,7 +9118,6 @@
                 <w14:ligatures w14:val="none"/>
               </w:rPr>
             </w:pPr>
-            <w:proofErr w:type="spellStart"/>
             <w:r>
               <w:rPr>
                 <w:kern w:val="0"/>
@@ -8458,7 +9127,6 @@
               </w:rPr>
               <w:t>investment_revenue</w:t>
             </w:r>
-            <w:proofErr w:type="spellEnd"/>
           </w:p>
         </w:tc>
         <w:tc>
@@ -8818,7 +9486,6 @@
                 <w14:ligatures w14:val="none"/>
               </w:rPr>
             </w:pPr>
-            <w:proofErr w:type="spellStart"/>
             <w:r>
               <w:rPr>
                 <w:kern w:val="0"/>
@@ -8828,7 +9495,6 @@
               </w:rPr>
               <w:t>membership_revenue</w:t>
             </w:r>
-            <w:proofErr w:type="spellEnd"/>
           </w:p>
         </w:tc>
         <w:tc>
@@ -9197,7 +9863,6 @@
                 <w14:ligatures w14:val="none"/>
               </w:rPr>
             </w:pPr>
-            <w:proofErr w:type="spellStart"/>
             <w:r>
               <w:rPr>
                 <w:kern w:val="0"/>
@@ -9207,7 +9872,6 @@
               </w:rPr>
               <w:t>other_revenue</w:t>
             </w:r>
-            <w:proofErr w:type="spellEnd"/>
           </w:p>
         </w:tc>
         <w:tc>
@@ -9252,47 +9916,7 @@
                 <w:szCs w:val="22"/>
                 <w14:ligatures w14:val="none"/>
               </w:rPr>
-              <w:t>Miscellaneous revenue from other sources (</w:t>
-            </w:r>
-            <w:proofErr w:type="gramStart"/>
-            <w:r>
-              <w:rPr>
-                <w:kern w:val="0"/>
-                <w:sz w:val="22"/>
-                <w:szCs w:val="22"/>
-                <w14:ligatures w14:val="none"/>
-              </w:rPr>
-              <w:t>i.e.</w:t>
-            </w:r>
-            <w:proofErr w:type="gramEnd"/>
-            <w:r>
-              <w:rPr>
-                <w:kern w:val="0"/>
-                <w:sz w:val="22"/>
-                <w:szCs w:val="22"/>
-                <w14:ligatures w14:val="none"/>
-              </w:rPr>
-              <w:t xml:space="preserve"> sale of property, </w:t>
-            </w:r>
-            <w:proofErr w:type="gramStart"/>
-            <w:r>
-              <w:rPr>
-                <w:kern w:val="0"/>
-                <w:sz w:val="22"/>
-                <w:szCs w:val="22"/>
-                <w14:ligatures w14:val="none"/>
-              </w:rPr>
-              <w:t>etc.</w:t>
-            </w:r>
-            <w:proofErr w:type="gramEnd"/>
-            <w:r>
-              <w:rPr>
-                <w:kern w:val="0"/>
-                <w:sz w:val="22"/>
-                <w:szCs w:val="22"/>
-                <w14:ligatures w14:val="none"/>
-              </w:rPr>
-              <w:t>)</w:t>
+              <w:t>Miscellaneous revenue from other sources (i.e. sale of property, etc.)</w:t>
             </w:r>
           </w:p>
         </w:tc>
@@ -9598,7 +10222,6 @@
                 <w14:ligatures w14:val="none"/>
               </w:rPr>
             </w:pPr>
-            <w:proofErr w:type="spellStart"/>
             <w:r>
               <w:rPr>
                 <w:kern w:val="0"/>
@@ -9608,7 +10231,6 @@
               </w:rPr>
               <w:t>total_program_expenses</w:t>
             </w:r>
-            <w:proofErr w:type="spellEnd"/>
           </w:p>
         </w:tc>
         <w:tc>
@@ -9653,27 +10275,7 @@
                 <w:szCs w:val="22"/>
                 <w14:ligatures w14:val="none"/>
               </w:rPr>
-              <w:t xml:space="preserve">Total expenses directed towards programs. </w:t>
-            </w:r>
-            <w:proofErr w:type="gramStart"/>
-            <w:r>
-              <w:rPr>
-                <w:kern w:val="0"/>
-                <w:sz w:val="22"/>
-                <w:szCs w:val="22"/>
-                <w14:ligatures w14:val="none"/>
-              </w:rPr>
-              <w:t>Represents</w:t>
-            </w:r>
-            <w:proofErr w:type="gramEnd"/>
-            <w:r>
-              <w:rPr>
-                <w:kern w:val="0"/>
-                <w:sz w:val="22"/>
-                <w:szCs w:val="22"/>
-                <w14:ligatures w14:val="none"/>
-              </w:rPr>
-              <w:t xml:space="preserve"> the demand for the organization's services.</w:t>
+              <w:t>Total expenses directed towards programs. Represents the demand for the organization's services.</w:t>
             </w:r>
           </w:p>
         </w:tc>
@@ -9988,7 +10590,6 @@
                 <w14:ligatures w14:val="none"/>
               </w:rPr>
             </w:pPr>
-            <w:proofErr w:type="spellStart"/>
             <w:r>
               <w:rPr>
                 <w:kern w:val="0"/>
@@ -9998,7 +10599,6 @@
               </w:rPr>
               <w:t>total_revenue</w:t>
             </w:r>
-            <w:proofErr w:type="spellEnd"/>
           </w:p>
         </w:tc>
         <w:tc>
@@ -10043,27 +10643,7 @@
                 <w:szCs w:val="22"/>
                 <w14:ligatures w14:val="none"/>
               </w:rPr>
-              <w:t xml:space="preserve">Total revenue from all sources. </w:t>
-            </w:r>
-            <w:proofErr w:type="gramStart"/>
-            <w:r>
-              <w:rPr>
-                <w:kern w:val="0"/>
-                <w:sz w:val="22"/>
-                <w:szCs w:val="22"/>
-                <w14:ligatures w14:val="none"/>
-              </w:rPr>
-              <w:t>Represents</w:t>
-            </w:r>
-            <w:proofErr w:type="gramEnd"/>
-            <w:r>
-              <w:rPr>
-                <w:kern w:val="0"/>
-                <w:sz w:val="22"/>
-                <w:szCs w:val="22"/>
-                <w14:ligatures w14:val="none"/>
-              </w:rPr>
-              <w:t xml:space="preserve"> the supply of the organization's services.</w:t>
+              <w:t>Total revenue from all sources. Represents the supply of the organization's services.</w:t>
             </w:r>
           </w:p>
         </w:tc>
@@ -10684,7 +11264,6 @@
                 <w14:ligatures w14:val="none"/>
               </w:rPr>
             </w:pPr>
-            <w:proofErr w:type="spellStart"/>
             <w:r>
               <w:rPr>
                 <w:kern w:val="0"/>
@@ -10694,7 +11273,6 @@
               </w:rPr>
               <w:t>organization_ein</w:t>
             </w:r>
-            <w:proofErr w:type="spellEnd"/>
           </w:p>
         </w:tc>
         <w:tc>
@@ -10991,7 +11569,6 @@
                 <w14:ligatures w14:val="none"/>
               </w:rPr>
             </w:pPr>
-            <w:proofErr w:type="spellStart"/>
             <w:r>
               <w:rPr>
                 <w:kern w:val="0"/>
@@ -11001,7 +11578,6 @@
               </w:rPr>
               <w:t>organization_name</w:t>
             </w:r>
-            <w:proofErr w:type="spellEnd"/>
           </w:p>
         </w:tc>
         <w:tc>
@@ -11351,19 +11927,8 @@
                 <w:szCs w:val="22"/>
                 <w14:ligatures w14:val="none"/>
               </w:rPr>
-              <w:t xml:space="preserve">State where the organization is </w:t>
-            </w:r>
-            <w:proofErr w:type="gramStart"/>
-            <w:r>
-              <w:rPr>
-                <w:kern w:val="0"/>
-                <w:sz w:val="22"/>
-                <w:szCs w:val="22"/>
-                <w14:ligatures w14:val="none"/>
-              </w:rPr>
-              <w:t>located</w:t>
-            </w:r>
-            <w:proofErr w:type="gramEnd"/>
+              <w:t>State where the organization is located</w:t>
+            </w:r>
           </w:p>
         </w:tc>
         <w:tc>
@@ -11929,29 +12494,7 @@
                 <w:szCs w:val="22"/>
                 <w14:ligatures w14:val="none"/>
               </w:rPr>
-              <w:t xml:space="preserve">* Observations for categorical variables </w:t>
-            </w:r>
-            <w:proofErr w:type="gramStart"/>
-            <w:r>
-              <w:rPr>
-                <w:rFonts w:eastAsia="Helvetica"/>
-                <w:kern w:val="0"/>
-                <w:sz w:val="22"/>
-                <w:szCs w:val="22"/>
-                <w14:ligatures w14:val="none"/>
-              </w:rPr>
-              <w:t>represent</w:t>
-            </w:r>
-            <w:proofErr w:type="gramEnd"/>
-            <w:r>
-              <w:rPr>
-                <w:rFonts w:eastAsia="Helvetica"/>
-                <w:kern w:val="0"/>
-                <w:sz w:val="22"/>
-                <w:szCs w:val="22"/>
-                <w14:ligatures w14:val="none"/>
-              </w:rPr>
-              <w:t xml:space="preserve"> unique counts.</w:t>
+              <w:t>* Observations for categorical variables represent unique counts.</w:t>
             </w:r>
           </w:p>
         </w:tc>
@@ -11973,51 +12516,47 @@
           <w:docGrid w:linePitch="360"/>
         </w:sectPr>
       </w:pPr>
-      <w:bookmarkStart w:id="12" w:name="_Toc223509213"/>
     </w:p>
     <w:p>
       <w:pPr>
         <w:pStyle w:val="Heading1"/>
       </w:pPr>
-      <w:commentRangeStart w:id="13"/>
+      <w:bookmarkStart w:id="13" w:name="_Toc224065636"/>
       <w:commentRangeStart w:id="14"/>
+      <w:commentRangeStart w:id="15"/>
       <w:r>
         <w:lastRenderedPageBreak/>
         <w:t>Methodology</w:t>
       </w:r>
-      <w:commentRangeEnd w:id="13"/>
+      <w:bookmarkEnd w:id="13"/>
+      <w:commentRangeEnd w:id="14"/>
       <w:r>
         <w:rPr>
           <w:rStyle w:val="CommentReference"/>
-          <w:rFonts w:ascii="Times New Roman" w:eastAsia="Times New Roman" w:hAnsi="Times New Roman" w:cs="Times New Roman"/>
-          <w:color w:val="000000"/>
-          <w:kern w:val="0"/>
-          <w14:ligatures w14:val="none"/>
-        </w:rPr>
-        <w:commentReference w:id="13"/>
-      </w:r>
-      <w:commentRangeEnd w:id="14"/>
+          <w:sz w:val="40"/>
+          <w:szCs w:val="40"/>
+        </w:rPr>
+        <w:commentReference w:id="14"/>
+      </w:r>
+      <w:commentRangeEnd w:id="15"/>
       <w:r>
         <w:rPr>
           <w:rStyle w:val="CommentReference"/>
-          <w:rFonts w:ascii="Times New Roman" w:eastAsia="Times New Roman" w:hAnsi="Times New Roman" w:cs="Times New Roman"/>
-          <w:color w:val="000000"/>
-          <w:kern w:val="0"/>
-          <w14:ligatures w14:val="none"/>
-        </w:rPr>
-        <w:commentReference w:id="14"/>
-      </w:r>
-      <w:bookmarkEnd w:id="12"/>
+          <w:sz w:val="40"/>
+          <w:szCs w:val="40"/>
+        </w:rPr>
+        <w:commentReference w:id="15"/>
+      </w:r>
     </w:p>
     <w:p>
       <w:pPr>
         <w:pStyle w:val="Heading2"/>
       </w:pPr>
-      <w:bookmarkStart w:id="15" w:name="_Toc223509214"/>
+      <w:bookmarkStart w:id="16" w:name="_Toc224065637"/>
       <w:r>
         <w:t>Independent Variables</w:t>
       </w:r>
-      <w:bookmarkEnd w:id="15"/>
+      <w:bookmarkEnd w:id="16"/>
     </w:p>
     <w:p>
       <w:pPr>
@@ -12030,7 +12569,7 @@
         <w:rPr>
           <w:vertAlign w:val="superscript"/>
         </w:rPr>
-        <w:footnoteReference w:id="8"/>
+        <w:footnoteReference w:id="12"/>
       </w:r>
       <w:r>
         <w:t xml:space="preserve"> For my research, government grants may be more stable or increased in economically bad times.</w:t>
@@ -12041,32 +12580,24 @@
       <w:pPr>
         <w:pStyle w:val="Heading2"/>
       </w:pPr>
-      <w:bookmarkStart w:id="16" w:name="_Toc223509215"/>
+      <w:bookmarkStart w:id="17" w:name="_Toc224065638"/>
       <w:r>
         <w:t>Dependent Variables</w:t>
       </w:r>
-      <w:bookmarkEnd w:id="16"/>
+      <w:bookmarkEnd w:id="17"/>
     </w:p>
     <w:p>
       <w:pPr>
         <w:ind w:firstLine="720"/>
       </w:pPr>
       <w:r>
-        <w:t xml:space="preserve">According to recent research, citizens have strong preferences for non-profits to expand services, especially in economically </w:t>
-      </w:r>
-      <w:proofErr w:type="gramStart"/>
-      <w:r>
-        <w:t>bad times</w:t>
-      </w:r>
-      <w:proofErr w:type="gramEnd"/>
-      <w:r>
-        <w:t>.</w:t>
+        <w:t>According to recent research, citizens have strong preferences for non-profits to expand services, especially in economically bad times.</w:t>
       </w:r>
       <w:r>
         <w:rPr>
           <w:vertAlign w:val="superscript"/>
         </w:rPr>
-        <w:footnoteReference w:id="9"/>
+        <w:footnoteReference w:id="13"/>
       </w:r>
       <w:r>
         <w:t xml:space="preserve"> </w:t>
@@ -12095,7 +12626,7 @@
         <w:rPr>
           <w:vertAlign w:val="superscript"/>
         </w:rPr>
-        <w:footnoteReference w:id="10"/>
+        <w:footnoteReference w:id="14"/>
       </w:r>
       <w:r>
         <w:t xml:space="preserve"> I do not have the opportunity to survey for such data. From the same research, they </w:t>
@@ -12104,46 +12635,35 @@
         <w:t xml:space="preserve">also </w:t>
       </w:r>
       <w:r>
-        <w:t xml:space="preserve">take the </w:t>
-      </w:r>
-      <w:proofErr w:type="gramStart"/>
-      <w:r>
-        <w:t>log(</w:t>
-      </w:r>
-      <w:proofErr w:type="gramEnd"/>
-      <w:r>
-        <w:t>) value of their dependent variable to make it more comparable across organizations.</w:t>
+        <w:t>take the log() value of their dependent variable to make it more comparable across organizations.</w:t>
       </w:r>
       <w:r>
         <w:rPr>
           <w:vertAlign w:val="superscript"/>
         </w:rPr>
-        <w:footnoteReference w:id="11"/>
+        <w:footnoteReference w:id="15"/>
       </w:r>
     </w:p>
     <w:p>
       <w:pPr>
         <w:pStyle w:val="Heading2"/>
       </w:pPr>
-      <w:bookmarkStart w:id="17" w:name="_Toc223509216"/>
+      <w:bookmarkStart w:id="18" w:name="_Toc224065639"/>
       <w:r>
         <w:lastRenderedPageBreak/>
         <w:t>Regression Models</w:t>
       </w:r>
-      <w:bookmarkEnd w:id="17"/>
+      <w:bookmarkEnd w:id="18"/>
     </w:p>
     <w:p>
       <w:pPr>
         <w:pStyle w:val="Heading3"/>
       </w:pPr>
-      <w:r>
-        <w:t xml:space="preserve">Model </w:t>
-      </w:r>
-      <w:proofErr w:type="gramStart"/>
-      <w:r>
-        <w:t>1</w:t>
-      </w:r>
-      <w:proofErr w:type="gramEnd"/>
+      <w:bookmarkStart w:id="19" w:name="_Toc224065640"/>
+      <w:r>
+        <w:t>Model 1</w:t>
+      </w:r>
+      <w:bookmarkEnd w:id="19"/>
     </w:p>
     <w:p>
       <w:pPr>
@@ -12160,6 +12680,28 @@
       </w:r>
       <w:r>
         <w:t>:</w:t>
+      </w:r>
+    </w:p>
+    <w:p>
+      <w:pPr>
+        <w:pStyle w:val="Editing"/>
+      </w:pPr>
+      <w:r>
+        <w:t xml:space="preserve">Input the base </w:t>
+      </w:r>
+      <w:r>
+        <w:t xml:space="preserve">OLS model that doesn’t have any variable names. </w:t>
+      </w:r>
+    </w:p>
+    <w:p>
+      <w:pPr>
+        <w:pStyle w:val="Editing"/>
+      </w:pPr>
+      <w:r>
+        <w:t xml:space="preserve">Where </w:t>
+      </w:r>
+      <w:r>
+        <w:t>Y = etc, B0 = etc, B1 = my explanatory variable, etc. This forms the model:</w:t>
       </w:r>
     </w:p>
     <w:p>
@@ -12174,6 +12716,38 @@
               <w:rFonts w:ascii="Cambria Math" w:hAnsi="Cambria Math"/>
             </w:rPr>
             <m:t xml:space="preserve">log(Program_Expenses) = </m:t>
+          </m:r>
+          <m:sSub>
+            <m:sSubPr>
+              <m:ctrlPr>
+                <w:rPr>
+                  <w:rFonts w:ascii="Cambria Math" w:hAnsi="Cambria Math"/>
+                  <w:i/>
+                </w:rPr>
+              </m:ctrlPr>
+            </m:sSubPr>
+            <m:e>
+              <m:r>
+                <w:rPr>
+                  <w:rFonts w:ascii="Cambria Math" w:hAnsi="Cambria Math"/>
+                </w:rPr>
+                <m:t>β</m:t>
+              </m:r>
+            </m:e>
+            <m:sub>
+              <m:r>
+                <w:rPr>
+                  <w:rFonts w:ascii="Cambria Math" w:hAnsi="Cambria Math"/>
+                </w:rPr>
+                <m:t>0</m:t>
+              </m:r>
+            </m:sub>
+          </m:sSub>
+          <m:r>
+            <w:rPr>
+              <w:rFonts w:ascii="Cambria Math" w:hAnsi="Cambria Math"/>
+            </w:rPr>
+            <m:t>+</m:t>
           </m:r>
           <m:sSub>
             <m:sSubPr>
@@ -12214,150 +12788,104 @@
       <w:pPr>
         <w:ind w:firstLine="720"/>
         <w:rPr>
-          <w:color w:val="EE0000"/>
+          <w:color w:val="000000" w:themeColor="text1"/>
         </w:rPr>
       </w:pPr>
       <w:r>
         <w:rPr>
-          <w:color w:val="EE0000"/>
+          <w:color w:val="000000" w:themeColor="text1"/>
         </w:rPr>
         <w:t>This is useful becaus</w:t>
       </w:r>
       <w:r>
         <w:rPr>
-          <w:color w:val="EE0000"/>
+          <w:color w:val="000000" w:themeColor="text1"/>
         </w:rPr>
         <w:t>e</w:t>
       </w:r>
       <w:r>
         <w:rPr>
-          <w:color w:val="EE0000"/>
+          <w:color w:val="000000" w:themeColor="text1"/>
         </w:rPr>
         <w:t xml:space="preserve"> </w:t>
       </w:r>
       <w:r>
         <w:rPr>
-          <w:color w:val="EE0000"/>
+          <w:color w:val="000000" w:themeColor="text1"/>
         </w:rPr>
         <w:t xml:space="preserve">it analyzes </w:t>
       </w:r>
       <w:r>
         <w:rPr>
-          <w:color w:val="EE0000"/>
+          <w:color w:val="000000" w:themeColor="text1"/>
         </w:rPr>
         <w:t>the</w:t>
       </w:r>
       <w:r>
         <w:rPr>
-          <w:color w:val="EE0000"/>
+          <w:color w:val="000000" w:themeColor="text1"/>
         </w:rPr>
         <w:t xml:space="preserve"> panel data </w:t>
       </w:r>
       <w:r>
         <w:rPr>
-          <w:color w:val="EE0000"/>
+          <w:color w:val="000000" w:themeColor="text1"/>
         </w:rPr>
         <w:t xml:space="preserve">and </w:t>
       </w:r>
       <w:r>
         <w:rPr>
-          <w:color w:val="EE0000"/>
-        </w:rPr>
-        <w:t xml:space="preserve">will </w:t>
-      </w:r>
-      <w:r>
-        <w:rPr>
-          <w:color w:val="EE0000"/>
-        </w:rPr>
-        <w:t>sho</w:t>
-      </w:r>
-      <w:r>
-        <w:rPr>
-          <w:color w:val="EE0000"/>
-        </w:rPr>
-        <w:t>w a baseline level of correlation if non-profits have a countercyclical trend.</w:t>
-      </w:r>
-      <w:r>
-        <w:rPr>
-          <w:color w:val="EE0000"/>
-        </w:rPr>
-        <w:t xml:space="preserve"> </w:t>
-      </w:r>
-      <w:r>
-        <w:rPr>
-          <w:color w:val="EE0000"/>
-        </w:rPr>
-        <w:t xml:space="preserve">Perhaps organizations are altruistic and restructure their organization knowing times are worse for their constituents. Or, like the rest of the economy, non-profit organizations </w:t>
-      </w:r>
-      <w:proofErr w:type="gramStart"/>
-      <w:r>
-        <w:rPr>
-          <w:color w:val="EE0000"/>
-        </w:rPr>
-        <w:t>are forced</w:t>
-      </w:r>
-      <w:proofErr w:type="gramEnd"/>
-      <w:r>
-        <w:rPr>
-          <w:color w:val="EE0000"/>
-        </w:rPr>
-        <w:t xml:space="preserve"> to downsize in </w:t>
-      </w:r>
-      <w:proofErr w:type="gramStart"/>
-      <w:r>
-        <w:rPr>
-          <w:color w:val="EE0000"/>
-        </w:rPr>
-        <w:t>bad times</w:t>
-      </w:r>
-      <w:proofErr w:type="gramEnd"/>
-      <w:r>
-        <w:rPr>
-          <w:color w:val="EE0000"/>
-        </w:rPr>
-        <w:t xml:space="preserve"> and reduce expenses.</w:t>
+          <w:color w:val="000000" w:themeColor="text1"/>
+        </w:rPr>
+        <w:t>will show a baseline level of correlation if non-profits have a countercyclical trend.</w:t>
+      </w:r>
+      <w:r>
+        <w:rPr>
+          <w:color w:val="000000" w:themeColor="text1"/>
+        </w:rPr>
+        <w:t xml:space="preserve"> Perhaps organizations are altruistic and restructure their organization knowing times are worse for their constituents. Or, like the rest of the economy, non-profit organizations are forced to downsize in bad times and reduce expenses.</w:t>
       </w:r>
     </w:p>
     <w:p>
       <w:pPr>
         <w:ind w:firstLine="720"/>
         <w:rPr>
-          <w:color w:val="EE0000"/>
+          <w:color w:val="000000" w:themeColor="text1"/>
         </w:rPr>
       </w:pPr>
       <w:r>
         <w:rPr>
-          <w:color w:val="EE0000"/>
+          <w:color w:val="000000" w:themeColor="text1"/>
         </w:rPr>
         <w:t xml:space="preserve">Interpreting the results of this model would show </w:t>
       </w:r>
       <w:r>
         <w:rPr>
-          <w:color w:val="EE0000"/>
+          <w:color w:val="000000" w:themeColor="text1"/>
         </w:rPr>
         <w:t>that for a one percentage point increase in real GDP</w:t>
       </w:r>
       <w:r>
         <w:rPr>
-          <w:color w:val="EE0000"/>
+          <w:color w:val="000000" w:themeColor="text1"/>
         </w:rPr>
         <w:t xml:space="preserve">, </w:t>
       </w:r>
       <w:r>
         <w:rPr>
-          <w:color w:val="EE0000"/>
+          <w:color w:val="000000" w:themeColor="text1"/>
         </w:rPr>
         <w:t xml:space="preserve">non-profit program expenses </w:t>
       </w:r>
       <w:r>
         <w:rPr>
-          <w:color w:val="EE0000"/>
+          <w:color w:val="000000" w:themeColor="text1"/>
         </w:rPr>
         <w:t xml:space="preserve">will increase/decrease </w:t>
       </w:r>
       <w:r>
         <w:rPr>
-          <w:color w:val="EE0000"/>
+          <w:color w:val="000000" w:themeColor="text1"/>
         </w:rPr>
         <w:t xml:space="preserve">by a percentage amount. </w:t>
       </w:r>
@@ -12366,128 +12894,114 @@
       <w:pPr>
         <w:ind w:firstLine="720"/>
         <w:rPr>
-          <w:color w:val="EE0000"/>
+          <w:color w:val="000000" w:themeColor="text1"/>
         </w:rPr>
       </w:pPr>
       <w:r>
         <w:rPr>
-          <w:color w:val="EE0000"/>
+          <w:color w:val="000000" w:themeColor="text1"/>
         </w:rPr>
         <w:t>However,</w:t>
       </w:r>
       <w:r>
         <w:rPr>
-          <w:color w:val="EE0000"/>
+          <w:color w:val="000000" w:themeColor="text1"/>
         </w:rPr>
         <w:t xml:space="preserve"> this model will suffer </w:t>
       </w:r>
       <w:r>
         <w:rPr>
-          <w:color w:val="EE0000"/>
+          <w:color w:val="000000" w:themeColor="text1"/>
         </w:rPr>
         <w:t>from</w:t>
       </w:r>
       <w:r>
         <w:rPr>
-          <w:color w:val="EE0000"/>
-        </w:rPr>
-        <w:t xml:space="preserve"> omitted variable bias (</w:t>
-      </w:r>
-      <w:proofErr w:type="spellStart"/>
-      <w:r>
-        <w:rPr>
-          <w:color w:val="EE0000"/>
-        </w:rPr>
-        <w:t>O</w:t>
-      </w:r>
-      <w:r>
-        <w:rPr>
-          <w:color w:val="EE0000"/>
-        </w:rPr>
-        <w:t>VB</w:t>
-      </w:r>
-      <w:proofErr w:type="spellEnd"/>
-      <w:r>
-        <w:rPr>
-          <w:color w:val="EE0000"/>
-        </w:rPr>
-        <w:t>)</w:t>
-      </w:r>
-      <w:r>
-        <w:rPr>
-          <w:color w:val="EE0000"/>
+          <w:color w:val="000000" w:themeColor="text1"/>
+        </w:rPr>
+        <w:t xml:space="preserve"> omitted variable bias (O</w:t>
+      </w:r>
+      <w:r>
+        <w:rPr>
+          <w:color w:val="000000" w:themeColor="text1"/>
+        </w:rPr>
+        <w:t>VB)</w:t>
+      </w:r>
+      <w:r>
+        <w:rPr>
+          <w:color w:val="000000" w:themeColor="text1"/>
         </w:rPr>
         <w:t xml:space="preserve"> </w:t>
       </w:r>
       <w:r>
         <w:rPr>
-          <w:color w:val="EE0000"/>
+          <w:color w:val="000000" w:themeColor="text1"/>
         </w:rPr>
         <w:t xml:space="preserve">and have </w:t>
       </w:r>
       <w:r>
         <w:rPr>
-          <w:color w:val="EE0000"/>
+          <w:color w:val="000000" w:themeColor="text1"/>
         </w:rPr>
         <w:t>imprecise</w:t>
       </w:r>
       <w:r>
         <w:rPr>
-          <w:color w:val="EE0000"/>
+          <w:color w:val="000000" w:themeColor="text1"/>
         </w:rPr>
         <w:t xml:space="preserve"> results because of it. The results may be statistically significant</w:t>
       </w:r>
       <w:r>
         <w:rPr>
-          <w:color w:val="EE0000"/>
+          <w:color w:val="000000" w:themeColor="text1"/>
         </w:rPr>
         <w:t xml:space="preserve"> since it is such a large dataset with many observations but will not have much explanatory power</w:t>
       </w:r>
       <w:r>
         <w:rPr>
-          <w:color w:val="EE0000"/>
+          <w:color w:val="000000" w:themeColor="text1"/>
         </w:rPr>
         <w:t xml:space="preserve"> because</w:t>
       </w:r>
       <w:r>
         <w:rPr>
-          <w:color w:val="EE0000"/>
+          <w:color w:val="000000" w:themeColor="text1"/>
         </w:rPr>
         <w:t xml:space="preserve"> non-profit organizations </w:t>
       </w:r>
       <w:r>
         <w:rPr>
-          <w:color w:val="EE0000"/>
+          <w:color w:val="000000" w:themeColor="text1"/>
         </w:rPr>
         <w:t xml:space="preserve">naturally will </w:t>
       </w:r>
       <w:r>
         <w:rPr>
-          <w:color w:val="EE0000"/>
+          <w:color w:val="000000" w:themeColor="text1"/>
         </w:rPr>
         <w:t>expand</w:t>
       </w:r>
       <w:r>
         <w:rPr>
-          <w:color w:val="EE0000"/>
+          <w:color w:val="000000" w:themeColor="text1"/>
         </w:rPr>
         <w:t xml:space="preserve"> as </w:t>
       </w:r>
       <w:r>
         <w:rPr>
-          <w:color w:val="EE0000"/>
+          <w:color w:val="000000" w:themeColor="text1"/>
         </w:rPr>
         <w:t>the economy expands</w:t>
       </w:r>
       <w:r>
         <w:rPr>
-          <w:color w:val="EE0000"/>
+          <w:color w:val="000000" w:themeColor="text1"/>
         </w:rPr>
         <w:t>, or vice versa</w:t>
       </w:r>
       <w:r>
         <w:rPr>
-          <w:color w:val="EE0000"/>
+          <w:color w:val="000000" w:themeColor="text1"/>
         </w:rPr>
         <w:t xml:space="preserve">. </w:t>
       </w:r>
@@ -12496,144 +13010,144 @@
       <w:pPr>
         <w:ind w:firstLine="720"/>
         <w:rPr>
-          <w:color w:val="EE0000"/>
+          <w:color w:val="000000" w:themeColor="text1"/>
         </w:rPr>
       </w:pPr>
       <w:r>
         <w:rPr>
-          <w:color w:val="EE0000"/>
+          <w:color w:val="000000" w:themeColor="text1"/>
         </w:rPr>
         <w:t>So, to improve the model</w:t>
       </w:r>
       <w:r>
         <w:rPr>
-          <w:color w:val="EE0000"/>
+          <w:color w:val="000000" w:themeColor="text1"/>
         </w:rPr>
         <w:t xml:space="preserve"> there must be controls for </w:t>
       </w:r>
       <w:r>
         <w:rPr>
-          <w:color w:val="EE0000"/>
+          <w:color w:val="000000" w:themeColor="text1"/>
         </w:rPr>
         <w:t xml:space="preserve">variables that </w:t>
       </w:r>
       <w:r>
         <w:rPr>
-          <w:color w:val="EE0000"/>
+          <w:color w:val="000000" w:themeColor="text1"/>
         </w:rPr>
         <w:t>are constant across entities but still change over time and space</w:t>
       </w:r>
       <w:r>
         <w:rPr>
-          <w:color w:val="EE0000"/>
-        </w:rPr>
-        <w:t>,</w:t>
-      </w:r>
-      <w:r>
-        <w:rPr>
-          <w:color w:val="EE0000"/>
-        </w:rPr>
-        <w:t xml:space="preserve"> affecting the regression results. Such as </w:t>
-      </w:r>
-      <w:r>
-        <w:rPr>
-          <w:color w:val="EE0000"/>
+          <w:color w:val="000000" w:themeColor="text1"/>
+        </w:rPr>
+        <w:t xml:space="preserve">. </w:t>
+      </w:r>
+      <w:r>
+        <w:rPr>
+          <w:color w:val="000000" w:themeColor="text1"/>
+        </w:rPr>
+        <w:t xml:space="preserve">Such as </w:t>
+      </w:r>
+      <w:r>
+        <w:rPr>
+          <w:color w:val="000000" w:themeColor="text1"/>
         </w:rPr>
         <w:t>yearly shocks</w:t>
       </w:r>
       <w:r>
         <w:rPr>
-          <w:color w:val="EE0000"/>
+          <w:color w:val="000000" w:themeColor="text1"/>
         </w:rPr>
         <w:t xml:space="preserve">, </w:t>
       </w:r>
       <w:r>
         <w:rPr>
-          <w:color w:val="EE0000"/>
+          <w:color w:val="000000" w:themeColor="text1"/>
         </w:rPr>
         <w:t xml:space="preserve">state </w:t>
       </w:r>
       <w:r>
         <w:rPr>
-          <w:color w:val="EE0000"/>
+          <w:color w:val="000000" w:themeColor="text1"/>
         </w:rPr>
         <w:t>policies</w:t>
       </w:r>
       <w:r>
         <w:rPr>
-          <w:color w:val="EE0000"/>
+          <w:color w:val="000000" w:themeColor="text1"/>
         </w:rPr>
         <w:t xml:space="preserve">, </w:t>
       </w:r>
       <w:r>
         <w:rPr>
-          <w:color w:val="EE0000"/>
+          <w:color w:val="000000" w:themeColor="text1"/>
         </w:rPr>
         <w:t>industry practices</w:t>
       </w:r>
       <w:r>
         <w:rPr>
-          <w:color w:val="EE0000"/>
+          <w:color w:val="000000" w:themeColor="text1"/>
         </w:rPr>
         <w:t xml:space="preserve">, </w:t>
       </w:r>
       <w:r>
         <w:rPr>
-          <w:color w:val="EE0000"/>
+          <w:color w:val="000000" w:themeColor="text1"/>
         </w:rPr>
         <w:t xml:space="preserve">and </w:t>
       </w:r>
       <w:r>
         <w:rPr>
-          <w:color w:val="EE0000"/>
+          <w:color w:val="000000" w:themeColor="text1"/>
         </w:rPr>
         <w:t>firm culture</w:t>
       </w:r>
       <w:r>
         <w:rPr>
-          <w:color w:val="EE0000"/>
+          <w:color w:val="000000" w:themeColor="text1"/>
         </w:rPr>
         <w:t xml:space="preserve"> -</w:t>
       </w:r>
       <w:r>
         <w:rPr>
-          <w:color w:val="EE0000"/>
+          <w:color w:val="000000" w:themeColor="text1"/>
         </w:rPr>
         <w:t xml:space="preserve"> </w:t>
       </w:r>
       <w:r>
         <w:rPr>
-          <w:color w:val="EE0000"/>
+          <w:color w:val="000000" w:themeColor="text1"/>
         </w:rPr>
         <w:t>to name a few</w:t>
       </w:r>
       <w:r>
         <w:rPr>
-          <w:color w:val="EE0000"/>
+          <w:color w:val="000000" w:themeColor="text1"/>
         </w:rPr>
         <w:t xml:space="preserve"> </w:t>
       </w:r>
       <w:r>
         <w:rPr>
-          <w:color w:val="EE0000"/>
+          <w:color w:val="000000" w:themeColor="text1"/>
         </w:rPr>
         <w:t xml:space="preserve">potentially </w:t>
       </w:r>
       <w:r>
         <w:rPr>
-          <w:color w:val="EE0000"/>
+          <w:color w:val="000000" w:themeColor="text1"/>
         </w:rPr>
         <w:t>omitted variables</w:t>
       </w:r>
       <w:r>
         <w:rPr>
-          <w:color w:val="EE0000"/>
+          <w:color w:val="000000" w:themeColor="text1"/>
         </w:rPr>
         <w:t>.</w:t>
       </w:r>
       <w:r>
         <w:rPr>
-          <w:color w:val="EE0000"/>
+          <w:color w:val="000000" w:themeColor="text1"/>
         </w:rPr>
         <w:t xml:space="preserve"> </w:t>
       </w:r>
@@ -12642,29 +13156,11 @@
       <w:pPr>
         <w:pStyle w:val="Heading3"/>
       </w:pPr>
-      <w:bookmarkStart w:id="18" w:name="_Toc223509217"/>
-      <w:r>
-        <w:t xml:space="preserve">Model </w:t>
-      </w:r>
-      <w:proofErr w:type="gramStart"/>
-      <w:r>
-        <w:t>2</w:t>
-      </w:r>
-      <w:bookmarkEnd w:id="18"/>
-      <w:proofErr w:type="gramEnd"/>
-    </w:p>
-    <w:p>
-      <w:pPr>
-        <w:ind w:firstLine="720"/>
-      </w:pPr>
-      <w:r>
-        <w:t>By controlling for each year of data…</w:t>
-      </w:r>
-    </w:p>
-    <w:p>
-      <w:r>
-        <w:t xml:space="preserve">This updates the model to: </w:t>
-      </w:r>
+      <w:bookmarkStart w:id="20" w:name="_Toc224065641"/>
+      <w:r>
+        <w:t>Model 2</w:t>
+      </w:r>
+      <w:bookmarkEnd w:id="20"/>
     </w:p>
     <w:p>
       <m:oMathPara>
@@ -12755,6 +13251,38 @@
               </m:ctrlPr>
             </m:sSubPr>
             <m:e>
+              <m:sSub>
+                <m:sSubPr>
+                  <m:ctrlPr>
+                    <w:rPr>
+                      <w:rFonts w:ascii="Cambria Math" w:hAnsi="Cambria Math"/>
+                      <w:i/>
+                    </w:rPr>
+                  </m:ctrlPr>
+                </m:sSubPr>
+                <m:e>
+                  <m:r>
+                    <w:rPr>
+                      <w:rFonts w:ascii="Cambria Math" w:hAnsi="Cambria Math"/>
+                    </w:rPr>
+                    <m:t>β</m:t>
+                  </m:r>
+                </m:e>
+                <m:sub>
+                  <m:r>
+                    <w:rPr>
+                      <w:rFonts w:ascii="Cambria Math" w:hAnsi="Cambria Math"/>
+                    </w:rPr>
+                    <m:t>0</m:t>
+                  </m:r>
+                </m:sub>
+              </m:sSub>
+              <m:r>
+                <w:rPr>
+                  <w:rFonts w:ascii="Cambria Math" w:hAnsi="Cambria Math"/>
+                </w:rPr>
+                <m:t>+</m:t>
+              </m:r>
               <m:r>
                 <w:rPr>
                   <w:rFonts w:ascii="Cambria Math" w:hAnsi="Cambria Math"/>
@@ -12868,33 +13396,316 @@
         </m:oMath>
       </m:oMathPara>
     </w:p>
-    <w:p/>
-    <w:p/>
-    <w:p/>
+    <w:p>
+      <w:pPr>
+        <w:pStyle w:val="Editing"/>
+      </w:pPr>
+      <w:r>
+        <w:lastRenderedPageBreak/>
+        <w:t xml:space="preserve">Where Yyear = etc. </w:t>
+      </w:r>
+    </w:p>
+    <w:p>
+      <w:pPr>
+        <w:ind w:firstLine="720"/>
+      </w:pPr>
+      <w:r>
+        <w:t>By controlling for each year of data</w:t>
+      </w:r>
+      <w:r>
+        <w:t xml:space="preserve">, this model is improved because it controls for any shocks that would affect all the organizations in a given year, </w:t>
+      </w:r>
+      <w:r>
+        <w:t xml:space="preserve">so that </w:t>
+      </w:r>
+      <m:oMath>
+        <m:sSub>
+          <m:sSubPr>
+            <m:ctrlPr>
+              <w:rPr>
+                <w:rFonts w:ascii="Cambria Math" w:hAnsi="Cambria Math"/>
+                <w:i/>
+              </w:rPr>
+            </m:ctrlPr>
+          </m:sSubPr>
+          <m:e>
+            <m:r>
+              <w:rPr>
+                <w:rFonts w:ascii="Cambria Math" w:hAnsi="Cambria Math"/>
+              </w:rPr>
+              <m:t>β</m:t>
+            </m:r>
+          </m:e>
+          <m:sub>
+            <m:r>
+              <w:rPr>
+                <w:rFonts w:ascii="Cambria Math" w:hAnsi="Cambria Math"/>
+              </w:rPr>
+              <m:t>1</m:t>
+            </m:r>
+          </m:sub>
+        </m:sSub>
+      </m:oMath>
+      <w:r>
+        <w:t xml:space="preserve"> </w:t>
+      </w:r>
+      <w:r>
+        <w:t xml:space="preserve">reflects a more precise relationship between the change in GDP and </w:t>
+      </w:r>
+      <w:r>
+        <w:t xml:space="preserve">program expenses. This is useful because </w:t>
+      </w:r>
+      <w:r>
+        <w:t>i</w:t>
+      </w:r>
+      <w:r>
+        <w:t xml:space="preserve">t isolates variation that is more plausibly tied to </w:t>
+      </w:r>
+      <w:r>
+        <w:t xml:space="preserve">yearly </w:t>
+      </w:r>
+      <w:r>
+        <w:t xml:space="preserve">GDP fluctuations </w:t>
+      </w:r>
+      <w:r>
+        <w:t>themselves</w:t>
+      </w:r>
+      <w:r>
+        <w:t xml:space="preserve">, rather than a </w:t>
+      </w:r>
+      <w:r>
+        <w:t xml:space="preserve">generic </w:t>
+      </w:r>
+      <w:r>
+        <w:t>trend</w:t>
+      </w:r>
+      <w:r>
+        <w:t xml:space="preserve"> across all time</w:t>
+      </w:r>
+      <w:r>
+        <w:t>.</w:t>
+      </w:r>
+    </w:p>
+    <w:p>
+      <w:pPr>
+        <w:ind w:firstLine="720"/>
+      </w:pPr>
+      <w:r>
+        <w:t xml:space="preserve">However, this model still suffers from OVB because organizations across different states </w:t>
+      </w:r>
+      <w:r>
+        <w:t xml:space="preserve">can </w:t>
+      </w:r>
+      <w:r>
+        <w:t xml:space="preserve">face </w:t>
+      </w:r>
+      <w:r>
+        <w:t>quite different</w:t>
+      </w:r>
+      <w:r>
+        <w:t xml:space="preserve"> economic environments that are not yet controlled for. </w:t>
+      </w:r>
+      <w:r>
+        <w:t>A</w:t>
+      </w:r>
+      <w:r>
+        <w:t xml:space="preserve"> non-profit operating in a </w:t>
+      </w:r>
+      <w:r>
+        <w:t>highly</w:t>
+      </w:r>
+      <w:r>
+        <w:t xml:space="preserve"> regulated state may behave differently than one </w:t>
+      </w:r>
+      <w:r>
+        <w:t xml:space="preserve">with a different </w:t>
+      </w:r>
+      <w:r>
+        <w:t>set of conditions</w:t>
+      </w:r>
+      <w:r>
+        <w:t>.</w:t>
+      </w:r>
+      <w:r>
+        <w:t xml:space="preserve"> </w:t>
+      </w:r>
+    </w:p>
+    <w:p>
+      <w:pPr>
+        <w:ind w:firstLine="720"/>
+      </w:pPr>
+      <w:r>
+        <w:t>To improve this model, controls must be added for differences across states</w:t>
+      </w:r>
+      <w:r>
+        <w:t xml:space="preserve"> to capture</w:t>
+      </w:r>
+      <w:r>
+        <w:t xml:space="preserve"> variation</w:t>
+      </w:r>
+      <w:r>
+        <w:t>s</w:t>
+      </w:r>
+      <w:r>
+        <w:t xml:space="preserve"> in state-level policy, </w:t>
+      </w:r>
+      <w:r>
+        <w:t>culture</w:t>
+      </w:r>
+      <w:r>
+        <w:t>, and economic conditions that affect how non-profits allocate their program expenses.</w:t>
+      </w:r>
+    </w:p>
     <w:p>
       <w:pPr>
         <w:pStyle w:val="Heading3"/>
       </w:pPr>
-      <w:bookmarkStart w:id="19" w:name="_Toc223509218"/>
-      <w:r>
-        <w:t xml:space="preserve">Model </w:t>
-      </w:r>
-      <w:proofErr w:type="gramStart"/>
-      <w:r>
-        <w:t>3</w:t>
-      </w:r>
-      <w:bookmarkEnd w:id="19"/>
-      <w:proofErr w:type="gramEnd"/>
+      <w:bookmarkStart w:id="21" w:name="_Toc224065642"/>
+      <w:r>
+        <w:t>Model 3</w:t>
+      </w:r>
+      <w:bookmarkEnd w:id="21"/>
     </w:p>
     <w:p>
-      <w:r>
-        <w:t>Now, by controlling each state</w:t>
-      </w:r>
-      <w:r>
-        <w:t>…</w:t>
+      <w:pPr>
+        <w:ind w:firstLine="720"/>
+      </w:pPr>
+      <w:r>
+        <w:t>Adding state fixed effects to the model</w:t>
+      </w:r>
+      <w:r>
+        <w:t xml:space="preserve"> controls for this variation across geography. </w:t>
+      </w:r>
+      <w:r>
+        <w:t xml:space="preserve">The following model </w:t>
+      </w:r>
+      <w:r>
+        <w:t>absorbs differences</w:t>
+      </w:r>
+      <w:r>
+        <w:t xml:space="preserve"> across states that are the same for organizations in the same state. This effect is represented by </w:t>
+      </w:r>
+      <m:oMath>
+        <m:sSub>
+          <m:sSubPr>
+            <m:ctrlPr>
+              <w:rPr>
+                <w:rFonts w:ascii="Cambria Math" w:hAnsi="Cambria Math"/>
+                <w:bCs/>
+                <w:i/>
+                <w:kern w:val="0"/>
+                <w14:ligatures w14:val="none"/>
+              </w:rPr>
+            </m:ctrlPr>
+          </m:sSubPr>
+          <m:e>
+            <m:r>
+              <w:rPr>
+                <w:rFonts w:ascii="Cambria Math" w:hAnsi="Cambria Math"/>
+                <w:color w:val="auto"/>
+                <w:kern w:val="0"/>
+                <w14:ligatures w14:val="none"/>
+              </w:rPr>
+              <m:t>α</m:t>
+            </m:r>
+          </m:e>
+          <m:sub>
+            <m:r>
+              <w:rPr>
+                <w:rFonts w:ascii="Cambria Math" w:hAnsi="Cambria Math"/>
+                <w:color w:val="auto"/>
+                <w:kern w:val="0"/>
+                <w14:ligatures w14:val="none"/>
+              </w:rPr>
+              <m:t>state</m:t>
+            </m:r>
+          </m:sub>
+        </m:sSub>
+      </m:oMath>
+      <w:r>
+        <w:rPr>
+          <w:bCs/>
+          <w:kern w:val="0"/>
+          <w14:ligatures w14:val="none"/>
+        </w:rPr>
+        <w:t xml:space="preserve"> and no longer biases </w:t>
+      </w:r>
+      <m:oMath>
+        <m:sSub>
+          <m:sSubPr>
+            <m:ctrlPr>
+              <w:rPr>
+                <w:rFonts w:ascii="Cambria Math" w:hAnsi="Cambria Math"/>
+                <w:bCs/>
+                <w:i/>
+                <w:kern w:val="0"/>
+                <w14:ligatures w14:val="none"/>
+              </w:rPr>
+            </m:ctrlPr>
+          </m:sSubPr>
+          <m:e>
+            <m:r>
+              <w:rPr>
+                <w:rFonts w:ascii="Cambria Math" w:hAnsi="Cambria Math"/>
+                <w:kern w:val="0"/>
+                <w14:ligatures w14:val="none"/>
+              </w:rPr>
+              <m:t>β</m:t>
+            </m:r>
+          </m:e>
+          <m:sub>
+            <m:r>
+              <w:rPr>
+                <w:rFonts w:ascii="Cambria Math" w:hAnsi="Cambria Math"/>
+                <w:kern w:val="0"/>
+                <w14:ligatures w14:val="none"/>
+              </w:rPr>
+              <m:t>1</m:t>
+            </m:r>
+          </m:sub>
+        </m:sSub>
+      </m:oMath>
+      <w:r>
+        <w:rPr>
+          <w:bCs/>
+          <w:kern w:val="0"/>
+          <w14:ligatures w14:val="none"/>
+        </w:rPr>
+        <w:t>,</w:t>
+      </w:r>
+      <w:r>
+        <w:rPr>
+          <w:bCs/>
+          <w:kern w:val="0"/>
+          <w14:ligatures w14:val="none"/>
+        </w:rPr>
+        <w:t xml:space="preserve"> </w:t>
+      </w:r>
+      <w:r>
+        <w:rPr>
+          <w:bCs/>
+          <w:kern w:val="0"/>
+          <w14:ligatures w14:val="none"/>
+        </w:rPr>
+        <w:t xml:space="preserve">a main focus of this thesis, </w:t>
+      </w:r>
+      <w:r>
+        <w:rPr>
+          <w:bCs/>
+          <w:kern w:val="0"/>
+          <w14:ligatures w14:val="none"/>
+        </w:rPr>
+        <w:t xml:space="preserve">in the model. </w:t>
       </w:r>
     </w:p>
     <w:p>
+      <w:pPr>
+        <w:rPr>
+          <w:color w:val="auto"/>
+          <w:kern w:val="0"/>
+          <w14:ligatures w14:val="none"/>
+        </w:rPr>
+      </w:pPr>
       <m:oMathPara>
         <m:oMath>
           <m:sSub>
@@ -12968,6 +13779,38 @@
               <w14:ligatures w14:val="none"/>
             </w:rPr>
             <m:t>=</m:t>
+          </m:r>
+          <m:sSub>
+            <m:sSubPr>
+              <m:ctrlPr>
+                <w:rPr>
+                  <w:rFonts w:ascii="Cambria Math" w:hAnsi="Cambria Math"/>
+                  <w:i/>
+                </w:rPr>
+              </m:ctrlPr>
+            </m:sSubPr>
+            <m:e>
+              <m:r>
+                <w:rPr>
+                  <w:rFonts w:ascii="Cambria Math" w:hAnsi="Cambria Math"/>
+                </w:rPr>
+                <m:t>β</m:t>
+              </m:r>
+            </m:e>
+            <m:sub>
+              <m:r>
+                <w:rPr>
+                  <w:rFonts w:ascii="Cambria Math" w:hAnsi="Cambria Math"/>
+                </w:rPr>
+                <m:t>0</m:t>
+              </m:r>
+            </m:sub>
+          </m:sSub>
+          <m:r>
+            <w:rPr>
+              <w:rFonts w:ascii="Cambria Math" w:hAnsi="Cambria Math"/>
+            </w:rPr>
+            <m:t>+</m:t>
           </m:r>
           <m:sSub>
             <m:sSubPr>
@@ -13142,16 +13985,364 @@
     </w:p>
     <w:p>
       <w:pPr>
+        <w:pStyle w:val="Editing"/>
+      </w:pPr>
+      <w:r>
+        <w:tab/>
+        <w:t xml:space="preserve">Where Astate = etc. </w:t>
+      </w:r>
+    </w:p>
+    <w:p>
+      <w:pPr>
+        <w:ind w:firstLine="720"/>
+        <w:rPr>
+          <w:bCs/>
+          <w:kern w:val="0"/>
+          <w14:ligatures w14:val="none"/>
+        </w:rPr>
+      </w:pPr>
+      <w:r>
+        <w:rPr>
+          <w:color w:val="auto"/>
+          <w:kern w:val="0"/>
+          <w14:ligatures w14:val="none"/>
+        </w:rPr>
+        <w:lastRenderedPageBreak/>
+        <w:t xml:space="preserve">Interpreting this model </w:t>
+      </w:r>
+      <w:r>
+        <w:rPr>
+          <w:color w:val="auto"/>
+          <w:kern w:val="0"/>
+          <w14:ligatures w14:val="none"/>
+        </w:rPr>
+        <w:t xml:space="preserve">is </w:t>
+      </w:r>
+      <w:r>
+        <w:rPr>
+          <w:color w:val="auto"/>
+          <w:kern w:val="0"/>
+          <w14:ligatures w14:val="none"/>
+        </w:rPr>
+        <w:t>similar</w:t>
+      </w:r>
+      <w:r>
+        <w:rPr>
+          <w:color w:val="auto"/>
+          <w:kern w:val="0"/>
+          <w14:ligatures w14:val="none"/>
+        </w:rPr>
+        <w:t xml:space="preserve"> to Models 1, 2, and the following fixed-effects models</w:t>
+      </w:r>
+      <w:r>
+        <w:rPr>
+          <w:color w:val="auto"/>
+          <w:kern w:val="0"/>
+          <w14:ligatures w14:val="none"/>
+        </w:rPr>
+        <w:t>.</w:t>
+      </w:r>
+      <w:r>
+        <w:rPr>
+          <w:color w:val="auto"/>
+          <w:kern w:val="0"/>
+          <w14:ligatures w14:val="none"/>
+        </w:rPr>
+        <w:t xml:space="preserve"> T</w:t>
+      </w:r>
+      <w:r>
+        <w:rPr>
+          <w:color w:val="auto"/>
+          <w:kern w:val="0"/>
+          <w14:ligatures w14:val="none"/>
+        </w:rPr>
+        <w:t xml:space="preserve">he estimate for </w:t>
+      </w:r>
+      <m:oMath>
+        <m:sSub>
+          <m:sSubPr>
+            <m:ctrlPr>
+              <w:rPr>
+                <w:rFonts w:ascii="Cambria Math" w:hAnsi="Cambria Math"/>
+                <w:bCs/>
+                <w:i/>
+                <w:kern w:val="0"/>
+                <w14:ligatures w14:val="none"/>
+              </w:rPr>
+            </m:ctrlPr>
+          </m:sSubPr>
+          <m:e>
+            <m:r>
+              <w:rPr>
+                <w:rFonts w:ascii="Cambria Math" w:hAnsi="Cambria Math"/>
+                <w:kern w:val="0"/>
+                <w14:ligatures w14:val="none"/>
+              </w:rPr>
+              <m:t>β</m:t>
+            </m:r>
+          </m:e>
+          <m:sub>
+            <m:r>
+              <w:rPr>
+                <w:rFonts w:ascii="Cambria Math" w:hAnsi="Cambria Math"/>
+                <w:kern w:val="0"/>
+                <w14:ligatures w14:val="none"/>
+              </w:rPr>
+              <m:t>1</m:t>
+            </m:r>
+          </m:sub>
+        </m:sSub>
+      </m:oMath>
+      <w:r>
+        <w:rPr>
+          <w:bCs/>
+          <w:kern w:val="0"/>
+          <w14:ligatures w14:val="none"/>
+        </w:rPr>
+        <w:t xml:space="preserve"> will be less </w:t>
+      </w:r>
+      <w:r>
+        <w:rPr>
+          <w:bCs/>
+          <w:kern w:val="0"/>
+          <w14:ligatures w14:val="none"/>
+        </w:rPr>
+        <w:t xml:space="preserve">biased </w:t>
+      </w:r>
+      <w:r>
+        <w:rPr>
+          <w:bCs/>
+          <w:kern w:val="0"/>
+          <w14:ligatures w14:val="none"/>
+        </w:rPr>
+        <w:t xml:space="preserve">than prior models </w:t>
+      </w:r>
+      <w:r>
+        <w:rPr>
+          <w:bCs/>
+          <w:kern w:val="0"/>
+          <w14:ligatures w14:val="none"/>
+        </w:rPr>
+        <w:t>and</w:t>
+      </w:r>
+      <w:r>
+        <w:rPr>
+          <w:bCs/>
+          <w:kern w:val="0"/>
+          <w14:ligatures w14:val="none"/>
+        </w:rPr>
+        <w:t xml:space="preserve"> calculated as an average of the effect for each year and state</w:t>
+      </w:r>
+      <w:r>
+        <w:rPr>
+          <w:bCs/>
+          <w:kern w:val="0"/>
+          <w14:ligatures w14:val="none"/>
+        </w:rPr>
+        <w:t xml:space="preserve">. </w:t>
+      </w:r>
+    </w:p>
+    <w:p>
+      <w:pPr>
+        <w:ind w:firstLine="720"/>
+        <w:rPr>
+          <w:bCs/>
+          <w:kern w:val="0"/>
+          <w14:ligatures w14:val="none"/>
+        </w:rPr>
+      </w:pPr>
+      <w:r>
+        <w:rPr>
+          <w:bCs/>
+          <w:kern w:val="0"/>
+          <w14:ligatures w14:val="none"/>
+        </w:rPr>
+        <w:t xml:space="preserve">However, many </w:t>
+      </w:r>
+      <w:r>
+        <w:rPr>
+          <w:bCs/>
+          <w:kern w:val="0"/>
+          <w14:ligatures w14:val="none"/>
+        </w:rPr>
+        <w:t>omitted variables may still exist in this model</w:t>
+      </w:r>
+      <w:r>
+        <w:rPr>
+          <w:bCs/>
+          <w:kern w:val="0"/>
+          <w14:ligatures w14:val="none"/>
+        </w:rPr>
+        <w:t xml:space="preserve"> because of industry-wide trends and firm-specific practices.</w:t>
+      </w:r>
+      <w:r>
+        <w:rPr>
+          <w:bCs/>
+          <w:kern w:val="0"/>
+          <w14:ligatures w14:val="none"/>
+        </w:rPr>
+        <w:t xml:space="preserve"> </w:t>
+      </w:r>
+    </w:p>
+    <w:p>
+      <w:pPr>
+        <w:ind w:firstLine="720"/>
+      </w:pPr>
+      <w:r>
+        <w:rPr>
+          <w:bCs/>
+          <w:kern w:val="0"/>
+          <w14:ligatures w14:val="none"/>
+        </w:rPr>
+        <w:t xml:space="preserve">To improve this model further, </w:t>
+      </w:r>
+      <w:r>
+        <w:rPr>
+          <w:bCs/>
+          <w:kern w:val="0"/>
+          <w14:ligatures w14:val="none"/>
+        </w:rPr>
+        <w:t>Mauri and Max (</w:t>
+      </w:r>
+      <w:r>
+        <w:rPr>
+          <w:bCs/>
+          <w:kern w:val="0"/>
+          <w14:ligatures w14:val="none"/>
+        </w:rPr>
+        <w:t xml:space="preserve">1998) find that </w:t>
+      </w:r>
+      <w:r>
+        <w:rPr>
+          <w:bCs/>
+          <w:kern w:val="0"/>
+          <w14:ligatures w14:val="none"/>
+        </w:rPr>
+        <w:t>it would be useful to control</w:t>
+      </w:r>
+      <w:r>
+        <w:rPr>
+          <w:bCs/>
+          <w:kern w:val="0"/>
+          <w14:ligatures w14:val="none"/>
+        </w:rPr>
+        <w:t xml:space="preserve"> for</w:t>
+      </w:r>
+      <w:r>
+        <w:rPr>
+          <w:bCs/>
+          <w:kern w:val="0"/>
+          <w14:ligatures w14:val="none"/>
+        </w:rPr>
+        <w:t xml:space="preserve"> the</w:t>
+      </w:r>
+      <w:r>
+        <w:rPr>
+          <w:bCs/>
+          <w:kern w:val="0"/>
+          <w14:ligatures w14:val="none"/>
+        </w:rPr>
+        <w:t xml:space="preserve"> industry of companies </w:t>
+      </w:r>
+      <w:r>
+        <w:rPr>
+          <w:bCs/>
+          <w:kern w:val="0"/>
+          <w14:ligatures w14:val="none"/>
+        </w:rPr>
+        <w:t>and at the individual, firm level.</w:t>
+      </w:r>
+      <w:r>
+        <w:rPr>
+          <w:rStyle w:val="FootnoteReference"/>
+          <w:bCs/>
+          <w:kern w:val="0"/>
+          <w14:ligatures w14:val="none"/>
+        </w:rPr>
+        <w:footnoteReference w:id="16"/>
+      </w:r>
+      <w:r>
+        <w:rPr>
+          <w:bCs/>
+          <w:kern w:val="0"/>
+          <w14:ligatures w14:val="none"/>
+        </w:rPr>
+        <w:t xml:space="preserve"> This can</w:t>
+      </w:r>
+      <w:r>
+        <w:rPr>
+          <w:bCs/>
+          <w:kern w:val="0"/>
+          <w14:ligatures w14:val="none"/>
+        </w:rPr>
+        <w:t xml:space="preserve"> help </w:t>
+      </w:r>
+      <w:r>
+        <w:rPr>
+          <w:bCs/>
+          <w:kern w:val="0"/>
+          <w14:ligatures w14:val="none"/>
+        </w:rPr>
+        <w:t>refine the results because companies have similar strategies to competitors. Further,</w:t>
+      </w:r>
+      <w:r>
+        <w:rPr>
+          <w:bCs/>
+          <w:kern w:val="0"/>
+          <w14:ligatures w14:val="none"/>
+        </w:rPr>
+        <w:t xml:space="preserve"> e</w:t>
+      </w:r>
+      <w:r>
+        <w:rPr>
+          <w:bCs/>
+          <w:kern w:val="0"/>
+          <w14:ligatures w14:val="none"/>
+        </w:rPr>
+        <w:t>ach company has unique set of resources, even in the same industry</w:t>
+      </w:r>
+      <w:r>
+        <w:rPr>
+          <w:bCs/>
+          <w:kern w:val="0"/>
+          <w14:ligatures w14:val="none"/>
+        </w:rPr>
+        <w:t xml:space="preserve">, creating a unique </w:t>
+      </w:r>
+      <w:r>
+        <w:rPr>
+          <w:bCs/>
+          <w:kern w:val="0"/>
+          <w14:ligatures w14:val="none"/>
+        </w:rPr>
+        <w:t xml:space="preserve">effect of firm financial choices </w:t>
+      </w:r>
+      <w:r>
+        <w:rPr>
+          <w:bCs/>
+          <w:kern w:val="0"/>
+          <w14:ligatures w14:val="none"/>
+        </w:rPr>
+        <w:t>for this thesis</w:t>
+      </w:r>
+      <w:r>
+        <w:rPr>
+          <w:bCs/>
+          <w:kern w:val="0"/>
+          <w14:ligatures w14:val="none"/>
+        </w:rPr>
+        <w:t>.</w:t>
+      </w:r>
+    </w:p>
+    <w:p>
+      <w:pPr>
         <w:pStyle w:val="Heading3"/>
       </w:pPr>
-      <w:r>
-        <w:t xml:space="preserve">Model </w:t>
-      </w:r>
-      <w:proofErr w:type="gramStart"/>
-      <w:r>
-        <w:t>4</w:t>
-      </w:r>
-      <w:proofErr w:type="gramEnd"/>
+      <w:bookmarkStart w:id="22" w:name="_Toc224065643"/>
+      <w:r>
+        <w:t>Model 4</w:t>
+      </w:r>
+      <w:bookmarkEnd w:id="22"/>
     </w:p>
     <w:p>
       <w:r>
@@ -13247,6 +14438,38 @@
               </m:ctrlPr>
             </m:sSubPr>
             <m:e>
+              <m:sSub>
+                <m:sSubPr>
+                  <m:ctrlPr>
+                    <w:rPr>
+                      <w:rFonts w:ascii="Cambria Math" w:hAnsi="Cambria Math"/>
+                      <w:i/>
+                    </w:rPr>
+                  </m:ctrlPr>
+                </m:sSubPr>
+                <m:e>
+                  <m:r>
+                    <w:rPr>
+                      <w:rFonts w:ascii="Cambria Math" w:hAnsi="Cambria Math"/>
+                    </w:rPr>
+                    <m:t>β</m:t>
+                  </m:r>
+                </m:e>
+                <m:sub>
+                  <m:r>
+                    <w:rPr>
+                      <w:rFonts w:ascii="Cambria Math" w:hAnsi="Cambria Math"/>
+                    </w:rPr>
+                    <m:t>0</m:t>
+                  </m:r>
+                </m:sub>
+              </m:sSub>
+              <m:r>
+                <w:rPr>
+                  <w:rFonts w:ascii="Cambria Math" w:hAnsi="Cambria Math"/>
+                </w:rPr>
+                <m:t>+</m:t>
+              </m:r>
               <m:r>
                 <w:rPr>
                   <w:rFonts w:ascii="Cambria Math" w:hAnsi="Cambria Math"/>
@@ -13451,18 +14674,18 @@
       <w:pPr>
         <w:pStyle w:val="Heading3"/>
       </w:pPr>
-      <w:r>
-        <w:t xml:space="preserve">Model </w:t>
-      </w:r>
-      <w:proofErr w:type="gramStart"/>
-      <w:r>
-        <w:t>5</w:t>
-      </w:r>
-      <w:proofErr w:type="gramEnd"/>
+      <w:bookmarkStart w:id="23" w:name="_Toc224065644"/>
+      <w:r>
+        <w:t>Model 5</w:t>
+      </w:r>
+      <w:bookmarkEnd w:id="23"/>
     </w:p>
     <w:p>
       <w:r>
-        <w:t>Adding firm fixed effects…</w:t>
+        <w:t>When possible, a</w:t>
+      </w:r>
+      <w:r>
+        <w:t>dding firm fixed effects…</w:t>
       </w:r>
     </w:p>
     <w:p>
@@ -13554,6 +14777,38 @@
               </m:ctrlPr>
             </m:sSubPr>
             <m:e>
+              <m:sSub>
+                <m:sSubPr>
+                  <m:ctrlPr>
+                    <w:rPr>
+                      <w:rFonts w:ascii="Cambria Math" w:hAnsi="Cambria Math"/>
+                      <w:i/>
+                    </w:rPr>
+                  </m:ctrlPr>
+                </m:sSubPr>
+                <m:e>
+                  <m:r>
+                    <w:rPr>
+                      <w:rFonts w:ascii="Cambria Math" w:hAnsi="Cambria Math"/>
+                    </w:rPr>
+                    <m:t>β</m:t>
+                  </m:r>
+                </m:e>
+                <m:sub>
+                  <m:r>
+                    <w:rPr>
+                      <w:rFonts w:ascii="Cambria Math" w:hAnsi="Cambria Math"/>
+                    </w:rPr>
+                    <m:t>0</m:t>
+                  </m:r>
+                </m:sub>
+              </m:sSub>
+              <m:r>
+                <w:rPr>
+                  <w:rFonts w:ascii="Cambria Math" w:hAnsi="Cambria Math"/>
+                </w:rPr>
+                <m:t>+</m:t>
+              </m:r>
               <m:r>
                 <w:rPr>
                   <w:rFonts w:ascii="Cambria Math" w:hAnsi="Cambria Math"/>
@@ -13811,7 +15066,7 @@
           <w:szCs w:val="28"/>
         </w:rPr>
       </w:pPr>
-      <w:bookmarkStart w:id="20" w:name="_Toc223509219"/>
+      <w:bookmarkStart w:id="24" w:name="_Toc224065645"/>
       <w:r>
         <w:rPr>
           <w:rFonts w:eastAsiaTheme="majorEastAsia" w:cstheme="majorBidi"/>
@@ -13819,10 +15074,9 @@
           <w:sz w:val="28"/>
           <w:szCs w:val="28"/>
         </w:rPr>
+        <w:lastRenderedPageBreak/>
         <w:t xml:space="preserve">Model </w:t>
       </w:r>
-      <w:bookmarkEnd w:id="20"/>
-      <w:proofErr w:type="gramStart"/>
       <w:r>
         <w:rPr>
           <w:rFonts w:eastAsiaTheme="majorEastAsia" w:cstheme="majorBidi"/>
@@ -13832,7 +15086,7 @@
         </w:rPr>
         <w:t>6</w:t>
       </w:r>
-      <w:proofErr w:type="gramEnd"/>
+      <w:bookmarkEnd w:id="24"/>
     </w:p>
     <w:p>
       <w:r>
@@ -13854,6 +15108,13 @@
       </w:r>
     </w:p>
     <w:p>
+      <w:pPr>
+        <w:rPr>
+          <w:color w:val="auto"/>
+          <w:kern w:val="0"/>
+          <w14:ligatures w14:val="none"/>
+        </w:rPr>
+      </w:pPr>
       <m:oMathPara>
         <m:oMath>
           <m:sSub>
@@ -13927,6 +15188,38 @@
               <w14:ligatures w14:val="none"/>
             </w:rPr>
             <m:t>=</m:t>
+          </m:r>
+          <m:sSub>
+            <m:sSubPr>
+              <m:ctrlPr>
+                <w:rPr>
+                  <w:rFonts w:ascii="Cambria Math" w:hAnsi="Cambria Math"/>
+                  <w:i/>
+                </w:rPr>
+              </m:ctrlPr>
+            </m:sSubPr>
+            <m:e>
+              <m:r>
+                <w:rPr>
+                  <w:rFonts w:ascii="Cambria Math" w:hAnsi="Cambria Math"/>
+                </w:rPr>
+                <m:t>β</m:t>
+              </m:r>
+            </m:e>
+            <m:sub>
+              <m:r>
+                <w:rPr>
+                  <w:rFonts w:ascii="Cambria Math" w:hAnsi="Cambria Math"/>
+                </w:rPr>
+                <m:t>0</m:t>
+              </m:r>
+            </m:sub>
+          </m:sSub>
+          <m:r>
+            <w:rPr>
+              <w:rFonts w:ascii="Cambria Math" w:hAnsi="Cambria Math"/>
+            </w:rPr>
+            <m:t>+</m:t>
           </m:r>
           <m:sSub>
             <m:sSubPr>
@@ -14296,6 +15589,43 @@
     </w:p>
     <w:p>
       <w:pPr>
+        <w:pStyle w:val="Heading3"/>
+      </w:pPr>
+      <w:r>
+        <w:t>Model 7</w:t>
+      </w:r>
+    </w:p>
+    <w:p>
+      <w:r>
+        <w:t xml:space="preserve">Explanatory variable experiments, repeated for </w:t>
+      </w:r>
+      <w:r>
+        <w:t xml:space="preserve">the key variables I chose. Need to expand this section and format it properly. </w:t>
+      </w:r>
+    </w:p>
+    <w:p>
+      <w:pPr>
+        <w:pStyle w:val="Heading3"/>
+      </w:pPr>
+      <w:r>
+        <w:t>Model 8</w:t>
+      </w:r>
+    </w:p>
+    <w:p>
+      <w:r>
+        <w:t xml:space="preserve">Covid interaction variable experiment. </w:t>
+      </w:r>
+    </w:p>
+    <w:p/>
+    <w:p>
+      <w:pPr>
+        <w:rPr>
+          <w:rFonts w:eastAsiaTheme="majorEastAsia"/>
+        </w:rPr>
+      </w:pPr>
+    </w:p>
+    <w:p>
+      <w:pPr>
         <w:spacing w:after="160" w:line="278" w:lineRule="auto"/>
         <w:rPr>
           <w:rFonts w:asciiTheme="majorHAnsi" w:eastAsiaTheme="majorEastAsia" w:hAnsiTheme="majorHAnsi" w:cstheme="majorBidi"/>
@@ -14304,7 +15634,7 @@
           <w:szCs w:val="40"/>
         </w:rPr>
       </w:pPr>
-      <w:bookmarkStart w:id="21" w:name="_Toc223509220"/>
+      <w:bookmarkStart w:id="25" w:name="_Toc224065646"/>
       <w:r>
         <w:br w:type="page"/>
       </w:r>
@@ -14317,9 +15647,46 @@
         <w:lastRenderedPageBreak/>
         <w:t>Results</w:t>
       </w:r>
-      <w:bookmarkEnd w:id="21"/>
+      <w:bookmarkEnd w:id="25"/>
     </w:p>
-    <w:p/>
+    <w:p>
+      <w:r>
+        <w:t xml:space="preserve">First, I conduct heterogeneity tests using Models 1-6. </w:t>
+      </w:r>
+    </w:p>
+    <w:p>
+      <w:pPr>
+        <w:pStyle w:val="Heading2"/>
+      </w:pPr>
+      <w:r>
+        <w:t>Heterogeneity Tests</w:t>
+      </w:r>
+    </w:p>
+    <w:p>
+      <w:commentRangeStart w:id="26"/>
+      <w:r>
+        <w:t xml:space="preserve">First, preliminary results showing the difference between each model, and proving that firm-fixed effects is the best one. </w:t>
+      </w:r>
+      <w:commentRangeEnd w:id="26"/>
+      <w:r>
+        <w:rPr>
+          <w:rStyle w:val="CommentReference"/>
+          <w:sz w:val="24"/>
+          <w:szCs w:val="24"/>
+        </w:rPr>
+        <w:commentReference w:id="26"/>
+      </w:r>
+    </w:p>
+    <w:p>
+      <w:r>
+        <w:t>Then divided across revenues.</w:t>
+      </w:r>
+    </w:p>
+    <w:p>
+      <w:r>
+        <w:t xml:space="preserve">Then divided across industries. </w:t>
+      </w:r>
+    </w:p>
     <w:p>
       <w:pPr>
         <w:spacing w:after="160" w:line="278" w:lineRule="auto"/>
@@ -14332,12 +15699,12 @@
       <w:pPr>
         <w:pStyle w:val="Heading1"/>
       </w:pPr>
-      <w:bookmarkStart w:id="22" w:name="_Toc223509221"/>
+      <w:bookmarkStart w:id="27" w:name="_Toc224065647"/>
       <w:r>
         <w:lastRenderedPageBreak/>
         <w:t>Analysis</w:t>
       </w:r>
-      <w:bookmarkEnd w:id="22"/>
+      <w:bookmarkEnd w:id="27"/>
     </w:p>
     <w:p>
       <w:pPr>
@@ -14351,31 +15718,144 @@
       <w:pPr>
         <w:pStyle w:val="Heading1"/>
       </w:pPr>
-      <w:bookmarkStart w:id="23" w:name="_Toc223509222"/>
+      <w:bookmarkStart w:id="28" w:name="_Toc224065648"/>
       <w:r>
         <w:lastRenderedPageBreak/>
         <w:t>Conclusion</w:t>
       </w:r>
-      <w:bookmarkEnd w:id="23"/>
+      <w:bookmarkEnd w:id="28"/>
     </w:p>
     <w:p>
       <w:pPr>
         <w:spacing w:after="160" w:line="278" w:lineRule="auto"/>
       </w:pPr>
+    </w:p>
+    <w:p>
+      <w:pPr>
+        <w:spacing w:after="160"/>
+        <w:ind w:firstLine="720"/>
+      </w:pPr>
+      <w:bookmarkStart w:id="29" w:name="_Toc224065649"/>
+      <w:r>
+        <w:t>For future research: have an even more granular analysis of financial decision making.</w:t>
+      </w:r>
+      <w:r>
+        <w:t xml:space="preserve"> I limited </w:t>
+      </w:r>
+      <w:r>
+        <w:t xml:space="preserve">myself </w:t>
+      </w:r>
+      <w:r>
+        <w:t xml:space="preserve">to </w:t>
+      </w:r>
+      <w:r>
+        <w:t xml:space="preserve">use </w:t>
+      </w:r>
+      <w:r>
+        <w:t xml:space="preserve">summarized financial information, instead of looking at the </w:t>
+      </w:r>
+      <w:r>
+        <w:t>separation</w:t>
+      </w:r>
+      <w:r>
+        <w:t>/</w:t>
+      </w:r>
+      <w:r>
+        <w:t>distribution</w:t>
+      </w:r>
+      <w:r>
+        <w:t>/weighing</w:t>
+      </w:r>
+      <w:r>
+        <w:t xml:space="preserve"> of revenue </w:t>
+      </w:r>
+      <w:r>
+        <w:t xml:space="preserve">and expense </w:t>
+      </w:r>
+      <w:r>
+        <w:t xml:space="preserve">sources, financial risks, </w:t>
+      </w:r>
+      <w:r>
+        <w:rPr>
+          <w:rStyle w:val="EditingChar"/>
+        </w:rPr>
+        <w:t>and other stuff</w:t>
+      </w:r>
+      <w:r>
+        <w:rPr>
+          <w:rStyle w:val="EditingChar"/>
+        </w:rPr>
+        <w:t>.</w:t>
+      </w:r>
+    </w:p>
+    <w:p>
+      <w:pPr>
+        <w:spacing w:after="160"/>
+        <w:ind w:firstLine="720"/>
+      </w:pPr>
+      <w:r>
+        <w:t xml:space="preserve">Also, </w:t>
+      </w:r>
+      <w:r>
+        <w:t>a future researcher should take a different approach by looking</w:t>
+      </w:r>
+      <w:r>
+        <w:t xml:space="preserve"> into changes in the balance sheet and other accounting decisions.</w:t>
+      </w:r>
+    </w:p>
+    <w:p>
+      <w:pPr>
+        <w:spacing w:after="160"/>
+        <w:ind w:firstLine="720"/>
+      </w:pPr>
+      <w:r>
+        <w:t>Also,</w:t>
+      </w:r>
+      <w:r>
+        <w:t xml:space="preserve"> it might be useful to </w:t>
+      </w:r>
+      <w:r>
+        <w:t>interview</w:t>
+      </w:r>
+      <w:r>
+        <w:t xml:space="preserve"> </w:t>
+      </w:r>
+      <w:r>
+        <w:t xml:space="preserve">non-profit directors, to see if these considerations for withstanding recessions, operating countercyclically, and responding to increased demand of philanthropy during a recession are even active </w:t>
+      </w:r>
+      <w:r>
+        <w:t>concerns</w:t>
+      </w:r>
+      <w:r>
+        <w:t xml:space="preserve"> by the leadership. </w:t>
+      </w:r>
+      <w:r>
+        <w:t xml:space="preserve">This would vastly strengthen any findings regarding ‘best’ practices to follow. </w:t>
+      </w:r>
       <w:r>
         <w:br w:type="page"/>
       </w:r>
+    </w:p>
+    <w:p>
+      <w:pPr>
+        <w:spacing w:after="160" w:line="278" w:lineRule="auto"/>
+        <w:ind w:firstLine="720"/>
+        <w:rPr>
+          <w:rFonts w:asciiTheme="majorHAnsi" w:eastAsiaTheme="majorEastAsia" w:hAnsiTheme="majorHAnsi" w:cstheme="majorBidi"/>
+          <w:color w:val="0F4761" w:themeColor="accent1" w:themeShade="BF"/>
+          <w:sz w:val="40"/>
+          <w:szCs w:val="40"/>
+        </w:rPr>
+      </w:pPr>
     </w:p>
     <w:p>
       <w:pPr>
         <w:pStyle w:val="Heading1"/>
       </w:pPr>
-      <w:bookmarkStart w:id="24" w:name="_Toc223509223"/>
-      <w:r>
-        <w:lastRenderedPageBreak/>
+      <w:r>
         <w:t>Bibliography</w:t>
       </w:r>
-      <w:bookmarkEnd w:id="24"/>
+      <w:bookmarkEnd w:id="29"/>
     </w:p>
     <w:p>
       <w:pPr>
@@ -14552,7 +16032,26 @@
       </w:r>
     </w:p>
   </w:comment>
-  <w:comment w:id="8" w:author="Tamen, Jonathan" w:date="2026-03-04T09:17:00Z" w:initials="JT">
+  <w:comment w:id="7" w:author="Tamen, Jonathan" w:date="2026-03-10T20:35:00Z" w:initials="TJ">
+    <w:p>
+      <w:r>
+        <w:rPr>
+          <w:rStyle w:val="CommentReference"/>
+        </w:rPr>
+        <w:annotationRef/>
+      </w:r>
+      <w:r>
+        <w:rPr>
+          <w:kern w:val="0"/>
+          <w:sz w:val="20"/>
+          <w:szCs w:val="20"/>
+          <w14:ligatures w14:val="none"/>
+        </w:rPr>
+        <w:t>What's another way to describe "organizations that continue to exist today and even ones that have dissolved or gone bankrupt"?</w:t>
+      </w:r>
+    </w:p>
+  </w:comment>
+  <w:comment w:id="9" w:author="Tamen, Jonathan" w:date="2026-03-04T09:17:00Z" w:initials="JT">
     <w:p>
       <w:pPr>
         <w:pStyle w:val="CommentText"/>
@@ -14568,7 +16067,7 @@
       </w:r>
     </w:p>
   </w:comment>
-  <w:comment w:id="9" w:author="Tamen, Jonathan" w:date="2026-02-28T12:10:00Z" w:initials="JT">
+  <w:comment w:id="10" w:author="Tamen, Jonathan" w:date="2026-02-28T12:10:00Z" w:initials="JT">
     <w:p>
       <w:pPr>
         <w:pStyle w:val="CommentText"/>
@@ -14584,7 +16083,7 @@
       </w:r>
     </w:p>
   </w:comment>
-  <w:comment w:id="10" w:author="Tamen, Jonathan" w:date="2026-03-04T09:25:00Z" w:initials="JT">
+  <w:comment w:id="11" w:author="Tamen, Jonathan" w:date="2026-03-04T09:25:00Z" w:initials="JT">
     <w:p>
       <w:pPr>
         <w:pStyle w:val="CommentText"/>
@@ -14597,46 +16096,6 @@
       </w:r>
       <w:r>
         <w:t>Need to double check</w:t>
-      </w:r>
-    </w:p>
-  </w:comment>
-  <w:comment w:id="13" w:author="Tamen, Jonathan" w:date="2026-03-01T10:01:00Z" w:initials="JT">
-    <w:p>
-      <w:pPr>
-        <w:pStyle w:val="CommentText"/>
-      </w:pPr>
-      <w:r>
-        <w:rPr>
-          <w:rStyle w:val="CommentReference"/>
-        </w:rPr>
-        <w:annotationRef/>
-      </w:r>
-      <w:r>
-        <w:t>The Methodology section needs to discuss your methodology. I’d like to see you start from the</w:t>
-      </w:r>
-    </w:p>
-    <w:p>
-      <w:pPr>
-        <w:pStyle w:val="CommentText"/>
-      </w:pPr>
-      <w:r>
-        <w:t>basic OLS model what related two variables in a linear regression model with each other, then</w:t>
-      </w:r>
-    </w:p>
-    <w:p>
-      <w:pPr>
-        <w:pStyle w:val="CommentText"/>
-      </w:pPr>
-      <w:r>
-        <w:t>discuss biases and modifications you might be making to this basic model to address those</w:t>
-      </w:r>
-    </w:p>
-    <w:p>
-      <w:pPr>
-        <w:pStyle w:val="CommentText"/>
-      </w:pPr>
-      <w:r>
-        <w:t>biases. Then you can include models on heterogeneity or robustness tests. Note that here you need to write down the regression equation and then explain what each term in the regression equation means and why it is included. For example, if you include a set of variables X in your equation as control variables, describe what each X is and explain why each X belongs in this model.</w:t>
       </w:r>
     </w:p>
   </w:comment>
@@ -14652,7 +16111,7 @@
         <w:annotationRef/>
       </w:r>
       <w:r>
-        <w:t>Ideally (if that applies), here you would also discuss any other issues that might affect the</w:t>
+        <w:t>The Methodology section needs to discuss your methodology. I’d like to see you start from the</w:t>
       </w:r>
     </w:p>
     <w:p>
@@ -14660,7 +16119,7 @@
         <w:pStyle w:val="CommentText"/>
       </w:pPr>
       <w:r>
-        <w:t>interpretation of your results that you are not necessarily able to control for – what they are</w:t>
+        <w:t>basic OLS model what related two variables in a linear regression model with each other, then</w:t>
       </w:r>
     </w:p>
     <w:p>
@@ -14668,7 +16127,66 @@
         <w:pStyle w:val="CommentText"/>
       </w:pPr>
       <w:r>
+        <w:t>discuss biases and modifications you might be making to this basic model to address those</w:t>
+      </w:r>
+    </w:p>
+    <w:p>
+      <w:pPr>
+        <w:pStyle w:val="CommentText"/>
+      </w:pPr>
+      <w:r>
+        <w:t>biases. Then you can include models on heterogeneity or robustness tests. Note that here you need to write down the regression equation and then explain what each term in the regression equation means and why it is included. For example, if you include a set of variables X in your equation as control variables, describe what each X is and explain why each X belongs in this model.</w:t>
+      </w:r>
+    </w:p>
+  </w:comment>
+  <w:comment w:id="15" w:author="Tamen, Jonathan" w:date="2026-03-01T10:01:00Z" w:initials="JT">
+    <w:p>
+      <w:pPr>
+        <w:pStyle w:val="CommentText"/>
+      </w:pPr>
+      <w:r>
+        <w:rPr>
+          <w:rStyle w:val="CommentReference"/>
+        </w:rPr>
+        <w:annotationRef/>
+      </w:r>
+      <w:r>
+        <w:t>Ideally (if that applies), here you would also discuss any other issues that might affect the</w:t>
+      </w:r>
+    </w:p>
+    <w:p>
+      <w:pPr>
+        <w:pStyle w:val="CommentText"/>
+      </w:pPr>
+      <w:r>
+        <w:t>interpretation of your results that you are not necessarily able to control for – what they are</w:t>
+      </w:r>
+    </w:p>
+    <w:p>
+      <w:pPr>
+        <w:pStyle w:val="CommentText"/>
+      </w:pPr>
+      <w:r>
         <w:t>and whether you think they are a big deal or not (e.g., sample attrition, migration, etc.).</w:t>
+      </w:r>
+    </w:p>
+  </w:comment>
+  <w:comment w:id="26" w:author="Tamen, Jonathan" w:date="2026-03-11T16:07:00Z" w:initials="TJ">
+    <w:p>
+      <w:r>
+        <w:rPr>
+          <w:rStyle w:val="CommentReference"/>
+        </w:rPr>
+        <w:annotationRef/>
+      </w:r>
+      <w:r>
+        <w:rPr>
+          <w:kern w:val="0"/>
+          <w:sz w:val="20"/>
+          <w:szCs w:val="20"/>
+          <w14:ligatures w14:val="none"/>
+        </w:rPr>
+        <w:t>Do I show the results here or attached in an appendix?</w:t>
       </w:r>
     </w:p>
   </w:comment>
@@ -14681,11 +16199,13 @@
   <w15:commentEx w15:paraId="4E0F734F" w15:paraIdParent="4224868F" w15:done="0"/>
   <w15:commentEx w15:paraId="3A558277" w15:done="0"/>
   <w15:commentEx w15:paraId="0523F744" w15:paraIdParent="3A558277" w15:done="0"/>
+  <w15:commentEx w15:paraId="1B34EF6B" w15:done="0"/>
   <w15:commentEx w15:paraId="00674D31" w15:done="0"/>
   <w15:commentEx w15:paraId="6CB56D86" w15:done="1"/>
   <w15:commentEx w15:paraId="6E95F6C3" w15:done="1"/>
   <w15:commentEx w15:paraId="090E3D6F" w15:done="0"/>
   <w15:commentEx w15:paraId="39B96574" w15:paraIdParent="090E3D6F" w15:done="0"/>
+  <w15:commentEx w15:paraId="70214740" w15:done="0"/>
 </w15:commentsEx>
 </file>
 
@@ -14695,11 +16215,13 @@
   <w16cex:commentExtensible w16cex:durableId="25E171DB" w16cex:dateUtc="2026-03-01T15:06:00Z"/>
   <w16cex:commentExtensible w16cex:durableId="3D2F1F0D" w16cex:dateUtc="2026-03-01T15:00:00Z"/>
   <w16cex:commentExtensible w16cex:durableId="11A85621" w16cex:dateUtc="2026-03-01T15:01:00Z"/>
+  <w16cex:commentExtensible w16cex:durableId="1DE55F73" w16cex:dateUtc="2026-03-11T00:35:00Z"/>
   <w16cex:commentExtensible w16cex:durableId="3E61A189" w16cex:dateUtc="2026-03-04T14:17:00Z"/>
   <w16cex:commentExtensible w16cex:durableId="7229158C" w16cex:dateUtc="2026-02-28T17:10:00Z"/>
   <w16cex:commentExtensible w16cex:durableId="7BF14FDB" w16cex:dateUtc="2026-03-04T14:25:00Z"/>
   <w16cex:commentExtensible w16cex:durableId="5CDB3D0F" w16cex:dateUtc="2026-03-01T15:01:00Z"/>
   <w16cex:commentExtensible w16cex:durableId="19D52806" w16cex:dateUtc="2026-03-01T15:01:00Z"/>
+  <w16cex:commentExtensible w16cex:durableId="14747FE9" w16cex:dateUtc="2026-03-11T20:07:00Z"/>
 </w16cex:commentsExtensible>
 </file>
 
@@ -14709,11 +16231,13 @@
   <w16cid:commentId w16cid:paraId="4E0F734F" w16cid:durableId="25E171DB"/>
   <w16cid:commentId w16cid:paraId="3A558277" w16cid:durableId="3D2F1F0D"/>
   <w16cid:commentId w16cid:paraId="0523F744" w16cid:durableId="11A85621"/>
+  <w16cid:commentId w16cid:paraId="1B34EF6B" w16cid:durableId="1DE55F73"/>
   <w16cid:commentId w16cid:paraId="00674D31" w16cid:durableId="3E61A189"/>
   <w16cid:commentId w16cid:paraId="6CB56D86" w16cid:durableId="7229158C"/>
   <w16cid:commentId w16cid:paraId="6E95F6C3" w16cid:durableId="7BF14FDB"/>
   <w16cid:commentId w16cid:paraId="090E3D6F" w16cid:durableId="5CDB3D0F"/>
   <w16cid:commentId w16cid:paraId="39B96574" w16cid:durableId="19D52806"/>
+  <w16cid:commentId w16cid:paraId="70214740" w16cid:durableId="14747FE9"/>
 </w16cid:commentsIds>
 </file>
 
@@ -14797,23 +16321,7 @@
         <w:t xml:space="preserve"> </w:t>
       </w:r>
       <w:r>
-        <w:t xml:space="preserve">Boateng, Agyenim, Raphaël K. </w:t>
-      </w:r>
-      <w:proofErr w:type="spellStart"/>
-      <w:r>
-        <w:t>Akamavi</w:t>
-      </w:r>
-      <w:proofErr w:type="spellEnd"/>
-      <w:r>
-        <w:t xml:space="preserve">, and Girlie Ndoro. "Measuring performance of non‐profit </w:t>
-      </w:r>
-      <w:proofErr w:type="spellStart"/>
-      <w:r>
-        <w:t>organisations</w:t>
-      </w:r>
-      <w:proofErr w:type="spellEnd"/>
-      <w:r>
-        <w:t>: evidence from large charities." Business Ethics: A European Review 25, no. 1 (2016): 59-74.</w:t>
+        <w:t>Boateng, Agyenim, Raphaël K. Akamavi, and Girlie Ndoro. "Measuring performance of non‐profit organisations: evidence from large charities." Business Ethics: A European Review 25, no. 1 (2016): 59-74.</w:t>
       </w:r>
     </w:p>
   </w:footnote>
@@ -14889,9 +16397,115 @@
         <w:t xml:space="preserve"> </w:t>
       </w:r>
       <w:r>
+        <w:t xml:space="preserve">Irs.gov. “Form 990 Series Downloads | Internal Revenue Service,” 2019. </w:t>
+      </w:r>
+      <w:hyperlink r:id="rId1" w:history="1">
+        <w:r>
+          <w:rPr>
+            <w:rStyle w:val="Hyperlink"/>
+          </w:rPr>
+          <w:t>https://www.irs.gov/charities-non-profits/form-990-series-downloads</w:t>
+        </w:r>
+      </w:hyperlink>
+      <w:r>
+        <w:t xml:space="preserve">. </w:t>
+      </w:r>
+    </w:p>
+  </w:footnote>
+  <w:footnote w:id="6">
+    <w:p>
+      <w:pPr>
+        <w:pStyle w:val="FootnoteText"/>
+      </w:pPr>
+      <w:r>
+        <w:rPr>
+          <w:rStyle w:val="FootnoteReference"/>
+        </w:rPr>
+        <w:footnoteRef/>
+      </w:r>
+      <w:r>
+        <w:t xml:space="preserve"> </w:t>
+      </w:r>
+      <w:r>
+        <w:t>Jesse Lecy, (2023). NCCS IRS 990 Efile Data.</w:t>
+      </w:r>
+      <w:r>
+        <w:t xml:space="preserve"> </w:t>
+      </w:r>
+      <w:hyperlink r:id="rId2" w:history="1">
+        <w:r>
+          <w:rPr>
+            <w:rStyle w:val="Hyperlink"/>
+          </w:rPr>
+          <w:t>https://urbaninstitute.github.io/nccs/datasets/efile/</w:t>
+        </w:r>
+      </w:hyperlink>
+      <w:r>
+        <w:t xml:space="preserve"> </w:t>
+      </w:r>
+    </w:p>
+  </w:footnote>
+  <w:footnote w:id="7">
+    <w:p>
+      <w:pPr>
+        <w:pStyle w:val="FootnoteText"/>
+      </w:pPr>
+      <w:r>
+        <w:rPr>
+          <w:rStyle w:val="FootnoteReference"/>
+        </w:rPr>
+        <w:footnoteRef/>
+      </w:r>
+      <w:r>
+        <w:t xml:space="preserve"> Irs.gov. “Exempt Organizations Business Master File Extract (EO BMF) | Internal Revenue Service,” 2017. </w:t>
+      </w:r>
+      <w:hyperlink r:id="rId3" w:history="1">
+        <w:r>
+          <w:rPr>
+            <w:rStyle w:val="Hyperlink"/>
+          </w:rPr>
+          <w:t>https://www.irs.gov/charities-non-profits/exempt-organizations-business-master-file-extract-eo-bmf</w:t>
+        </w:r>
+      </w:hyperlink>
+      <w:r>
+        <w:t xml:space="preserve">. </w:t>
+      </w:r>
+    </w:p>
+  </w:footnote>
+  <w:footnote w:id="8">
+    <w:p>
+      <w:pPr>
+        <w:pStyle w:val="FootnoteText"/>
+      </w:pPr>
+      <w:r>
+        <w:rPr>
+          <w:rStyle w:val="FootnoteReference"/>
+        </w:rPr>
+        <w:footnoteRef/>
+      </w:r>
+      <w:r>
+        <w:t xml:space="preserve"> Ibid. </w:t>
+      </w:r>
+    </w:p>
+  </w:footnote>
+  <w:footnote w:id="9">
+    <w:p>
+      <w:pPr>
+        <w:pStyle w:val="FootnoteText"/>
+      </w:pPr>
+      <w:r>
+        <w:rPr>
+          <w:rStyle w:val="FootnoteReference"/>
+        </w:rPr>
+        <w:footnoteRef/>
+      </w:r>
+      <w:r>
+        <w:t xml:space="preserve"> </w:t>
+      </w:r>
+      <w:r>
         <w:t xml:space="preserve">Irs.gov. “Automatic Revocation of Exemption | Internal Revenue Service,” 2017. </w:t>
       </w:r>
-      <w:hyperlink r:id="rId1" w:history="1">
+      <w:hyperlink r:id="rId4" w:history="1">
         <w:r>
           <w:rPr>
             <w:rStyle w:val="Hyperlink"/>
@@ -14907,98 +16521,6 @@
       </w:r>
     </w:p>
   </w:footnote>
-  <w:footnote w:id="6">
-    <w:p>
-      <w:pPr>
-        <w:pStyle w:val="FootnoteText"/>
-      </w:pPr>
-      <w:r>
-        <w:rPr>
-          <w:rStyle w:val="FootnoteReference"/>
-        </w:rPr>
-        <w:footnoteRef/>
-      </w:r>
-      <w:r>
-        <w:t xml:space="preserve"> </w:t>
-      </w:r>
-      <w:r>
-        <w:t>Shon, Jongmin, Madinah F. Hamidullah, and Lindsey M. McDougle. "Revenue structure and spending behavior in nonprofit organizations." The American Review of Public Administration 49, no. 6 (2019): 662-674.</w:t>
-      </w:r>
-    </w:p>
-  </w:footnote>
-  <w:footnote w:id="7">
-    <w:p>
-      <w:pPr>
-        <w:pStyle w:val="FootnoteText"/>
-      </w:pPr>
-      <w:r>
-        <w:rPr>
-          <w:rStyle w:val="FootnoteReference"/>
-        </w:rPr>
-        <w:footnoteRef/>
-      </w:r>
-      <w:r>
-        <w:t xml:space="preserve"> </w:t>
-      </w:r>
-      <w:r>
-        <w:t>Ibid.</w:t>
-      </w:r>
-    </w:p>
-  </w:footnote>
-  <w:footnote w:id="8">
-    <w:p>
-      <w:pPr>
-        <w:pStyle w:val="FootnoteText"/>
-      </w:pPr>
-      <w:r>
-        <w:rPr>
-          <w:rStyle w:val="FootnoteReference"/>
-        </w:rPr>
-        <w:footnoteRef/>
-      </w:r>
-      <w:r>
-        <w:t xml:space="preserve"> </w:t>
-      </w:r>
-      <w:proofErr w:type="spellStart"/>
-      <w:r>
-        <w:t>Ecer</w:t>
-      </w:r>
-      <w:proofErr w:type="spellEnd"/>
-      <w:r>
-        <w:t xml:space="preserve">, Sencer, Mark Magro, and Sinan </w:t>
-      </w:r>
-      <w:proofErr w:type="spellStart"/>
-      <w:r>
-        <w:t>Sarpça</w:t>
-      </w:r>
-      <w:proofErr w:type="spellEnd"/>
-      <w:r>
-        <w:t>. "The relationship between nonprofits’ revenue composition and their economic-financial efficiency." Nonprofit and Voluntary Sector Quarterly 46, no. 1 (2017): 141-155.</w:t>
-      </w:r>
-    </w:p>
-  </w:footnote>
-  <w:footnote w:id="9">
-    <w:p>
-      <w:pPr>
-        <w:pStyle w:val="FootnoteText"/>
-      </w:pPr>
-      <w:r>
-        <w:rPr>
-          <w:rStyle w:val="FootnoteReference"/>
-        </w:rPr>
-        <w:footnoteRef/>
-      </w:r>
-      <w:r>
-        <w:t xml:space="preserve"> </w:t>
-      </w:r>
-      <w:r>
-        <w:t>Exley, Christine L., Nils H. Lehr, and Stephen J. Terry. (2023)</w:t>
-      </w:r>
-      <w:r>
-        <w:t>.</w:t>
-      </w:r>
-    </w:p>
-  </w:footnote>
   <w:footnote w:id="10">
     <w:p>
       <w:pPr>
@@ -15014,15 +16536,7 @@
         <w:t xml:space="preserve"> </w:t>
       </w:r>
       <w:r>
-        <w:t xml:space="preserve">Altamimi, Hala, and Qiaozhen Liu. "The nonprofit starvation cycle: Does overhead spending really impact program </w:t>
-      </w:r>
-      <w:proofErr w:type="gramStart"/>
-      <w:r>
-        <w:t>outcomes?.</w:t>
-      </w:r>
-      <w:proofErr w:type="gramEnd"/>
-      <w:r>
-        <w:t>" Nonprofit and Voluntary Sector Quarterly 51, no. 6 (2022): 1324-1348.</w:t>
+        <w:t>Shon, Jongmin, Madinah F. Hamidullah, and Lindsey M. McDougle. "Revenue structure and spending behavior in nonprofit organizations." The American Review of Public Administration 49, no. 6 (2019): 662-674.</w:t>
       </w:r>
     </w:p>
   </w:footnote>
@@ -15038,7 +16552,108 @@
         <w:footnoteRef/>
       </w:r>
       <w:r>
-        <w:t xml:space="preserve"> Altamimi, Hala and Qiaozhen Liu (2022).</w:t>
+        <w:t xml:space="preserve"> </w:t>
+      </w:r>
+      <w:r>
+        <w:t>Ibid.</w:t>
+      </w:r>
+    </w:p>
+  </w:footnote>
+  <w:footnote w:id="12">
+    <w:p>
+      <w:pPr>
+        <w:pStyle w:val="FootnoteText"/>
+      </w:pPr>
+      <w:r>
+        <w:rPr>
+          <w:rStyle w:val="FootnoteReference"/>
+        </w:rPr>
+        <w:footnoteRef/>
+      </w:r>
+      <w:r>
+        <w:t xml:space="preserve"> </w:t>
+      </w:r>
+      <w:r>
+        <w:t>Ecer, Sencer, Mark Magro, and Sinan Sarpça. "The relationship between nonprofits’ revenue composition and their economic-financial efficiency." Nonprofit and Voluntary Sector Quarterly 46, no. 1 (2017): 141-155.</w:t>
+      </w:r>
+    </w:p>
+  </w:footnote>
+  <w:footnote w:id="13">
+    <w:p>
+      <w:pPr>
+        <w:pStyle w:val="FootnoteText"/>
+      </w:pPr>
+      <w:r>
+        <w:rPr>
+          <w:rStyle w:val="FootnoteReference"/>
+        </w:rPr>
+        <w:footnoteRef/>
+      </w:r>
+      <w:r>
+        <w:t xml:space="preserve"> </w:t>
+      </w:r>
+      <w:r>
+        <w:t>Exley, Christine L., Nils H. Lehr, and Stephen J. Terry. (2023)</w:t>
+      </w:r>
+      <w:r>
+        <w:t>.</w:t>
+      </w:r>
+    </w:p>
+  </w:footnote>
+  <w:footnote w:id="14">
+    <w:p>
+      <w:pPr>
+        <w:pStyle w:val="FootnoteText"/>
+      </w:pPr>
+      <w:r>
+        <w:rPr>
+          <w:rStyle w:val="FootnoteReference"/>
+        </w:rPr>
+        <w:footnoteRef/>
+      </w:r>
+      <w:r>
+        <w:t xml:space="preserve"> </w:t>
+      </w:r>
+      <w:r>
+        <w:t>Altamimi, Hala, and Qiaozhen Liu. "The nonprofit starvation cycle: Does overhead spending really impact program outcomes?." Nonprofit and Voluntary Sector Quarterly 51, no. 6 (2022): 1324-1348.</w:t>
+      </w:r>
+    </w:p>
+  </w:footnote>
+  <w:footnote w:id="15">
+    <w:p>
+      <w:pPr>
+        <w:pStyle w:val="FootnoteText"/>
+      </w:pPr>
+      <w:r>
+        <w:rPr>
+          <w:rStyle w:val="FootnoteReference"/>
+        </w:rPr>
+        <w:footnoteRef/>
+      </w:r>
+      <w:r>
+        <w:t xml:space="preserve"> </w:t>
+      </w:r>
+      <w:r>
+        <w:t xml:space="preserve">Ibid. </w:t>
+      </w:r>
+    </w:p>
+  </w:footnote>
+  <w:footnote w:id="16">
+    <w:p>
+      <w:pPr>
+        <w:pStyle w:val="FootnoteText"/>
+      </w:pPr>
+      <w:r>
+        <w:rPr>
+          <w:rStyle w:val="FootnoteReference"/>
+        </w:rPr>
+        <w:footnoteRef/>
+      </w:r>
+      <w:r>
+        <w:t xml:space="preserve"> </w:t>
+      </w:r>
+      <w:r>
+        <w:t>Mauri, Alfredo J., and Max P. Michaels. "Firm and industry effects within strategic management: An empirical examination." Strategic management journal 19, no. 3 (1998): 211-219.</w:t>
       </w:r>
     </w:p>
   </w:footnote>
@@ -15690,6 +17305,7 @@
   <w:style w:type="character" w:default="1" w:styleId="DefaultParagraphFont">
     <w:name w:val="Default Paragraph Font"/>
     <w:uiPriority w:val="1"/>
+    <w:semiHidden/>
     <w:unhideWhenUsed/>
   </w:style>
   <w:style w:type="table" w:default="1" w:styleId="TableNormal">

</xml_diff>